<commit_message>
feat: add comparastion chart gainners and lossers
</commit_message>
<xml_diff>
--- a/Laporan Praktikum Pemrosesan Data UTS projek.docx
+++ b/Laporan Praktikum Pemrosesan Data UTS projek.docx
@@ -229,52 +229,951 @@
         <w:tabs>
           <w:tab w:val="right" w:pos="8505"/>
         </w:tabs>
-        <w:spacing w:line="480" w:lineRule="auto"/>
+        <w:spacing w:after="0" w:line="276" w:lineRule="auto"/>
         <w:jc w:val="center"/>
         <w:rPr>
           <w:rFonts w:ascii="Times New Roman" w:hAnsi="Times New Roman" w:cs="Times New Roman"/>
-          <w:sz w:val="24"/>
-          <w:szCs w:val="24"/>
+          <w:b/>
+          <w:bCs/>
+          <w:sz w:val="28"/>
+          <w:szCs w:val="28"/>
         </w:rPr>
       </w:pPr>
       <w:r>
         <w:rPr>
           <w:rFonts w:ascii="Times New Roman" w:hAnsi="Times New Roman" w:cs="Times New Roman"/>
-          <w:sz w:val="24"/>
-          <w:szCs w:val="24"/>
-        </w:rPr>
-        <w:lastRenderedPageBreak/>
-        <w:t>BAB 1</w:t>
+          <w:b/>
+          <w:bCs/>
+          <w:sz w:val="28"/>
+          <w:szCs w:val="28"/>
+        </w:rPr>
+        <w:t xml:space="preserve">BAB </w:t>
       </w:r>
+      <w:r>
+        <w:rPr>
+          <w:rFonts w:ascii="Times New Roman" w:hAnsi="Times New Roman" w:cs="Times New Roman"/>
+          <w:b/>
+          <w:bCs/>
+          <w:sz w:val="28"/>
+          <w:szCs w:val="28"/>
+        </w:rPr>
+        <w:t>I</w:t>
+      </w:r>
+    </w:p>
+    <w:p>
+      <w:pPr>
+        <w:tabs>
+          <w:tab w:val="right" w:pos="8505"/>
+        </w:tabs>
+        <w:spacing w:after="0" w:line="276" w:lineRule="auto"/>
+        <w:jc w:val="center"/>
+        <w:rPr>
+          <w:rFonts w:ascii="Times New Roman" w:hAnsi="Times New Roman" w:cs="Times New Roman"/>
+          <w:b/>
+          <w:bCs/>
+          <w:sz w:val="28"/>
+          <w:szCs w:val="28"/>
+        </w:rPr>
+      </w:pPr>
+      <w:r>
+        <w:rPr>
+          <w:rFonts w:ascii="Times New Roman" w:hAnsi="Times New Roman" w:cs="Times New Roman"/>
+          <w:b/>
+          <w:bCs/>
+          <w:sz w:val="28"/>
+          <w:szCs w:val="28"/>
+        </w:rPr>
+        <w:t>PENDAHULUAN</w:t>
+      </w:r>
+    </w:p>
+    <w:p>
+      <w:pPr>
+        <w:tabs>
+          <w:tab w:val="right" w:pos="8505"/>
+        </w:tabs>
+        <w:spacing w:line="276" w:lineRule="auto"/>
+        <w:jc w:val="both"/>
+        <w:rPr>
+          <w:rFonts w:ascii="Times New Roman" w:hAnsi="Times New Roman" w:cs="Times New Roman"/>
+          <w:b/>
+          <w:bCs/>
+          <w:sz w:val="28"/>
+          <w:szCs w:val="28"/>
+        </w:rPr>
+      </w:pPr>
     </w:p>
     <w:p>
       <w:pPr>
         <w:pStyle w:val="ListParagraph"/>
         <w:numPr>
           <w:ilvl w:val="0"/>
-          <w:numId w:val="9"/>
+          <w:numId w:val="13"/>
         </w:numPr>
         <w:tabs>
           <w:tab w:val="right" w:pos="8505"/>
         </w:tabs>
-        <w:spacing w:line="480" w:lineRule="auto"/>
+        <w:spacing w:line="276" w:lineRule="auto"/>
         <w:jc w:val="both"/>
         <w:rPr>
           <w:rFonts w:ascii="Times New Roman" w:hAnsi="Times New Roman" w:cs="Times New Roman"/>
-          <w:sz w:val="24"/>
-          <w:szCs w:val="24"/>
+          <w:sz w:val="28"/>
+          <w:szCs w:val="28"/>
         </w:rPr>
       </w:pPr>
       <w:r>
         <w:rPr>
           <w:rFonts w:ascii="Times New Roman" w:hAnsi="Times New Roman" w:cs="Times New Roman"/>
-          <w:sz w:val="24"/>
-          <w:szCs w:val="24"/>
-        </w:rPr>
-        <w:t>Latar Belakang</w:t>
+          <w:sz w:val="28"/>
+          <w:szCs w:val="28"/>
+        </w:rPr>
+        <w:t xml:space="preserve"> Latar Belakang</w:t>
+      </w:r>
+    </w:p>
+    <w:p>
+      <w:pPr>
+        <w:pStyle w:val="ListParagraph"/>
+        <w:tabs>
+          <w:tab w:val="right" w:pos="8505"/>
+        </w:tabs>
+        <w:ind w:firstLine="567"/>
+        <w:jc w:val="both"/>
+        <w:rPr>
+          <w:rFonts w:ascii="Times New Roman" w:hAnsi="Times New Roman" w:cs="Times New Roman"/>
+          <w:sz w:val="28"/>
+          <w:szCs w:val="28"/>
+        </w:rPr>
+      </w:pPr>
+      <w:r>
+        <w:rPr>
+          <w:rFonts w:ascii="Times New Roman" w:hAnsi="Times New Roman" w:cs="Times New Roman"/>
+          <w:sz w:val="28"/>
+          <w:szCs w:val="28"/>
+        </w:rPr>
+        <w:tab/>
+      </w:r>
+      <w:r>
+        <w:rPr>
+          <w:rFonts w:ascii="Times New Roman" w:hAnsi="Times New Roman" w:cs="Times New Roman"/>
+          <w:sz w:val="28"/>
+          <w:szCs w:val="28"/>
+        </w:rPr>
+        <w:t>Perkembangan teknologi digital telah mendorong pertumbuhan cryptocurrency sebagai salah satu instrumen investasi yang populer. Pasar cryptocurrency dikenal memiliki tingkat volatilitas yang tinggi, di mana harga aset dapat berubah secara signifikan dalam waktu yang singkat. Kondisi ini menjadikan informasi mengenai koin dengan kenaikan tertinggi (Top Gainers) dan penurunan terdalam (Top Losers) sebagai indikator penting dalam memahami pergerakan dan sentimen pasar.</w:t>
+      </w:r>
+    </w:p>
+    <w:p>
+      <w:pPr>
+        <w:pStyle w:val="ListParagraph"/>
+        <w:tabs>
+          <w:tab w:val="right" w:pos="8505"/>
+        </w:tabs>
+        <w:ind w:firstLine="567"/>
+        <w:jc w:val="both"/>
+        <w:rPr>
+          <w:rFonts w:ascii="Times New Roman" w:hAnsi="Times New Roman" w:cs="Times New Roman"/>
+          <w:sz w:val="28"/>
+          <w:szCs w:val="28"/>
+        </w:rPr>
+      </w:pPr>
+      <w:r>
+        <w:rPr>
+          <w:rFonts w:ascii="Times New Roman" w:hAnsi="Times New Roman" w:cs="Times New Roman"/>
+          <w:sz w:val="28"/>
+          <w:szCs w:val="28"/>
+        </w:rPr>
+        <w:t>Dalam praktiknya, pengumpulan data terkait pergerakan harga kripto sering dilakukan secara manual melalui situs web penyedia informasi pasar. Metode ini kurang efisien karena memerlukan waktu yang cukup lama dan berpotensi menimbulkan kesalahan pencatatan. Selain itu, pembaruan data secara berkala menjadi sulit dilakukan apabila tidak menggunakan sistem otomatis.</w:t>
+      </w:r>
+    </w:p>
+    <w:p>
+      <w:pPr>
+        <w:pStyle w:val="ListParagraph"/>
+        <w:tabs>
+          <w:tab w:val="right" w:pos="8505"/>
+        </w:tabs>
+        <w:ind w:firstLine="567"/>
+        <w:jc w:val="both"/>
+        <w:rPr>
+          <w:rFonts w:ascii="Times New Roman" w:hAnsi="Times New Roman" w:cs="Times New Roman"/>
+          <w:sz w:val="28"/>
+          <w:szCs w:val="28"/>
+        </w:rPr>
+      </w:pPr>
+      <w:r>
+        <w:rPr>
+          <w:rFonts w:ascii="Times New Roman" w:hAnsi="Times New Roman" w:cs="Times New Roman"/>
+          <w:sz w:val="28"/>
+          <w:szCs w:val="28"/>
+        </w:rPr>
+        <w:t>Untuk mengatasi permasalahan tersebut, diperlukan teknik otomatisasi pengambilan data menggunakan metode web scraping. Teknik ini memungkinkan proses ekstraksi data dari web dilakukan secara sistematis dan terstruktur. Data yang diperoleh kemudian dapat diproses lebih lanjut melalui tahap pembersihan (data cleaning) agar siap untuk dianalisis.</w:t>
+      </w:r>
+    </w:p>
+    <w:p>
+      <w:pPr>
+        <w:pStyle w:val="ListParagraph"/>
+        <w:tabs>
+          <w:tab w:val="right" w:pos="8505"/>
+        </w:tabs>
+        <w:ind w:firstLine="567"/>
+        <w:jc w:val="both"/>
+        <w:rPr>
+          <w:rFonts w:ascii="Times New Roman" w:hAnsi="Times New Roman" w:cs="Times New Roman"/>
+          <w:sz w:val="28"/>
+          <w:szCs w:val="28"/>
+        </w:rPr>
+      </w:pPr>
+      <w:r>
+        <w:rPr>
+          <w:rFonts w:ascii="Times New Roman" w:hAnsi="Times New Roman" w:cs="Times New Roman"/>
+          <w:sz w:val="28"/>
+          <w:szCs w:val="28"/>
+        </w:rPr>
+        <w:t>Berdasarkan hal tersebut, praktikum ini bertujuan untuk mengimplementasikan tahapan pemrosesan data mulai dari ekstraksi data, pembersihan, hingga visualisasi informasi. Dengan demikian, diharapkan dapat diperoleh gambaran yang lebih cepat, akurat, dan informatif mengenai kondisi pasar cryptocurrency terkini.</w:t>
+      </w:r>
+    </w:p>
+    <w:p>
+      <w:pPr>
+        <w:pStyle w:val="ListParagraph"/>
+        <w:tabs>
+          <w:tab w:val="right" w:pos="8505"/>
+        </w:tabs>
+        <w:ind w:firstLine="567"/>
+        <w:jc w:val="both"/>
+        <w:rPr>
+          <w:rFonts w:ascii="Times New Roman" w:hAnsi="Times New Roman" w:cs="Times New Roman"/>
+          <w:sz w:val="28"/>
+          <w:szCs w:val="28"/>
+        </w:rPr>
+      </w:pPr>
+    </w:p>
+    <w:p>
+      <w:pPr>
+        <w:pStyle w:val="ListParagraph"/>
+        <w:tabs>
+          <w:tab w:val="right" w:pos="8505"/>
+        </w:tabs>
+        <w:ind w:firstLine="567"/>
+        <w:jc w:val="both"/>
+        <w:rPr>
+          <w:rFonts w:ascii="Times New Roman" w:hAnsi="Times New Roman" w:cs="Times New Roman"/>
+          <w:sz w:val="28"/>
+          <w:szCs w:val="28"/>
+        </w:rPr>
+      </w:pPr>
+    </w:p>
+    <w:p>
+      <w:pPr>
+        <w:pStyle w:val="ListParagraph"/>
+        <w:tabs>
+          <w:tab w:val="right" w:pos="8505"/>
+        </w:tabs>
+        <w:ind w:firstLine="567"/>
+        <w:jc w:val="both"/>
+        <w:rPr>
+          <w:rFonts w:ascii="Times New Roman" w:hAnsi="Times New Roman" w:cs="Times New Roman"/>
+          <w:sz w:val="28"/>
+          <w:szCs w:val="28"/>
+        </w:rPr>
+      </w:pPr>
+    </w:p>
+    <w:p>
+      <w:pPr>
+        <w:pStyle w:val="ListParagraph"/>
+        <w:tabs>
+          <w:tab w:val="right" w:pos="8505"/>
+        </w:tabs>
+        <w:jc w:val="both"/>
+        <w:rPr>
+          <w:rFonts w:ascii="Times New Roman" w:hAnsi="Times New Roman" w:cs="Times New Roman"/>
+          <w:sz w:val="28"/>
+          <w:szCs w:val="28"/>
+        </w:rPr>
+      </w:pPr>
+    </w:p>
+    <w:p>
+      <w:pPr>
+        <w:pStyle w:val="ListParagraph"/>
+        <w:numPr>
+          <w:ilvl w:val="0"/>
+          <w:numId w:val="13"/>
+        </w:numPr>
+        <w:tabs>
+          <w:tab w:val="right" w:pos="8505"/>
+        </w:tabs>
+        <w:jc w:val="both"/>
+        <w:rPr>
+          <w:rFonts w:ascii="Times New Roman" w:hAnsi="Times New Roman" w:cs="Times New Roman"/>
+          <w:sz w:val="28"/>
+          <w:szCs w:val="28"/>
+        </w:rPr>
+      </w:pPr>
+      <w:r>
+        <w:rPr>
+          <w:rFonts w:ascii="Times New Roman" w:hAnsi="Times New Roman" w:cs="Times New Roman"/>
+          <w:sz w:val="28"/>
+          <w:szCs w:val="28"/>
+        </w:rPr>
+        <w:lastRenderedPageBreak/>
+        <w:t xml:space="preserve"> Rumusan Masalah</w:t>
+      </w:r>
+    </w:p>
+    <w:p>
+      <w:pPr>
+        <w:pStyle w:val="ListParagraph"/>
+        <w:numPr>
+          <w:ilvl w:val="0"/>
+          <w:numId w:val="13"/>
+        </w:numPr>
+        <w:tabs>
+          <w:tab w:val="right" w:pos="8505"/>
+        </w:tabs>
+        <w:jc w:val="both"/>
+        <w:rPr>
+          <w:rFonts w:ascii="Times New Roman" w:hAnsi="Times New Roman" w:cs="Times New Roman"/>
+          <w:sz w:val="28"/>
+          <w:szCs w:val="28"/>
+        </w:rPr>
+      </w:pPr>
+      <w:r>
+        <w:rPr>
+          <w:rFonts w:ascii="Times New Roman" w:hAnsi="Times New Roman" w:cs="Times New Roman"/>
+          <w:sz w:val="28"/>
+          <w:szCs w:val="28"/>
+        </w:rPr>
+        <w:t>Tujuan</w:t>
+      </w:r>
+    </w:p>
+    <w:p>
+      <w:pPr>
+        <w:pStyle w:val="ListParagraph"/>
+        <w:numPr>
+          <w:ilvl w:val="0"/>
+          <w:numId w:val="13"/>
+        </w:numPr>
+        <w:tabs>
+          <w:tab w:val="right" w:pos="8505"/>
+        </w:tabs>
+        <w:jc w:val="both"/>
+        <w:rPr>
+          <w:rFonts w:ascii="Times New Roman" w:hAnsi="Times New Roman" w:cs="Times New Roman"/>
+          <w:sz w:val="28"/>
+          <w:szCs w:val="28"/>
+        </w:rPr>
+      </w:pPr>
+      <w:r>
+        <w:rPr>
+          <w:rFonts w:ascii="Times New Roman" w:hAnsi="Times New Roman" w:cs="Times New Roman"/>
+          <w:sz w:val="28"/>
+          <w:szCs w:val="28"/>
+        </w:rPr>
+        <w:t>Manfaat</w:t>
+      </w:r>
+    </w:p>
+    <w:p>
+      <w:pPr>
+        <w:tabs>
+          <w:tab w:val="right" w:pos="8505"/>
+        </w:tabs>
+        <w:jc w:val="both"/>
+        <w:rPr>
+          <w:rFonts w:ascii="Times New Roman" w:hAnsi="Times New Roman" w:cs="Times New Roman"/>
+          <w:sz w:val="28"/>
+          <w:szCs w:val="28"/>
+        </w:rPr>
+      </w:pPr>
+    </w:p>
+    <w:p>
+      <w:pPr>
+        <w:tabs>
+          <w:tab w:val="right" w:pos="8505"/>
+        </w:tabs>
+        <w:spacing w:after="0"/>
+        <w:jc w:val="center"/>
+        <w:rPr>
+          <w:rFonts w:ascii="Times New Roman" w:hAnsi="Times New Roman" w:cs="Times New Roman"/>
+          <w:b/>
+          <w:bCs/>
+          <w:sz w:val="28"/>
+          <w:szCs w:val="28"/>
+        </w:rPr>
+      </w:pPr>
+      <w:r>
+        <w:rPr>
+          <w:rFonts w:ascii="Times New Roman" w:hAnsi="Times New Roman" w:cs="Times New Roman"/>
+          <w:b/>
+          <w:bCs/>
+          <w:sz w:val="28"/>
+          <w:szCs w:val="28"/>
+        </w:rPr>
+        <w:t>BAB II</w:t>
+      </w:r>
+    </w:p>
+    <w:p>
+      <w:pPr>
+        <w:tabs>
+          <w:tab w:val="right" w:pos="8505"/>
+        </w:tabs>
+        <w:spacing w:after="0"/>
+        <w:jc w:val="center"/>
+        <w:rPr>
+          <w:rFonts w:ascii="Times New Roman" w:hAnsi="Times New Roman" w:cs="Times New Roman"/>
+          <w:b/>
+          <w:bCs/>
+          <w:sz w:val="28"/>
+          <w:szCs w:val="28"/>
+        </w:rPr>
+      </w:pPr>
+      <w:r>
+        <w:rPr>
+          <w:rFonts w:ascii="Times New Roman" w:hAnsi="Times New Roman" w:cs="Times New Roman"/>
+          <w:b/>
+          <w:bCs/>
+          <w:sz w:val="28"/>
+          <w:szCs w:val="28"/>
+        </w:rPr>
+        <w:t>T</w:t>
+      </w:r>
+      <w:r>
+        <w:rPr>
+          <w:rFonts w:ascii="Times New Roman" w:hAnsi="Times New Roman" w:cs="Times New Roman"/>
+          <w:b/>
+          <w:bCs/>
+          <w:sz w:val="28"/>
+          <w:szCs w:val="28"/>
+        </w:rPr>
+        <w:t>INJAUAN PUSTAKA</w:t>
+      </w:r>
+    </w:p>
+    <w:p>
+      <w:pPr>
+        <w:pStyle w:val="ListParagraph"/>
+        <w:numPr>
+          <w:ilvl w:val="0"/>
+          <w:numId w:val="14"/>
+        </w:numPr>
+        <w:tabs>
+          <w:tab w:val="right" w:pos="8505"/>
+        </w:tabs>
+        <w:spacing w:after="0"/>
+        <w:jc w:val="both"/>
+        <w:rPr>
+          <w:rFonts w:ascii="Times New Roman" w:hAnsi="Times New Roman" w:cs="Times New Roman"/>
+          <w:sz w:val="28"/>
+          <w:szCs w:val="28"/>
+        </w:rPr>
+      </w:pPr>
+      <w:r>
+        <w:rPr>
+          <w:rFonts w:ascii="Times New Roman" w:hAnsi="Times New Roman" w:cs="Times New Roman"/>
+          <w:sz w:val="28"/>
+          <w:szCs w:val="28"/>
+        </w:rPr>
+        <w:t xml:space="preserve"> Cryptocurency</w:t>
+      </w:r>
+    </w:p>
+    <w:p>
+      <w:pPr>
+        <w:pStyle w:val="ListParagraph"/>
+        <w:numPr>
+          <w:ilvl w:val="0"/>
+          <w:numId w:val="14"/>
+        </w:numPr>
+        <w:tabs>
+          <w:tab w:val="right" w:pos="8505"/>
+        </w:tabs>
+        <w:spacing w:after="0"/>
+        <w:jc w:val="both"/>
+        <w:rPr>
+          <w:rFonts w:ascii="Times New Roman" w:hAnsi="Times New Roman" w:cs="Times New Roman"/>
+          <w:sz w:val="28"/>
+          <w:szCs w:val="28"/>
+        </w:rPr>
+      </w:pPr>
+      <w:r>
+        <w:rPr>
+          <w:rFonts w:ascii="Times New Roman" w:hAnsi="Times New Roman" w:cs="Times New Roman"/>
+          <w:sz w:val="28"/>
+          <w:szCs w:val="28"/>
+        </w:rPr>
+        <w:t>Web Scrapping</w:t>
+      </w:r>
+    </w:p>
+    <w:p>
+      <w:pPr>
+        <w:pStyle w:val="ListParagraph"/>
+        <w:numPr>
+          <w:ilvl w:val="0"/>
+          <w:numId w:val="14"/>
+        </w:numPr>
+        <w:tabs>
+          <w:tab w:val="right" w:pos="8505"/>
+        </w:tabs>
+        <w:spacing w:after="0"/>
+        <w:jc w:val="both"/>
+        <w:rPr>
+          <w:rFonts w:ascii="Times New Roman" w:hAnsi="Times New Roman" w:cs="Times New Roman"/>
+          <w:sz w:val="28"/>
+          <w:szCs w:val="28"/>
+        </w:rPr>
+      </w:pPr>
+      <w:r>
+        <w:rPr>
+          <w:rFonts w:ascii="Times New Roman" w:hAnsi="Times New Roman" w:cs="Times New Roman"/>
+          <w:sz w:val="28"/>
+          <w:szCs w:val="28"/>
+        </w:rPr>
+        <w:t xml:space="preserve"> Data Processing</w:t>
+      </w:r>
+    </w:p>
+    <w:p>
+      <w:pPr>
+        <w:pStyle w:val="ListParagraph"/>
+        <w:numPr>
+          <w:ilvl w:val="0"/>
+          <w:numId w:val="14"/>
+        </w:numPr>
+        <w:tabs>
+          <w:tab w:val="right" w:pos="8505"/>
+        </w:tabs>
+        <w:spacing w:after="0"/>
+        <w:jc w:val="both"/>
+        <w:rPr>
+          <w:rFonts w:ascii="Times New Roman" w:hAnsi="Times New Roman" w:cs="Times New Roman"/>
+          <w:sz w:val="28"/>
+          <w:szCs w:val="28"/>
+        </w:rPr>
+      </w:pPr>
+      <w:r>
+        <w:rPr>
+          <w:rFonts w:ascii="Times New Roman" w:hAnsi="Times New Roman" w:cs="Times New Roman"/>
+          <w:sz w:val="28"/>
+          <w:szCs w:val="28"/>
+        </w:rPr>
+        <w:t>Data Visualitation</w:t>
+      </w:r>
+    </w:p>
+    <w:p>
+      <w:pPr>
+        <w:pStyle w:val="ListParagraph"/>
+        <w:numPr>
+          <w:ilvl w:val="0"/>
+          <w:numId w:val="14"/>
+        </w:numPr>
+        <w:tabs>
+          <w:tab w:val="right" w:pos="8505"/>
+        </w:tabs>
+        <w:spacing w:after="0"/>
+        <w:jc w:val="both"/>
+        <w:rPr>
+          <w:rFonts w:ascii="Times New Roman" w:hAnsi="Times New Roman" w:cs="Times New Roman"/>
+          <w:sz w:val="28"/>
+          <w:szCs w:val="28"/>
+        </w:rPr>
+      </w:pPr>
+      <w:r>
+        <w:rPr>
+          <w:rFonts w:ascii="Times New Roman" w:hAnsi="Times New Roman" w:cs="Times New Roman"/>
+          <w:sz w:val="28"/>
+          <w:szCs w:val="28"/>
+        </w:rPr>
+        <w:t>Tools</w:t>
+      </w:r>
+    </w:p>
+    <w:p>
+      <w:pPr>
+        <w:pStyle w:val="ListParagraph"/>
+        <w:tabs>
+          <w:tab w:val="right" w:pos="8505"/>
+        </w:tabs>
+        <w:spacing w:after="0"/>
+        <w:ind w:left="795"/>
+        <w:jc w:val="both"/>
+        <w:rPr>
+          <w:rFonts w:ascii="Times New Roman" w:hAnsi="Times New Roman" w:cs="Times New Roman"/>
+          <w:sz w:val="28"/>
+          <w:szCs w:val="28"/>
+        </w:rPr>
+      </w:pPr>
+    </w:p>
+    <w:p>
+      <w:pPr>
+        <w:tabs>
+          <w:tab w:val="right" w:pos="8505"/>
+        </w:tabs>
+        <w:spacing w:after="0"/>
+        <w:jc w:val="center"/>
+        <w:rPr>
+          <w:rFonts w:ascii="Times New Roman" w:hAnsi="Times New Roman" w:cs="Times New Roman"/>
+          <w:b/>
+          <w:bCs/>
+          <w:sz w:val="28"/>
+          <w:szCs w:val="28"/>
+        </w:rPr>
+      </w:pPr>
+    </w:p>
+    <w:p>
+      <w:pPr>
+        <w:tabs>
+          <w:tab w:val="right" w:pos="8505"/>
+        </w:tabs>
+        <w:spacing w:after="0"/>
+        <w:jc w:val="center"/>
+        <w:rPr>
+          <w:rFonts w:ascii="Times New Roman" w:hAnsi="Times New Roman" w:cs="Times New Roman"/>
+          <w:b/>
+          <w:bCs/>
+          <w:sz w:val="28"/>
+          <w:szCs w:val="28"/>
+        </w:rPr>
+      </w:pPr>
+    </w:p>
+    <w:p>
+      <w:pPr>
+        <w:tabs>
+          <w:tab w:val="right" w:pos="8505"/>
+        </w:tabs>
+        <w:spacing w:after="0"/>
+        <w:jc w:val="center"/>
+        <w:rPr>
+          <w:rFonts w:ascii="Times New Roman" w:hAnsi="Times New Roman" w:cs="Times New Roman"/>
+          <w:b/>
+          <w:bCs/>
+          <w:sz w:val="28"/>
+          <w:szCs w:val="28"/>
+        </w:rPr>
+      </w:pPr>
+      <w:r>
+        <w:rPr>
+          <w:rFonts w:ascii="Times New Roman" w:hAnsi="Times New Roman" w:cs="Times New Roman"/>
+          <w:b/>
+          <w:bCs/>
+          <w:sz w:val="28"/>
+          <w:szCs w:val="28"/>
+        </w:rPr>
+        <w:t>BAB II</w:t>
+      </w:r>
+      <w:r>
+        <w:rPr>
+          <w:rFonts w:ascii="Times New Roman" w:hAnsi="Times New Roman" w:cs="Times New Roman"/>
+          <w:b/>
+          <w:bCs/>
+          <w:sz w:val="28"/>
+          <w:szCs w:val="28"/>
+        </w:rPr>
+        <w:t>I</w:t>
+      </w:r>
+    </w:p>
+    <w:p>
+      <w:pPr>
+        <w:tabs>
+          <w:tab w:val="right" w:pos="8505"/>
+        </w:tabs>
+        <w:spacing w:after="0"/>
+        <w:jc w:val="center"/>
+        <w:rPr>
+          <w:rFonts w:ascii="Times New Roman" w:hAnsi="Times New Roman" w:cs="Times New Roman"/>
+          <w:b/>
+          <w:bCs/>
+          <w:sz w:val="28"/>
+          <w:szCs w:val="28"/>
+        </w:rPr>
+      </w:pPr>
+      <w:r>
+        <w:rPr>
+          <w:rFonts w:ascii="Times New Roman" w:hAnsi="Times New Roman" w:cs="Times New Roman"/>
+          <w:b/>
+          <w:bCs/>
+          <w:sz w:val="28"/>
+          <w:szCs w:val="28"/>
+        </w:rPr>
+        <w:t>T</w:t>
+      </w:r>
+      <w:r>
+        <w:rPr>
+          <w:rFonts w:ascii="Times New Roman" w:hAnsi="Times New Roman" w:cs="Times New Roman"/>
+          <w:b/>
+          <w:bCs/>
+          <w:sz w:val="28"/>
+          <w:szCs w:val="28"/>
+        </w:rPr>
+        <w:t>AHAPAN LANGKAH LANGKAH ANALISA DATA</w:t>
+      </w:r>
+    </w:p>
+    <w:p>
+      <w:pPr>
+        <w:tabs>
+          <w:tab w:val="right" w:pos="8505"/>
+        </w:tabs>
+        <w:spacing w:after="0"/>
+        <w:jc w:val="center"/>
+        <w:rPr>
+          <w:rFonts w:ascii="Times New Roman" w:hAnsi="Times New Roman" w:cs="Times New Roman"/>
+          <w:b/>
+          <w:bCs/>
+          <w:sz w:val="28"/>
+          <w:szCs w:val="28"/>
+        </w:rPr>
+      </w:pPr>
+    </w:p>
+    <w:p>
+      <w:pPr>
+        <w:pStyle w:val="ListParagraph"/>
+        <w:numPr>
+          <w:ilvl w:val="0"/>
+          <w:numId w:val="15"/>
+        </w:numPr>
+        <w:tabs>
+          <w:tab w:val="right" w:pos="8505"/>
+        </w:tabs>
+        <w:spacing w:after="0"/>
+        <w:jc w:val="both"/>
+        <w:rPr>
+          <w:rFonts w:ascii="Times New Roman" w:hAnsi="Times New Roman" w:cs="Times New Roman"/>
+          <w:sz w:val="28"/>
+          <w:szCs w:val="28"/>
+        </w:rPr>
+      </w:pPr>
+      <w:r>
+        <w:rPr>
+          <w:rFonts w:ascii="Times New Roman" w:hAnsi="Times New Roman" w:cs="Times New Roman"/>
+          <w:sz w:val="28"/>
+          <w:szCs w:val="28"/>
+        </w:rPr>
+        <w:t xml:space="preserve"> Jenis dan Pendekatan analisis</w:t>
+      </w:r>
+    </w:p>
+    <w:p>
+      <w:pPr>
+        <w:pStyle w:val="ListParagraph"/>
+        <w:numPr>
+          <w:ilvl w:val="0"/>
+          <w:numId w:val="15"/>
+        </w:numPr>
+        <w:tabs>
+          <w:tab w:val="right" w:pos="8505"/>
+        </w:tabs>
+        <w:spacing w:after="0"/>
+        <w:jc w:val="both"/>
+        <w:rPr>
+          <w:rFonts w:ascii="Times New Roman" w:hAnsi="Times New Roman" w:cs="Times New Roman"/>
+          <w:sz w:val="28"/>
+          <w:szCs w:val="28"/>
+        </w:rPr>
+      </w:pPr>
+      <w:r>
+        <w:rPr>
+          <w:rFonts w:ascii="Times New Roman" w:hAnsi="Times New Roman" w:cs="Times New Roman"/>
+          <w:sz w:val="28"/>
+          <w:szCs w:val="28"/>
+        </w:rPr>
+        <w:t xml:space="preserve"> Sumber dan jenis data</w:t>
+      </w:r>
+    </w:p>
+    <w:p>
+      <w:pPr>
+        <w:pStyle w:val="ListParagraph"/>
+        <w:numPr>
+          <w:ilvl w:val="0"/>
+          <w:numId w:val="15"/>
+        </w:numPr>
+        <w:tabs>
+          <w:tab w:val="right" w:pos="8505"/>
+        </w:tabs>
+        <w:spacing w:after="0"/>
+        <w:jc w:val="both"/>
+        <w:rPr>
+          <w:rFonts w:ascii="Times New Roman" w:hAnsi="Times New Roman" w:cs="Times New Roman"/>
+          <w:sz w:val="28"/>
+          <w:szCs w:val="28"/>
+        </w:rPr>
+      </w:pPr>
+      <w:r>
+        <w:rPr>
+          <w:rFonts w:ascii="Times New Roman" w:hAnsi="Times New Roman" w:cs="Times New Roman"/>
+          <w:sz w:val="28"/>
+          <w:szCs w:val="28"/>
+        </w:rPr>
+        <w:t xml:space="preserve"> Tahapan analisis Data</w:t>
       </w:r>
       <w:bookmarkStart w:id="0" w:name="_GoBack"/>
       <w:bookmarkEnd w:id="0"/>
+    </w:p>
+    <w:p>
+      <w:pPr>
+        <w:tabs>
+          <w:tab w:val="right" w:pos="8505"/>
+        </w:tabs>
+        <w:spacing w:after="0"/>
+        <w:jc w:val="center"/>
+        <w:rPr>
+          <w:rFonts w:ascii="Times New Roman" w:hAnsi="Times New Roman" w:cs="Times New Roman"/>
+          <w:b/>
+          <w:bCs/>
+          <w:sz w:val="28"/>
+          <w:szCs w:val="28"/>
+        </w:rPr>
+      </w:pPr>
+    </w:p>
+    <w:p>
+      <w:pPr>
+        <w:tabs>
+          <w:tab w:val="right" w:pos="8505"/>
+        </w:tabs>
+        <w:spacing w:after="0"/>
+        <w:jc w:val="center"/>
+        <w:rPr>
+          <w:rFonts w:ascii="Times New Roman" w:hAnsi="Times New Roman" w:cs="Times New Roman"/>
+          <w:b/>
+          <w:bCs/>
+          <w:sz w:val="28"/>
+          <w:szCs w:val="28"/>
+        </w:rPr>
+      </w:pPr>
+      <w:r>
+        <w:rPr>
+          <w:rFonts w:ascii="Times New Roman" w:hAnsi="Times New Roman" w:cs="Times New Roman"/>
+          <w:b/>
+          <w:bCs/>
+          <w:sz w:val="28"/>
+          <w:szCs w:val="28"/>
+        </w:rPr>
+        <w:t>BAB IV</w:t>
+      </w:r>
+    </w:p>
+    <w:p>
+      <w:pPr>
+        <w:tabs>
+          <w:tab w:val="right" w:pos="8505"/>
+        </w:tabs>
+        <w:spacing w:after="0"/>
+        <w:jc w:val="center"/>
+        <w:rPr>
+          <w:rFonts w:ascii="Times New Roman" w:hAnsi="Times New Roman" w:cs="Times New Roman"/>
+          <w:b/>
+          <w:bCs/>
+          <w:sz w:val="28"/>
+          <w:szCs w:val="28"/>
+        </w:rPr>
+      </w:pPr>
+      <w:r>
+        <w:rPr>
+          <w:rFonts w:ascii="Times New Roman" w:hAnsi="Times New Roman" w:cs="Times New Roman"/>
+          <w:b/>
+          <w:bCs/>
+          <w:sz w:val="28"/>
+          <w:szCs w:val="28"/>
+        </w:rPr>
+        <w:t xml:space="preserve">HASIL &amp; PEMBAHASAN </w:t>
+      </w:r>
+    </w:p>
+    <w:p>
+      <w:pPr>
+        <w:tabs>
+          <w:tab w:val="right" w:pos="8505"/>
+        </w:tabs>
+        <w:spacing w:after="0"/>
+        <w:jc w:val="center"/>
+        <w:rPr>
+          <w:rFonts w:ascii="Times New Roman" w:hAnsi="Times New Roman" w:cs="Times New Roman"/>
+          <w:b/>
+          <w:bCs/>
+          <w:sz w:val="28"/>
+          <w:szCs w:val="28"/>
+        </w:rPr>
+      </w:pPr>
+    </w:p>
+    <w:p>
+      <w:pPr>
+        <w:tabs>
+          <w:tab w:val="right" w:pos="8505"/>
+        </w:tabs>
+        <w:spacing w:after="0"/>
+        <w:jc w:val="center"/>
+        <w:rPr>
+          <w:rFonts w:ascii="Times New Roman" w:hAnsi="Times New Roman" w:cs="Times New Roman"/>
+          <w:b/>
+          <w:bCs/>
+          <w:sz w:val="28"/>
+          <w:szCs w:val="28"/>
+        </w:rPr>
+      </w:pPr>
+      <w:r>
+        <w:rPr>
+          <w:rFonts w:ascii="Times New Roman" w:hAnsi="Times New Roman" w:cs="Times New Roman"/>
+          <w:b/>
+          <w:bCs/>
+          <w:sz w:val="28"/>
+          <w:szCs w:val="28"/>
+        </w:rPr>
+        <w:t xml:space="preserve">BAB V </w:t>
+      </w:r>
+    </w:p>
+    <w:p>
+      <w:pPr>
+        <w:tabs>
+          <w:tab w:val="right" w:pos="8505"/>
+        </w:tabs>
+        <w:spacing w:after="0"/>
+        <w:jc w:val="center"/>
+        <w:rPr>
+          <w:rFonts w:ascii="Times New Roman" w:hAnsi="Times New Roman" w:cs="Times New Roman"/>
+          <w:b/>
+          <w:bCs/>
+          <w:sz w:val="28"/>
+          <w:szCs w:val="28"/>
+        </w:rPr>
+      </w:pPr>
+      <w:r>
+        <w:rPr>
+          <w:rFonts w:ascii="Times New Roman" w:hAnsi="Times New Roman" w:cs="Times New Roman"/>
+          <w:b/>
+          <w:bCs/>
+          <w:sz w:val="28"/>
+          <w:szCs w:val="28"/>
+        </w:rPr>
+        <w:t>KESIMPULAN</w:t>
+      </w:r>
+    </w:p>
+    <w:p>
+      <w:pPr>
+        <w:pStyle w:val="ListParagraph"/>
+        <w:tabs>
+          <w:tab w:val="right" w:pos="8505"/>
+        </w:tabs>
+        <w:jc w:val="both"/>
+        <w:rPr>
+          <w:rFonts w:ascii="Times New Roman" w:hAnsi="Times New Roman" w:cs="Times New Roman"/>
+          <w:sz w:val="28"/>
+          <w:szCs w:val="28"/>
+        </w:rPr>
+      </w:pPr>
+    </w:p>
+    <w:p>
+      <w:pPr>
+        <w:pStyle w:val="ListParagraph"/>
+        <w:tabs>
+          <w:tab w:val="right" w:pos="8505"/>
+        </w:tabs>
+        <w:jc w:val="both"/>
+        <w:rPr>
+          <w:rFonts w:ascii="Times New Roman" w:hAnsi="Times New Roman" w:cs="Times New Roman"/>
+          <w:sz w:val="28"/>
+          <w:szCs w:val="28"/>
+        </w:rPr>
+      </w:pPr>
+    </w:p>
+    <w:p>
+      <w:pPr>
+        <w:pStyle w:val="ListParagraph"/>
+        <w:tabs>
+          <w:tab w:val="right" w:pos="8505"/>
+        </w:tabs>
+        <w:spacing w:line="240" w:lineRule="auto"/>
+        <w:jc w:val="both"/>
+        <w:rPr>
+          <w:rFonts w:ascii="Times New Roman" w:hAnsi="Times New Roman" w:cs="Times New Roman"/>
+          <w:sz w:val="28"/>
+          <w:szCs w:val="28"/>
+        </w:rPr>
+      </w:pPr>
     </w:p>
     <w:sectPr>
       <w:footerReference w:type="default" r:id="rId9"/>
@@ -383,6 +1282,321 @@
 <file path=word/numbering.xml><?xml version="1.0" encoding="utf-8"?>
 <w:numbering xmlns:wpc="http://schemas.microsoft.com/office/word/2010/wordprocessingCanvas" xmlns:cx="http://schemas.microsoft.com/office/drawing/2014/chartex" xmlns:cx1="http://schemas.microsoft.com/office/drawing/2015/9/8/chartex" xmlns:cx2="http://schemas.microsoft.com/office/drawing/2015/10/21/chartex" xmlns:cx3="http://schemas.microsoft.com/office/drawing/2016/5/9/chartex" xmlns:cx4="http://schemas.microsoft.com/office/drawing/2016/5/10/chartex" xmlns:cx5="http://schemas.microsoft.com/office/drawing/2016/5/11/chartex" xmlns:cx6="http://schemas.microsoft.com/office/drawing/2016/5/12/chartex" xmlns:cx7="http://schemas.microsoft.com/office/drawing/2016/5/13/chartex" xmlns:cx8="http://schemas.microsoft.com/office/drawing/2016/5/14/chartex" xmlns:mc="http://schemas.openxmlformats.org/markup-compatibility/2006" xmlns:aink="http://schemas.microsoft.com/office/drawing/2016/ink" xmlns:am3d="http://schemas.microsoft.com/office/drawing/2017/model3d" xmlns:o="urn:schemas-microsoft-com:office:office" xmlns:r="http://schemas.openxmlformats.org/officeDocument/2006/relationships" xmlns:m="http://schemas.openxmlformats.org/officeDocument/2006/math" xmlns:v="urn:schemas-microsoft-com:vml" xmlns:wp14="http://schemas.microsoft.com/office/word/2010/wordprocessingDrawing" xmlns:wp="http://schemas.openxmlformats.org/drawingml/2006/wordprocessingDrawing" xmlns:w10="urn:schemas-microsoft-com:office:word" xmlns:w="http://schemas.openxmlformats.org/wordprocessingml/2006/main" xmlns:w14="http://schemas.microsoft.com/office/word/2010/wordml" xmlns:w15="http://schemas.microsoft.com/office/word/2012/wordml" xmlns:w16cex="http://schemas.microsoft.com/office/word/2018/wordml/cex" xmlns:w16cid="http://schemas.microsoft.com/office/word/2016/wordml/cid" xmlns:w16="http://schemas.microsoft.com/office/word/2018/wordml" xmlns:w16se="http://schemas.microsoft.com/office/word/2015/wordml/symex" xmlns:wpg="http://schemas.microsoft.com/office/word/2010/wordprocessingGroup" xmlns:wpi="http://schemas.microsoft.com/office/word/2010/wordprocessingInk" xmlns:wne="http://schemas.microsoft.com/office/word/2006/wordml" xmlns:wps="http://schemas.microsoft.com/office/word/2010/wordprocessingShape" mc:Ignorable="w14 w15 w16se w16cid w16 w16cex wp14">
   <w:abstractNum w:abstractNumId="0" w15:restartNumberingAfterBreak="0">
+    <w:nsid w:val="01DC0526"/>
+    <w:multiLevelType w:val="multilevel"/>
+    <w:tmpl w:val="00DA0B34"/>
+    <w:lvl w:ilvl="0">
+      <w:start w:val="1"/>
+      <w:numFmt w:val="decimal"/>
+      <w:lvlText w:val="%1."/>
+      <w:lvlJc w:val="left"/>
+      <w:pPr>
+        <w:ind w:left="360" w:hanging="360"/>
+      </w:pPr>
+      <w:rPr>
+        <w:rFonts w:hint="default"/>
+      </w:rPr>
+    </w:lvl>
+    <w:lvl w:ilvl="1">
+      <w:start w:val="1"/>
+      <w:numFmt w:val="decimal"/>
+      <w:lvlText w:val="%1.%2."/>
+      <w:lvlJc w:val="left"/>
+      <w:pPr>
+        <w:ind w:left="792" w:hanging="432"/>
+      </w:pPr>
+      <w:rPr>
+        <w:rFonts w:hint="default"/>
+      </w:rPr>
+    </w:lvl>
+    <w:lvl w:ilvl="2">
+      <w:start w:val="1"/>
+      <w:numFmt w:val="decimal"/>
+      <w:lvlText w:val="%1.%2.%3."/>
+      <w:lvlJc w:val="left"/>
+      <w:pPr>
+        <w:ind w:left="1224" w:hanging="504"/>
+      </w:pPr>
+      <w:rPr>
+        <w:rFonts w:hint="default"/>
+      </w:rPr>
+    </w:lvl>
+    <w:lvl w:ilvl="3">
+      <w:start w:val="1"/>
+      <w:numFmt w:val="decimal"/>
+      <w:lvlText w:val="%1.%2.%3.%4."/>
+      <w:lvlJc w:val="left"/>
+      <w:pPr>
+        <w:ind w:left="1728" w:hanging="648"/>
+      </w:pPr>
+      <w:rPr>
+        <w:rFonts w:hint="default"/>
+      </w:rPr>
+    </w:lvl>
+    <w:lvl w:ilvl="4">
+      <w:start w:val="1"/>
+      <w:numFmt w:val="decimal"/>
+      <w:lvlText w:val="%1.%2.%3.%4.%5."/>
+      <w:lvlJc w:val="left"/>
+      <w:pPr>
+        <w:ind w:left="2232" w:hanging="792"/>
+      </w:pPr>
+      <w:rPr>
+        <w:rFonts w:hint="default"/>
+      </w:rPr>
+    </w:lvl>
+    <w:lvl w:ilvl="5">
+      <w:start w:val="1"/>
+      <w:numFmt w:val="decimal"/>
+      <w:lvlText w:val="%1.%2.%3.%4.%5.%6."/>
+      <w:lvlJc w:val="left"/>
+      <w:pPr>
+        <w:ind w:left="2736" w:hanging="936"/>
+      </w:pPr>
+      <w:rPr>
+        <w:rFonts w:hint="default"/>
+      </w:rPr>
+    </w:lvl>
+    <w:lvl w:ilvl="6">
+      <w:start w:val="1"/>
+      <w:numFmt w:val="decimal"/>
+      <w:lvlText w:val="%1.%2.%3.%4.%5.%6.%7."/>
+      <w:lvlJc w:val="left"/>
+      <w:pPr>
+        <w:ind w:left="3240" w:hanging="1080"/>
+      </w:pPr>
+      <w:rPr>
+        <w:rFonts w:hint="default"/>
+      </w:rPr>
+    </w:lvl>
+    <w:lvl w:ilvl="7">
+      <w:start w:val="1"/>
+      <w:numFmt w:val="decimal"/>
+      <w:lvlText w:val="%1.%2.%3.%4.%5.%6.%7.%8."/>
+      <w:lvlJc w:val="left"/>
+      <w:pPr>
+        <w:ind w:left="3744" w:hanging="1224"/>
+      </w:pPr>
+      <w:rPr>
+        <w:rFonts w:hint="default"/>
+      </w:rPr>
+    </w:lvl>
+    <w:lvl w:ilvl="8">
+      <w:start w:val="1"/>
+      <w:numFmt w:val="decimal"/>
+      <w:lvlText w:val="%1.%2.%3.%4.%5.%6.%7.%8.%9."/>
+      <w:lvlJc w:val="left"/>
+      <w:pPr>
+        <w:ind w:left="4320" w:hanging="1440"/>
+      </w:pPr>
+      <w:rPr>
+        <w:rFonts w:hint="default"/>
+      </w:rPr>
+    </w:lvl>
+  </w:abstractNum>
+  <w:abstractNum w:abstractNumId="1" w15:restartNumberingAfterBreak="0">
+    <w:nsid w:val="07713828"/>
+    <w:multiLevelType w:val="multilevel"/>
+    <w:tmpl w:val="00DA0B34"/>
+    <w:lvl w:ilvl="0">
+      <w:start w:val="1"/>
+      <w:numFmt w:val="decimal"/>
+      <w:lvlText w:val="%1."/>
+      <w:lvlJc w:val="left"/>
+      <w:pPr>
+        <w:ind w:left="360" w:hanging="360"/>
+      </w:pPr>
+      <w:rPr>
+        <w:rFonts w:hint="default"/>
+      </w:rPr>
+    </w:lvl>
+    <w:lvl w:ilvl="1">
+      <w:start w:val="1"/>
+      <w:numFmt w:val="decimal"/>
+      <w:lvlText w:val="%1.%2."/>
+      <w:lvlJc w:val="left"/>
+      <w:pPr>
+        <w:ind w:left="792" w:hanging="432"/>
+      </w:pPr>
+      <w:rPr>
+        <w:rFonts w:hint="default"/>
+      </w:rPr>
+    </w:lvl>
+    <w:lvl w:ilvl="2">
+      <w:start w:val="1"/>
+      <w:numFmt w:val="decimal"/>
+      <w:lvlText w:val="%1.%2.%3."/>
+      <w:lvlJc w:val="left"/>
+      <w:pPr>
+        <w:ind w:left="1224" w:hanging="504"/>
+      </w:pPr>
+      <w:rPr>
+        <w:rFonts w:hint="default"/>
+      </w:rPr>
+    </w:lvl>
+    <w:lvl w:ilvl="3">
+      <w:start w:val="1"/>
+      <w:numFmt w:val="decimal"/>
+      <w:lvlText w:val="%1.%2.%3.%4."/>
+      <w:lvlJc w:val="left"/>
+      <w:pPr>
+        <w:ind w:left="1728" w:hanging="648"/>
+      </w:pPr>
+      <w:rPr>
+        <w:rFonts w:hint="default"/>
+      </w:rPr>
+    </w:lvl>
+    <w:lvl w:ilvl="4">
+      <w:start w:val="1"/>
+      <w:numFmt w:val="decimal"/>
+      <w:lvlText w:val="%1.%2.%3.%4.%5."/>
+      <w:lvlJc w:val="left"/>
+      <w:pPr>
+        <w:ind w:left="2232" w:hanging="792"/>
+      </w:pPr>
+      <w:rPr>
+        <w:rFonts w:hint="default"/>
+      </w:rPr>
+    </w:lvl>
+    <w:lvl w:ilvl="5">
+      <w:start w:val="1"/>
+      <w:numFmt w:val="decimal"/>
+      <w:lvlText w:val="%1.%2.%3.%4.%5.%6."/>
+      <w:lvlJc w:val="left"/>
+      <w:pPr>
+        <w:ind w:left="2736" w:hanging="936"/>
+      </w:pPr>
+      <w:rPr>
+        <w:rFonts w:hint="default"/>
+      </w:rPr>
+    </w:lvl>
+    <w:lvl w:ilvl="6">
+      <w:start w:val="1"/>
+      <w:numFmt w:val="decimal"/>
+      <w:lvlText w:val="%1.%2.%3.%4.%5.%6.%7."/>
+      <w:lvlJc w:val="left"/>
+      <w:pPr>
+        <w:ind w:left="3240" w:hanging="1080"/>
+      </w:pPr>
+      <w:rPr>
+        <w:rFonts w:hint="default"/>
+      </w:rPr>
+    </w:lvl>
+    <w:lvl w:ilvl="7">
+      <w:start w:val="1"/>
+      <w:numFmt w:val="decimal"/>
+      <w:lvlText w:val="%1.%2.%3.%4.%5.%6.%7.%8."/>
+      <w:lvlJc w:val="left"/>
+      <w:pPr>
+        <w:ind w:left="3744" w:hanging="1224"/>
+      </w:pPr>
+      <w:rPr>
+        <w:rFonts w:hint="default"/>
+      </w:rPr>
+    </w:lvl>
+    <w:lvl w:ilvl="8">
+      <w:start w:val="1"/>
+      <w:numFmt w:val="decimal"/>
+      <w:lvlText w:val="%1.%2.%3.%4.%5.%6.%7.%8.%9."/>
+      <w:lvlJc w:val="left"/>
+      <w:pPr>
+        <w:ind w:left="4320" w:hanging="1440"/>
+      </w:pPr>
+      <w:rPr>
+        <w:rFonts w:hint="default"/>
+      </w:rPr>
+    </w:lvl>
+  </w:abstractNum>
+  <w:abstractNum w:abstractNumId="2" w15:restartNumberingAfterBreak="0">
+    <w:nsid w:val="0E144E96"/>
+    <w:multiLevelType w:val="hybridMultilevel"/>
+    <w:tmpl w:val="3A4E5022"/>
+    <w:lvl w:ilvl="0" w:tplc="0FF20BC6">
+      <w:start w:val="1"/>
+      <w:numFmt w:val="decimal"/>
+      <w:lvlText w:val="3.%1"/>
+      <w:lvlJc w:val="left"/>
+      <w:pPr>
+        <w:ind w:left="720" w:hanging="360"/>
+      </w:pPr>
+      <w:rPr>
+        <w:rFonts w:hint="default"/>
+      </w:rPr>
+    </w:lvl>
+    <w:lvl w:ilvl="1" w:tplc="38090019" w:tentative="1">
+      <w:start w:val="1"/>
+      <w:numFmt w:val="lowerLetter"/>
+      <w:lvlText w:val="%2."/>
+      <w:lvlJc w:val="left"/>
+      <w:pPr>
+        <w:ind w:left="1440" w:hanging="360"/>
+      </w:pPr>
+    </w:lvl>
+    <w:lvl w:ilvl="2" w:tplc="3809001B" w:tentative="1">
+      <w:start w:val="1"/>
+      <w:numFmt w:val="lowerRoman"/>
+      <w:lvlText w:val="%3."/>
+      <w:lvlJc w:val="right"/>
+      <w:pPr>
+        <w:ind w:left="2160" w:hanging="180"/>
+      </w:pPr>
+    </w:lvl>
+    <w:lvl w:ilvl="3" w:tplc="3809000F" w:tentative="1">
+      <w:start w:val="1"/>
+      <w:numFmt w:val="decimal"/>
+      <w:lvlText w:val="%4."/>
+      <w:lvlJc w:val="left"/>
+      <w:pPr>
+        <w:ind w:left="2880" w:hanging="360"/>
+      </w:pPr>
+    </w:lvl>
+    <w:lvl w:ilvl="4" w:tplc="38090019" w:tentative="1">
+      <w:start w:val="1"/>
+      <w:numFmt w:val="lowerLetter"/>
+      <w:lvlText w:val="%5."/>
+      <w:lvlJc w:val="left"/>
+      <w:pPr>
+        <w:ind w:left="3600" w:hanging="360"/>
+      </w:pPr>
+    </w:lvl>
+    <w:lvl w:ilvl="5" w:tplc="3809001B" w:tentative="1">
+      <w:start w:val="1"/>
+      <w:numFmt w:val="lowerRoman"/>
+      <w:lvlText w:val="%6."/>
+      <w:lvlJc w:val="right"/>
+      <w:pPr>
+        <w:ind w:left="4320" w:hanging="180"/>
+      </w:pPr>
+    </w:lvl>
+    <w:lvl w:ilvl="6" w:tplc="3809000F" w:tentative="1">
+      <w:start w:val="1"/>
+      <w:numFmt w:val="decimal"/>
+      <w:lvlText w:val="%7."/>
+      <w:lvlJc w:val="left"/>
+      <w:pPr>
+        <w:ind w:left="5040" w:hanging="360"/>
+      </w:pPr>
+    </w:lvl>
+    <w:lvl w:ilvl="7" w:tplc="38090019" w:tentative="1">
+      <w:start w:val="1"/>
+      <w:numFmt w:val="lowerLetter"/>
+      <w:lvlText w:val="%8."/>
+      <w:lvlJc w:val="left"/>
+      <w:pPr>
+        <w:ind w:left="5760" w:hanging="360"/>
+      </w:pPr>
+    </w:lvl>
+    <w:lvl w:ilvl="8" w:tplc="3809001B" w:tentative="1">
+      <w:start w:val="1"/>
+      <w:numFmt w:val="lowerRoman"/>
+      <w:lvlText w:val="%9."/>
+      <w:lvlJc w:val="right"/>
+      <w:pPr>
+        <w:ind w:left="6480" w:hanging="180"/>
+      </w:pPr>
+    </w:lvl>
+  </w:abstractNum>
+  <w:abstractNum w:abstractNumId="3" w15:restartNumberingAfterBreak="0">
     <w:nsid w:val="1F442E14"/>
     <w:multiLevelType w:val="hybridMultilevel"/>
     <w:tmpl w:val="DE6A125A"/>
@@ -468,7 +1682,7 @@
       </w:pPr>
     </w:lvl>
   </w:abstractNum>
-  <w:abstractNum w:abstractNumId="1" w15:restartNumberingAfterBreak="0">
+  <w:abstractNum w:abstractNumId="4" w15:restartNumberingAfterBreak="0">
     <w:nsid w:val="22460519"/>
     <w:multiLevelType w:val="hybridMultilevel"/>
     <w:tmpl w:val="6B9492A0"/>
@@ -554,7 +1768,7 @@
       </w:pPr>
     </w:lvl>
   </w:abstractNum>
-  <w:abstractNum w:abstractNumId="2" w15:restartNumberingAfterBreak="0">
+  <w:abstractNum w:abstractNumId="5" w15:restartNumberingAfterBreak="0">
     <w:nsid w:val="2F82503A"/>
     <w:multiLevelType w:val="hybridMultilevel"/>
     <w:tmpl w:val="C388E9D2"/>
@@ -640,7 +1854,7 @@
       </w:pPr>
     </w:lvl>
   </w:abstractNum>
-  <w:abstractNum w:abstractNumId="3" w15:restartNumberingAfterBreak="0">
+  <w:abstractNum w:abstractNumId="6" w15:restartNumberingAfterBreak="0">
     <w:nsid w:val="384B5215"/>
     <w:multiLevelType w:val="hybridMultilevel"/>
     <w:tmpl w:val="48508BAA"/>
@@ -726,7 +1940,7 @@
       </w:pPr>
     </w:lvl>
   </w:abstractNum>
-  <w:abstractNum w:abstractNumId="4" w15:restartNumberingAfterBreak="0">
+  <w:abstractNum w:abstractNumId="7" w15:restartNumberingAfterBreak="0">
     <w:nsid w:val="3B463813"/>
     <w:multiLevelType w:val="hybridMultilevel"/>
     <w:tmpl w:val="C75C8704"/>
@@ -812,7 +2026,7 @@
       </w:pPr>
     </w:lvl>
   </w:abstractNum>
-  <w:abstractNum w:abstractNumId="5" w15:restartNumberingAfterBreak="0">
+  <w:abstractNum w:abstractNumId="8" w15:restartNumberingAfterBreak="0">
     <w:nsid w:val="3CB3660D"/>
     <w:multiLevelType w:val="hybridMultilevel"/>
     <w:tmpl w:val="B128CA32"/>
@@ -903,7 +2117,96 @@
       </w:pPr>
     </w:lvl>
   </w:abstractNum>
-  <w:abstractNum w:abstractNumId="6" w15:restartNumberingAfterBreak="0">
+  <w:abstractNum w:abstractNumId="9" w15:restartNumberingAfterBreak="0">
+    <w:nsid w:val="4AF276C4"/>
+    <w:multiLevelType w:val="hybridMultilevel"/>
+    <w:tmpl w:val="324871FC"/>
+    <w:lvl w:ilvl="0" w:tplc="666C9FD4">
+      <w:start w:val="1"/>
+      <w:numFmt w:val="decimal"/>
+      <w:lvlText w:val="2.%1"/>
+      <w:lvlJc w:val="left"/>
+      <w:pPr>
+        <w:ind w:left="795" w:hanging="360"/>
+      </w:pPr>
+      <w:rPr>
+        <w:rFonts w:hint="default"/>
+      </w:rPr>
+    </w:lvl>
+    <w:lvl w:ilvl="1" w:tplc="38090019" w:tentative="1">
+      <w:start w:val="1"/>
+      <w:numFmt w:val="lowerLetter"/>
+      <w:lvlText w:val="%2."/>
+      <w:lvlJc w:val="left"/>
+      <w:pPr>
+        <w:ind w:left="1515" w:hanging="360"/>
+      </w:pPr>
+    </w:lvl>
+    <w:lvl w:ilvl="2" w:tplc="3809001B" w:tentative="1">
+      <w:start w:val="1"/>
+      <w:numFmt w:val="lowerRoman"/>
+      <w:lvlText w:val="%3."/>
+      <w:lvlJc w:val="right"/>
+      <w:pPr>
+        <w:ind w:left="2235" w:hanging="180"/>
+      </w:pPr>
+    </w:lvl>
+    <w:lvl w:ilvl="3" w:tplc="3809000F" w:tentative="1">
+      <w:start w:val="1"/>
+      <w:numFmt w:val="decimal"/>
+      <w:lvlText w:val="%4."/>
+      <w:lvlJc w:val="left"/>
+      <w:pPr>
+        <w:ind w:left="2955" w:hanging="360"/>
+      </w:pPr>
+    </w:lvl>
+    <w:lvl w:ilvl="4" w:tplc="38090019" w:tentative="1">
+      <w:start w:val="1"/>
+      <w:numFmt w:val="lowerLetter"/>
+      <w:lvlText w:val="%5."/>
+      <w:lvlJc w:val="left"/>
+      <w:pPr>
+        <w:ind w:left="3675" w:hanging="360"/>
+      </w:pPr>
+    </w:lvl>
+    <w:lvl w:ilvl="5" w:tplc="3809001B" w:tentative="1">
+      <w:start w:val="1"/>
+      <w:numFmt w:val="lowerRoman"/>
+      <w:lvlText w:val="%6."/>
+      <w:lvlJc w:val="right"/>
+      <w:pPr>
+        <w:ind w:left="4395" w:hanging="180"/>
+      </w:pPr>
+    </w:lvl>
+    <w:lvl w:ilvl="6" w:tplc="3809000F" w:tentative="1">
+      <w:start w:val="1"/>
+      <w:numFmt w:val="decimal"/>
+      <w:lvlText w:val="%7."/>
+      <w:lvlJc w:val="left"/>
+      <w:pPr>
+        <w:ind w:left="5115" w:hanging="360"/>
+      </w:pPr>
+    </w:lvl>
+    <w:lvl w:ilvl="7" w:tplc="38090019" w:tentative="1">
+      <w:start w:val="1"/>
+      <w:numFmt w:val="lowerLetter"/>
+      <w:lvlText w:val="%8."/>
+      <w:lvlJc w:val="left"/>
+      <w:pPr>
+        <w:ind w:left="5835" w:hanging="360"/>
+      </w:pPr>
+    </w:lvl>
+    <w:lvl w:ilvl="8" w:tplc="3809001B" w:tentative="1">
+      <w:start w:val="1"/>
+      <w:numFmt w:val="lowerRoman"/>
+      <w:lvlText w:val="%9."/>
+      <w:lvlJc w:val="right"/>
+      <w:pPr>
+        <w:ind w:left="6555" w:hanging="180"/>
+      </w:pPr>
+    </w:lvl>
+  </w:abstractNum>
+  <w:abstractNum w:abstractNumId="10" w15:restartNumberingAfterBreak="0">
     <w:nsid w:val="5314732B"/>
     <w:multiLevelType w:val="hybridMultilevel"/>
     <w:tmpl w:val="F48094D4"/>
@@ -992,7 +2295,7 @@
       </w:pPr>
     </w:lvl>
   </w:abstractNum>
-  <w:abstractNum w:abstractNumId="7" w15:restartNumberingAfterBreak="0">
+  <w:abstractNum w:abstractNumId="11" w15:restartNumberingAfterBreak="0">
     <w:nsid w:val="6731208F"/>
     <w:multiLevelType w:val="multilevel"/>
     <w:tmpl w:val="3809001F"/>
@@ -1078,7 +2381,7 @@
       </w:pPr>
     </w:lvl>
   </w:abstractNum>
-  <w:abstractNum w:abstractNumId="8" w15:restartNumberingAfterBreak="0">
+  <w:abstractNum w:abstractNumId="12" w15:restartNumberingAfterBreak="0">
     <w:nsid w:val="6C374C59"/>
     <w:multiLevelType w:val="hybridMultilevel"/>
     <w:tmpl w:val="574ED282"/>
@@ -1164,32 +2467,232 @@
       </w:pPr>
     </w:lvl>
   </w:abstractNum>
+  <w:abstractNum w:abstractNumId="13" w15:restartNumberingAfterBreak="0">
+    <w:nsid w:val="74B35933"/>
+    <w:multiLevelType w:val="hybridMultilevel"/>
+    <w:tmpl w:val="D4AEBE16"/>
+    <w:lvl w:ilvl="0" w:tplc="665EBCD0">
+      <w:start w:val="1"/>
+      <w:numFmt w:val="decimal"/>
+      <w:lvlText w:val="1.%1"/>
+      <w:lvlJc w:val="left"/>
+      <w:pPr>
+        <w:ind w:left="720" w:hanging="360"/>
+      </w:pPr>
+      <w:rPr>
+        <w:rFonts w:hint="default"/>
+      </w:rPr>
+    </w:lvl>
+    <w:lvl w:ilvl="1" w:tplc="38090019" w:tentative="1">
+      <w:start w:val="1"/>
+      <w:numFmt w:val="lowerLetter"/>
+      <w:lvlText w:val="%2."/>
+      <w:lvlJc w:val="left"/>
+      <w:pPr>
+        <w:ind w:left="1440" w:hanging="360"/>
+      </w:pPr>
+    </w:lvl>
+    <w:lvl w:ilvl="2" w:tplc="3809001B" w:tentative="1">
+      <w:start w:val="1"/>
+      <w:numFmt w:val="lowerRoman"/>
+      <w:lvlText w:val="%3."/>
+      <w:lvlJc w:val="right"/>
+      <w:pPr>
+        <w:ind w:left="2160" w:hanging="180"/>
+      </w:pPr>
+    </w:lvl>
+    <w:lvl w:ilvl="3" w:tplc="3809000F" w:tentative="1">
+      <w:start w:val="1"/>
+      <w:numFmt w:val="decimal"/>
+      <w:lvlText w:val="%4."/>
+      <w:lvlJc w:val="left"/>
+      <w:pPr>
+        <w:ind w:left="2880" w:hanging="360"/>
+      </w:pPr>
+    </w:lvl>
+    <w:lvl w:ilvl="4" w:tplc="38090019" w:tentative="1">
+      <w:start w:val="1"/>
+      <w:numFmt w:val="lowerLetter"/>
+      <w:lvlText w:val="%5."/>
+      <w:lvlJc w:val="left"/>
+      <w:pPr>
+        <w:ind w:left="3600" w:hanging="360"/>
+      </w:pPr>
+    </w:lvl>
+    <w:lvl w:ilvl="5" w:tplc="3809001B" w:tentative="1">
+      <w:start w:val="1"/>
+      <w:numFmt w:val="lowerRoman"/>
+      <w:lvlText w:val="%6."/>
+      <w:lvlJc w:val="right"/>
+      <w:pPr>
+        <w:ind w:left="4320" w:hanging="180"/>
+      </w:pPr>
+    </w:lvl>
+    <w:lvl w:ilvl="6" w:tplc="3809000F" w:tentative="1">
+      <w:start w:val="1"/>
+      <w:numFmt w:val="decimal"/>
+      <w:lvlText w:val="%7."/>
+      <w:lvlJc w:val="left"/>
+      <w:pPr>
+        <w:ind w:left="5040" w:hanging="360"/>
+      </w:pPr>
+    </w:lvl>
+    <w:lvl w:ilvl="7" w:tplc="38090019" w:tentative="1">
+      <w:start w:val="1"/>
+      <w:numFmt w:val="lowerLetter"/>
+      <w:lvlText w:val="%8."/>
+      <w:lvlJc w:val="left"/>
+      <w:pPr>
+        <w:ind w:left="5760" w:hanging="360"/>
+      </w:pPr>
+    </w:lvl>
+    <w:lvl w:ilvl="8" w:tplc="3809001B" w:tentative="1">
+      <w:start w:val="1"/>
+      <w:numFmt w:val="lowerRoman"/>
+      <w:lvlText w:val="%9."/>
+      <w:lvlJc w:val="right"/>
+      <w:pPr>
+        <w:ind w:left="6480" w:hanging="180"/>
+      </w:pPr>
+    </w:lvl>
+  </w:abstractNum>
+  <w:abstractNum w:abstractNumId="14" w15:restartNumberingAfterBreak="0">
+    <w:nsid w:val="79382432"/>
+    <w:multiLevelType w:val="hybridMultilevel"/>
+    <w:tmpl w:val="2C68FE82"/>
+    <w:lvl w:ilvl="0" w:tplc="83524BA2">
+      <w:start w:val="1"/>
+      <w:numFmt w:val="decimal"/>
+      <w:lvlText w:val="%1.0"/>
+      <w:lvlJc w:val="left"/>
+      <w:pPr>
+        <w:ind w:left="720" w:hanging="360"/>
+      </w:pPr>
+      <w:rPr>
+        <w:rFonts w:ascii="Times New Roman" w:hAnsi="Times New Roman" w:cs="Times New Roman" w:hint="default"/>
+        <w:b/>
+        <w:bCs/>
+        <w:sz w:val="24"/>
+        <w:szCs w:val="24"/>
+      </w:rPr>
+    </w:lvl>
+    <w:lvl w:ilvl="1" w:tplc="38090019" w:tentative="1">
+      <w:start w:val="1"/>
+      <w:numFmt w:val="lowerLetter"/>
+      <w:lvlText w:val="%2."/>
+      <w:lvlJc w:val="left"/>
+      <w:pPr>
+        <w:ind w:left="1440" w:hanging="360"/>
+      </w:pPr>
+    </w:lvl>
+    <w:lvl w:ilvl="2" w:tplc="3809001B" w:tentative="1">
+      <w:start w:val="1"/>
+      <w:numFmt w:val="lowerRoman"/>
+      <w:lvlText w:val="%3."/>
+      <w:lvlJc w:val="right"/>
+      <w:pPr>
+        <w:ind w:left="2160" w:hanging="180"/>
+      </w:pPr>
+    </w:lvl>
+    <w:lvl w:ilvl="3" w:tplc="3809000F" w:tentative="1">
+      <w:start w:val="1"/>
+      <w:numFmt w:val="decimal"/>
+      <w:lvlText w:val="%4."/>
+      <w:lvlJc w:val="left"/>
+      <w:pPr>
+        <w:ind w:left="2880" w:hanging="360"/>
+      </w:pPr>
+    </w:lvl>
+    <w:lvl w:ilvl="4" w:tplc="38090019" w:tentative="1">
+      <w:start w:val="1"/>
+      <w:numFmt w:val="lowerLetter"/>
+      <w:lvlText w:val="%5."/>
+      <w:lvlJc w:val="left"/>
+      <w:pPr>
+        <w:ind w:left="3600" w:hanging="360"/>
+      </w:pPr>
+    </w:lvl>
+    <w:lvl w:ilvl="5" w:tplc="3809001B" w:tentative="1">
+      <w:start w:val="1"/>
+      <w:numFmt w:val="lowerRoman"/>
+      <w:lvlText w:val="%6."/>
+      <w:lvlJc w:val="right"/>
+      <w:pPr>
+        <w:ind w:left="4320" w:hanging="180"/>
+      </w:pPr>
+    </w:lvl>
+    <w:lvl w:ilvl="6" w:tplc="3809000F" w:tentative="1">
+      <w:start w:val="1"/>
+      <w:numFmt w:val="decimal"/>
+      <w:lvlText w:val="%7."/>
+      <w:lvlJc w:val="left"/>
+      <w:pPr>
+        <w:ind w:left="5040" w:hanging="360"/>
+      </w:pPr>
+    </w:lvl>
+    <w:lvl w:ilvl="7" w:tplc="38090019" w:tentative="1">
+      <w:start w:val="1"/>
+      <w:numFmt w:val="lowerLetter"/>
+      <w:lvlText w:val="%8."/>
+      <w:lvlJc w:val="left"/>
+      <w:pPr>
+        <w:ind w:left="5760" w:hanging="360"/>
+      </w:pPr>
+    </w:lvl>
+    <w:lvl w:ilvl="8" w:tplc="3809001B" w:tentative="1">
+      <w:start w:val="1"/>
+      <w:numFmt w:val="lowerRoman"/>
+      <w:lvlText w:val="%9."/>
+      <w:lvlJc w:val="right"/>
+      <w:pPr>
+        <w:ind w:left="6480" w:hanging="180"/>
+      </w:pPr>
+    </w:lvl>
+  </w:abstractNum>
   <w:num w:numId="1">
+    <w:abstractNumId w:val="6"/>
+  </w:num>
+  <w:num w:numId="2">
     <w:abstractNumId w:val="3"/>
   </w:num>
-  <w:num w:numId="2">
+  <w:num w:numId="3">
+    <w:abstractNumId w:val="4"/>
+  </w:num>
+  <w:num w:numId="4">
+    <w:abstractNumId w:val="7"/>
+  </w:num>
+  <w:num w:numId="5">
+    <w:abstractNumId w:val="5"/>
+  </w:num>
+  <w:num w:numId="6">
+    <w:abstractNumId w:val="12"/>
+  </w:num>
+  <w:num w:numId="7">
+    <w:abstractNumId w:val="10"/>
+  </w:num>
+  <w:num w:numId="8">
+    <w:abstractNumId w:val="11"/>
+  </w:num>
+  <w:num w:numId="9">
+    <w:abstractNumId w:val="8"/>
+  </w:num>
+  <w:num w:numId="10">
+    <w:abstractNumId w:val="1"/>
+  </w:num>
+  <w:num w:numId="11">
     <w:abstractNumId w:val="0"/>
   </w:num>
-  <w:num w:numId="3">
-    <w:abstractNumId w:val="1"/>
+  <w:num w:numId="12">
+    <w:abstractNumId w:val="14"/>
   </w:num>
-  <w:num w:numId="4">
-    <w:abstractNumId w:val="4"/>
+  <w:num w:numId="13">
+    <w:abstractNumId w:val="13"/>
   </w:num>
-  <w:num w:numId="5">
+  <w:num w:numId="14">
+    <w:abstractNumId w:val="9"/>
+  </w:num>
+  <w:num w:numId="15">
     <w:abstractNumId w:val="2"/>
-  </w:num>
-  <w:num w:numId="6">
-    <w:abstractNumId w:val="8"/>
-  </w:num>
-  <w:num w:numId="7">
-    <w:abstractNumId w:val="6"/>
-  </w:num>
-  <w:num w:numId="8">
-    <w:abstractNumId w:val="7"/>
-  </w:num>
-  <w:num w:numId="9">
-    <w:abstractNumId w:val="5"/>
   </w:num>
   <w:numIdMacAtCleanup w:val="5"/>
 </w:numbering>
@@ -1594,9 +3097,6 @@
     <w:name w:val="Normal"/>
     <w:qFormat/>
     <w:rsid w:val="00E82768"/>
-    <w:pPr>
-      <w:spacing w:after="0" w:line="240" w:lineRule="auto"/>
-    </w:pPr>
     <w:rPr>
       <w:lang w:val="en-US"/>
     </w:rPr>
@@ -2102,7 +3602,7 @@
 </file>
 
 <file path=customXml/itemProps1.xml><?xml version="1.0" encoding="utf-8"?>
-<ds:datastoreItem xmlns:ds="http://schemas.openxmlformats.org/officeDocument/2006/customXml" ds:itemID="{F4D26E69-3665-4017-AAE7-4BAD2712438A}">
+<ds:datastoreItem xmlns:ds="http://schemas.openxmlformats.org/officeDocument/2006/customXml" ds:itemID="{112E4EF4-ACC6-411D-874A-703419566268}">
   <ds:schemaRefs>
     <ds:schemaRef ds:uri="http://schemas.openxmlformats.org/officeDocument/2006/bibliography"/>
   </ds:schemaRefs>

</xml_diff>

<commit_message>
wip: progress laporan praktikum
</commit_message>
<xml_diff>
--- a/Laporan Praktikum Pemrosesan Data UTS projek.docx
+++ b/Laporan Praktikum Pemrosesan Data UTS projek.docx
@@ -92,6 +92,14 @@
         </w:rPr>
         <w:tab/>
       </w:r>
+      <w:r>
+        <w:rPr>
+          <w:rFonts w:ascii="Times New Roman" w:hAnsi="Times New Roman" w:cs="Times New Roman"/>
+          <w:sz w:val="24"/>
+          <w:szCs w:val="24"/>
+        </w:rPr>
+        <w:tab/>
+      </w:r>
     </w:p>
     <w:p>
       <w:pPr>
@@ -326,8 +334,36 @@
           <w:sz w:val="28"/>
           <w:szCs w:val="28"/>
         </w:rPr>
-        <w:t xml:space="preserve"> Latar Belakang</w:t>
-      </w:r>
+        <w:t xml:space="preserve"> </w:t>
+      </w:r>
+      <w:proofErr w:type="spellStart"/>
+      <w:r>
+        <w:rPr>
+          <w:rFonts w:ascii="Times New Roman" w:hAnsi="Times New Roman" w:cs="Times New Roman"/>
+          <w:sz w:val="28"/>
+          <w:szCs w:val="28"/>
+        </w:rPr>
+        <w:t>Latar</w:t>
+      </w:r>
+      <w:proofErr w:type="spellEnd"/>
+      <w:r>
+        <w:rPr>
+          <w:rFonts w:ascii="Times New Roman" w:hAnsi="Times New Roman" w:cs="Times New Roman"/>
+          <w:sz w:val="28"/>
+          <w:szCs w:val="28"/>
+        </w:rPr>
+        <w:t xml:space="preserve"> </w:t>
+      </w:r>
+      <w:proofErr w:type="spellStart"/>
+      <w:r>
+        <w:rPr>
+          <w:rFonts w:ascii="Times New Roman" w:hAnsi="Times New Roman" w:cs="Times New Roman"/>
+          <w:sz w:val="28"/>
+          <w:szCs w:val="28"/>
+        </w:rPr>
+        <w:t>Belakang</w:t>
+      </w:r>
+      <w:proofErr w:type="spellEnd"/>
     </w:p>
     <w:p>
       <w:pPr>
@@ -351,13 +387,761 @@
         </w:rPr>
         <w:tab/>
       </w:r>
-      <w:r>
-        <w:rPr>
-          <w:rFonts w:ascii="Times New Roman" w:hAnsi="Times New Roman" w:cs="Times New Roman"/>
-          <w:sz w:val="28"/>
-          <w:szCs w:val="28"/>
-        </w:rPr>
-        <w:t>Perkembangan teknologi digital telah mendorong pertumbuhan cryptocurrency sebagai salah satu instrumen investasi yang populer. Pasar cryptocurrency dikenal memiliki tingkat volatilitas yang tinggi, di mana harga aset dapat berubah secara signifikan dalam waktu yang singkat. Kondisi ini menjadikan informasi mengenai koin dengan kenaikan tertinggi (Top Gainers) dan penurunan terdalam (Top Losers) sebagai indikator penting dalam memahami pergerakan dan sentimen pasar.</w:t>
+      <w:proofErr w:type="spellStart"/>
+      <w:r>
+        <w:rPr>
+          <w:rFonts w:ascii="Times New Roman" w:hAnsi="Times New Roman" w:cs="Times New Roman"/>
+          <w:sz w:val="28"/>
+          <w:szCs w:val="28"/>
+        </w:rPr>
+        <w:t>Perkembangan</w:t>
+      </w:r>
+      <w:proofErr w:type="spellEnd"/>
+      <w:r>
+        <w:rPr>
+          <w:rFonts w:ascii="Times New Roman" w:hAnsi="Times New Roman" w:cs="Times New Roman"/>
+          <w:sz w:val="28"/>
+          <w:szCs w:val="28"/>
+        </w:rPr>
+        <w:t xml:space="preserve"> </w:t>
+      </w:r>
+      <w:proofErr w:type="spellStart"/>
+      <w:r>
+        <w:rPr>
+          <w:rFonts w:ascii="Times New Roman" w:hAnsi="Times New Roman" w:cs="Times New Roman"/>
+          <w:sz w:val="28"/>
+          <w:szCs w:val="28"/>
+        </w:rPr>
+        <w:t>teknologi</w:t>
+      </w:r>
+      <w:proofErr w:type="spellEnd"/>
+      <w:r>
+        <w:rPr>
+          <w:rFonts w:ascii="Times New Roman" w:hAnsi="Times New Roman" w:cs="Times New Roman"/>
+          <w:sz w:val="28"/>
+          <w:szCs w:val="28"/>
+        </w:rPr>
+        <w:t xml:space="preserve"> digital </w:t>
+      </w:r>
+      <w:proofErr w:type="spellStart"/>
+      <w:r>
+        <w:rPr>
+          <w:rFonts w:ascii="Times New Roman" w:hAnsi="Times New Roman" w:cs="Times New Roman"/>
+          <w:sz w:val="28"/>
+          <w:szCs w:val="28"/>
+        </w:rPr>
+        <w:t>telah</w:t>
+      </w:r>
+      <w:proofErr w:type="spellEnd"/>
+      <w:r>
+        <w:rPr>
+          <w:rFonts w:ascii="Times New Roman" w:hAnsi="Times New Roman" w:cs="Times New Roman"/>
+          <w:sz w:val="28"/>
+          <w:szCs w:val="28"/>
+        </w:rPr>
+        <w:t xml:space="preserve"> </w:t>
+      </w:r>
+      <w:proofErr w:type="spellStart"/>
+      <w:r>
+        <w:rPr>
+          <w:rFonts w:ascii="Times New Roman" w:hAnsi="Times New Roman" w:cs="Times New Roman"/>
+          <w:sz w:val="28"/>
+          <w:szCs w:val="28"/>
+        </w:rPr>
+        <w:t>mendorong</w:t>
+      </w:r>
+      <w:proofErr w:type="spellEnd"/>
+      <w:r>
+        <w:rPr>
+          <w:rFonts w:ascii="Times New Roman" w:hAnsi="Times New Roman" w:cs="Times New Roman"/>
+          <w:sz w:val="28"/>
+          <w:szCs w:val="28"/>
+        </w:rPr>
+        <w:t xml:space="preserve"> </w:t>
+      </w:r>
+      <w:proofErr w:type="spellStart"/>
+      <w:r>
+        <w:rPr>
+          <w:rFonts w:ascii="Times New Roman" w:hAnsi="Times New Roman" w:cs="Times New Roman"/>
+          <w:sz w:val="28"/>
+          <w:szCs w:val="28"/>
+        </w:rPr>
+        <w:t>pertumbuhan</w:t>
+      </w:r>
+      <w:proofErr w:type="spellEnd"/>
+      <w:r>
+        <w:rPr>
+          <w:rFonts w:ascii="Times New Roman" w:hAnsi="Times New Roman" w:cs="Times New Roman"/>
+          <w:sz w:val="28"/>
+          <w:szCs w:val="28"/>
+        </w:rPr>
+        <w:t xml:space="preserve"> cryptocurrency </w:t>
+      </w:r>
+      <w:proofErr w:type="spellStart"/>
+      <w:r>
+        <w:rPr>
+          <w:rFonts w:ascii="Times New Roman" w:hAnsi="Times New Roman" w:cs="Times New Roman"/>
+          <w:sz w:val="28"/>
+          <w:szCs w:val="28"/>
+        </w:rPr>
+        <w:t>sebagai</w:t>
+      </w:r>
+      <w:proofErr w:type="spellEnd"/>
+      <w:r>
+        <w:rPr>
+          <w:rFonts w:ascii="Times New Roman" w:hAnsi="Times New Roman" w:cs="Times New Roman"/>
+          <w:sz w:val="28"/>
+          <w:szCs w:val="28"/>
+        </w:rPr>
+        <w:t xml:space="preserve"> salah </w:t>
+      </w:r>
+      <w:proofErr w:type="spellStart"/>
+      <w:r>
+        <w:rPr>
+          <w:rFonts w:ascii="Times New Roman" w:hAnsi="Times New Roman" w:cs="Times New Roman"/>
+          <w:sz w:val="28"/>
+          <w:szCs w:val="28"/>
+        </w:rPr>
+        <w:t>satu</w:t>
+      </w:r>
+      <w:proofErr w:type="spellEnd"/>
+      <w:r>
+        <w:rPr>
+          <w:rFonts w:ascii="Times New Roman" w:hAnsi="Times New Roman" w:cs="Times New Roman"/>
+          <w:sz w:val="28"/>
+          <w:szCs w:val="28"/>
+        </w:rPr>
+        <w:t xml:space="preserve"> </w:t>
+      </w:r>
+      <w:proofErr w:type="spellStart"/>
+      <w:r>
+        <w:rPr>
+          <w:rFonts w:ascii="Times New Roman" w:hAnsi="Times New Roman" w:cs="Times New Roman"/>
+          <w:sz w:val="28"/>
+          <w:szCs w:val="28"/>
+        </w:rPr>
+        <w:t>instrumen</w:t>
+      </w:r>
+      <w:proofErr w:type="spellEnd"/>
+      <w:r>
+        <w:rPr>
+          <w:rFonts w:ascii="Times New Roman" w:hAnsi="Times New Roman" w:cs="Times New Roman"/>
+          <w:sz w:val="28"/>
+          <w:szCs w:val="28"/>
+        </w:rPr>
+        <w:t xml:space="preserve"> </w:t>
+      </w:r>
+      <w:proofErr w:type="spellStart"/>
+      <w:r>
+        <w:rPr>
+          <w:rFonts w:ascii="Times New Roman" w:hAnsi="Times New Roman" w:cs="Times New Roman"/>
+          <w:sz w:val="28"/>
+          <w:szCs w:val="28"/>
+        </w:rPr>
+        <w:t>investasi</w:t>
+      </w:r>
+      <w:proofErr w:type="spellEnd"/>
+      <w:r>
+        <w:rPr>
+          <w:rFonts w:ascii="Times New Roman" w:hAnsi="Times New Roman" w:cs="Times New Roman"/>
+          <w:sz w:val="28"/>
+          <w:szCs w:val="28"/>
+        </w:rPr>
+        <w:t xml:space="preserve"> yang </w:t>
+      </w:r>
+      <w:proofErr w:type="spellStart"/>
+      <w:r>
+        <w:rPr>
+          <w:rFonts w:ascii="Times New Roman" w:hAnsi="Times New Roman" w:cs="Times New Roman"/>
+          <w:sz w:val="28"/>
+          <w:szCs w:val="28"/>
+        </w:rPr>
+        <w:t>populer</w:t>
+      </w:r>
+      <w:proofErr w:type="spellEnd"/>
+      <w:r>
+        <w:rPr>
+          <w:rFonts w:ascii="Times New Roman" w:hAnsi="Times New Roman" w:cs="Times New Roman"/>
+          <w:sz w:val="28"/>
+          <w:szCs w:val="28"/>
+        </w:rPr>
+        <w:t xml:space="preserve">. Pasar cryptocurrency </w:t>
+      </w:r>
+      <w:proofErr w:type="spellStart"/>
+      <w:r>
+        <w:rPr>
+          <w:rFonts w:ascii="Times New Roman" w:hAnsi="Times New Roman" w:cs="Times New Roman"/>
+          <w:sz w:val="28"/>
+          <w:szCs w:val="28"/>
+        </w:rPr>
+        <w:t>dikenal</w:t>
+      </w:r>
+      <w:proofErr w:type="spellEnd"/>
+      <w:r>
+        <w:rPr>
+          <w:rFonts w:ascii="Times New Roman" w:hAnsi="Times New Roman" w:cs="Times New Roman"/>
+          <w:sz w:val="28"/>
+          <w:szCs w:val="28"/>
+        </w:rPr>
+        <w:t xml:space="preserve"> </w:t>
+      </w:r>
+      <w:proofErr w:type="spellStart"/>
+      <w:r>
+        <w:rPr>
+          <w:rFonts w:ascii="Times New Roman" w:hAnsi="Times New Roman" w:cs="Times New Roman"/>
+          <w:sz w:val="28"/>
+          <w:szCs w:val="28"/>
+        </w:rPr>
+        <w:t>memiliki</w:t>
+      </w:r>
+      <w:proofErr w:type="spellEnd"/>
+      <w:r>
+        <w:rPr>
+          <w:rFonts w:ascii="Times New Roman" w:hAnsi="Times New Roman" w:cs="Times New Roman"/>
+          <w:sz w:val="28"/>
+          <w:szCs w:val="28"/>
+        </w:rPr>
+        <w:t xml:space="preserve"> </w:t>
+      </w:r>
+      <w:proofErr w:type="spellStart"/>
+      <w:r>
+        <w:rPr>
+          <w:rFonts w:ascii="Times New Roman" w:hAnsi="Times New Roman" w:cs="Times New Roman"/>
+          <w:sz w:val="28"/>
+          <w:szCs w:val="28"/>
+        </w:rPr>
+        <w:t>tingkat</w:t>
+      </w:r>
+      <w:proofErr w:type="spellEnd"/>
+      <w:r>
+        <w:rPr>
+          <w:rFonts w:ascii="Times New Roman" w:hAnsi="Times New Roman" w:cs="Times New Roman"/>
+          <w:sz w:val="28"/>
+          <w:szCs w:val="28"/>
+        </w:rPr>
+        <w:t xml:space="preserve"> </w:t>
+      </w:r>
+      <w:proofErr w:type="spellStart"/>
+      <w:r>
+        <w:rPr>
+          <w:rFonts w:ascii="Times New Roman" w:hAnsi="Times New Roman" w:cs="Times New Roman"/>
+          <w:sz w:val="28"/>
+          <w:szCs w:val="28"/>
+        </w:rPr>
+        <w:t>volatilitas</w:t>
+      </w:r>
+      <w:proofErr w:type="spellEnd"/>
+      <w:r>
+        <w:rPr>
+          <w:rFonts w:ascii="Times New Roman" w:hAnsi="Times New Roman" w:cs="Times New Roman"/>
+          <w:sz w:val="28"/>
+          <w:szCs w:val="28"/>
+        </w:rPr>
+        <w:t xml:space="preserve"> yang </w:t>
+      </w:r>
+      <w:proofErr w:type="spellStart"/>
+      <w:r>
+        <w:rPr>
+          <w:rFonts w:ascii="Times New Roman" w:hAnsi="Times New Roman" w:cs="Times New Roman"/>
+          <w:sz w:val="28"/>
+          <w:szCs w:val="28"/>
+        </w:rPr>
+        <w:t>tinggi</w:t>
+      </w:r>
+      <w:proofErr w:type="spellEnd"/>
+      <w:r>
+        <w:rPr>
+          <w:rFonts w:ascii="Times New Roman" w:hAnsi="Times New Roman" w:cs="Times New Roman"/>
+          <w:sz w:val="28"/>
+          <w:szCs w:val="28"/>
+        </w:rPr>
+        <w:t xml:space="preserve">, di mana </w:t>
+      </w:r>
+      <w:proofErr w:type="spellStart"/>
+      <w:r>
+        <w:rPr>
+          <w:rFonts w:ascii="Times New Roman" w:hAnsi="Times New Roman" w:cs="Times New Roman"/>
+          <w:sz w:val="28"/>
+          <w:szCs w:val="28"/>
+        </w:rPr>
+        <w:t>harga</w:t>
+      </w:r>
+      <w:proofErr w:type="spellEnd"/>
+      <w:r>
+        <w:rPr>
+          <w:rFonts w:ascii="Times New Roman" w:hAnsi="Times New Roman" w:cs="Times New Roman"/>
+          <w:sz w:val="28"/>
+          <w:szCs w:val="28"/>
+        </w:rPr>
+        <w:t xml:space="preserve"> </w:t>
+      </w:r>
+      <w:proofErr w:type="spellStart"/>
+      <w:r>
+        <w:rPr>
+          <w:rFonts w:ascii="Times New Roman" w:hAnsi="Times New Roman" w:cs="Times New Roman"/>
+          <w:sz w:val="28"/>
+          <w:szCs w:val="28"/>
+        </w:rPr>
+        <w:t>aset</w:t>
+      </w:r>
+      <w:proofErr w:type="spellEnd"/>
+      <w:r>
+        <w:rPr>
+          <w:rFonts w:ascii="Times New Roman" w:hAnsi="Times New Roman" w:cs="Times New Roman"/>
+          <w:sz w:val="28"/>
+          <w:szCs w:val="28"/>
+        </w:rPr>
+        <w:t xml:space="preserve"> </w:t>
+      </w:r>
+      <w:proofErr w:type="spellStart"/>
+      <w:r>
+        <w:rPr>
+          <w:rFonts w:ascii="Times New Roman" w:hAnsi="Times New Roman" w:cs="Times New Roman"/>
+          <w:sz w:val="28"/>
+          <w:szCs w:val="28"/>
+        </w:rPr>
+        <w:t>dapat</w:t>
+      </w:r>
+      <w:proofErr w:type="spellEnd"/>
+      <w:r>
+        <w:rPr>
+          <w:rFonts w:ascii="Times New Roman" w:hAnsi="Times New Roman" w:cs="Times New Roman"/>
+          <w:sz w:val="28"/>
+          <w:szCs w:val="28"/>
+        </w:rPr>
+        <w:t xml:space="preserve"> </w:t>
+      </w:r>
+      <w:proofErr w:type="spellStart"/>
+      <w:r>
+        <w:rPr>
+          <w:rFonts w:ascii="Times New Roman" w:hAnsi="Times New Roman" w:cs="Times New Roman"/>
+          <w:sz w:val="28"/>
+          <w:szCs w:val="28"/>
+        </w:rPr>
+        <w:t>berubah</w:t>
+      </w:r>
+      <w:proofErr w:type="spellEnd"/>
+      <w:r>
+        <w:rPr>
+          <w:rFonts w:ascii="Times New Roman" w:hAnsi="Times New Roman" w:cs="Times New Roman"/>
+          <w:sz w:val="28"/>
+          <w:szCs w:val="28"/>
+        </w:rPr>
+        <w:t xml:space="preserve"> </w:t>
+      </w:r>
+      <w:proofErr w:type="spellStart"/>
+      <w:r>
+        <w:rPr>
+          <w:rFonts w:ascii="Times New Roman" w:hAnsi="Times New Roman" w:cs="Times New Roman"/>
+          <w:sz w:val="28"/>
+          <w:szCs w:val="28"/>
+        </w:rPr>
+        <w:t>secara</w:t>
+      </w:r>
+      <w:proofErr w:type="spellEnd"/>
+      <w:r>
+        <w:rPr>
+          <w:rFonts w:ascii="Times New Roman" w:hAnsi="Times New Roman" w:cs="Times New Roman"/>
+          <w:sz w:val="28"/>
+          <w:szCs w:val="28"/>
+        </w:rPr>
+        <w:t xml:space="preserve"> </w:t>
+      </w:r>
+      <w:proofErr w:type="spellStart"/>
+      <w:r>
+        <w:rPr>
+          <w:rFonts w:ascii="Times New Roman" w:hAnsi="Times New Roman" w:cs="Times New Roman"/>
+          <w:sz w:val="28"/>
+          <w:szCs w:val="28"/>
+        </w:rPr>
+        <w:t>signifikan</w:t>
+      </w:r>
+      <w:proofErr w:type="spellEnd"/>
+      <w:r>
+        <w:rPr>
+          <w:rFonts w:ascii="Times New Roman" w:hAnsi="Times New Roman" w:cs="Times New Roman"/>
+          <w:sz w:val="28"/>
+          <w:szCs w:val="28"/>
+        </w:rPr>
+        <w:t xml:space="preserve"> </w:t>
+      </w:r>
+      <w:proofErr w:type="spellStart"/>
+      <w:r>
+        <w:rPr>
+          <w:rFonts w:ascii="Times New Roman" w:hAnsi="Times New Roman" w:cs="Times New Roman"/>
+          <w:sz w:val="28"/>
+          <w:szCs w:val="28"/>
+        </w:rPr>
+        <w:t>dalam</w:t>
+      </w:r>
+      <w:proofErr w:type="spellEnd"/>
+      <w:r>
+        <w:rPr>
+          <w:rFonts w:ascii="Times New Roman" w:hAnsi="Times New Roman" w:cs="Times New Roman"/>
+          <w:sz w:val="28"/>
+          <w:szCs w:val="28"/>
+        </w:rPr>
+        <w:t xml:space="preserve"> </w:t>
+      </w:r>
+      <w:proofErr w:type="spellStart"/>
+      <w:r>
+        <w:rPr>
+          <w:rFonts w:ascii="Times New Roman" w:hAnsi="Times New Roman" w:cs="Times New Roman"/>
+          <w:sz w:val="28"/>
+          <w:szCs w:val="28"/>
+        </w:rPr>
+        <w:t>waktu</w:t>
+      </w:r>
+      <w:proofErr w:type="spellEnd"/>
+      <w:r>
+        <w:rPr>
+          <w:rFonts w:ascii="Times New Roman" w:hAnsi="Times New Roman" w:cs="Times New Roman"/>
+          <w:sz w:val="28"/>
+          <w:szCs w:val="28"/>
+        </w:rPr>
+        <w:t xml:space="preserve"> yang </w:t>
+      </w:r>
+      <w:proofErr w:type="spellStart"/>
+      <w:r>
+        <w:rPr>
+          <w:rFonts w:ascii="Times New Roman" w:hAnsi="Times New Roman" w:cs="Times New Roman"/>
+          <w:sz w:val="28"/>
+          <w:szCs w:val="28"/>
+        </w:rPr>
+        <w:t>singkat</w:t>
+      </w:r>
+      <w:proofErr w:type="spellEnd"/>
+      <w:r>
+        <w:rPr>
+          <w:rFonts w:ascii="Times New Roman" w:hAnsi="Times New Roman" w:cs="Times New Roman"/>
+          <w:sz w:val="28"/>
+          <w:szCs w:val="28"/>
+        </w:rPr>
+        <w:t xml:space="preserve">. </w:t>
+      </w:r>
+      <w:proofErr w:type="spellStart"/>
+      <w:r>
+        <w:rPr>
+          <w:rFonts w:ascii="Times New Roman" w:hAnsi="Times New Roman" w:cs="Times New Roman"/>
+          <w:sz w:val="28"/>
+          <w:szCs w:val="28"/>
+        </w:rPr>
+        <w:t>Kondisi</w:t>
+      </w:r>
+      <w:proofErr w:type="spellEnd"/>
+      <w:r>
+        <w:rPr>
+          <w:rFonts w:ascii="Times New Roman" w:hAnsi="Times New Roman" w:cs="Times New Roman"/>
+          <w:sz w:val="28"/>
+          <w:szCs w:val="28"/>
+        </w:rPr>
+        <w:t xml:space="preserve"> </w:t>
+      </w:r>
+      <w:proofErr w:type="spellStart"/>
+      <w:r>
+        <w:rPr>
+          <w:rFonts w:ascii="Times New Roman" w:hAnsi="Times New Roman" w:cs="Times New Roman"/>
+          <w:sz w:val="28"/>
+          <w:szCs w:val="28"/>
+        </w:rPr>
+        <w:t>ini</w:t>
+      </w:r>
+      <w:proofErr w:type="spellEnd"/>
+      <w:r>
+        <w:rPr>
+          <w:rFonts w:ascii="Times New Roman" w:hAnsi="Times New Roman" w:cs="Times New Roman"/>
+          <w:sz w:val="28"/>
+          <w:szCs w:val="28"/>
+        </w:rPr>
+        <w:t xml:space="preserve"> </w:t>
+      </w:r>
+      <w:proofErr w:type="spellStart"/>
+      <w:r>
+        <w:rPr>
+          <w:rFonts w:ascii="Times New Roman" w:hAnsi="Times New Roman" w:cs="Times New Roman"/>
+          <w:sz w:val="28"/>
+          <w:szCs w:val="28"/>
+        </w:rPr>
+        <w:t>menjadikan</w:t>
+      </w:r>
+      <w:proofErr w:type="spellEnd"/>
+      <w:r>
+        <w:rPr>
+          <w:rFonts w:ascii="Times New Roman" w:hAnsi="Times New Roman" w:cs="Times New Roman"/>
+          <w:sz w:val="28"/>
+          <w:szCs w:val="28"/>
+        </w:rPr>
+        <w:t xml:space="preserve"> </w:t>
+      </w:r>
+      <w:proofErr w:type="spellStart"/>
+      <w:r>
+        <w:rPr>
+          <w:rFonts w:ascii="Times New Roman" w:hAnsi="Times New Roman" w:cs="Times New Roman"/>
+          <w:sz w:val="28"/>
+          <w:szCs w:val="28"/>
+        </w:rPr>
+        <w:t>informasi</w:t>
+      </w:r>
+      <w:proofErr w:type="spellEnd"/>
+      <w:r>
+        <w:rPr>
+          <w:rFonts w:ascii="Times New Roman" w:hAnsi="Times New Roman" w:cs="Times New Roman"/>
+          <w:sz w:val="28"/>
+          <w:szCs w:val="28"/>
+        </w:rPr>
+        <w:t xml:space="preserve"> </w:t>
+      </w:r>
+      <w:proofErr w:type="spellStart"/>
+      <w:r>
+        <w:rPr>
+          <w:rFonts w:ascii="Times New Roman" w:hAnsi="Times New Roman" w:cs="Times New Roman"/>
+          <w:sz w:val="28"/>
+          <w:szCs w:val="28"/>
+        </w:rPr>
+        <w:t>mengenai</w:t>
+      </w:r>
+      <w:proofErr w:type="spellEnd"/>
+      <w:r>
+        <w:rPr>
+          <w:rFonts w:ascii="Times New Roman" w:hAnsi="Times New Roman" w:cs="Times New Roman"/>
+          <w:sz w:val="28"/>
+          <w:szCs w:val="28"/>
+        </w:rPr>
+        <w:t xml:space="preserve"> </w:t>
+      </w:r>
+      <w:proofErr w:type="spellStart"/>
+      <w:r>
+        <w:rPr>
+          <w:rFonts w:ascii="Times New Roman" w:hAnsi="Times New Roman" w:cs="Times New Roman"/>
+          <w:sz w:val="28"/>
+          <w:szCs w:val="28"/>
+        </w:rPr>
+        <w:t>koin</w:t>
+      </w:r>
+      <w:proofErr w:type="spellEnd"/>
+      <w:r>
+        <w:rPr>
+          <w:rFonts w:ascii="Times New Roman" w:hAnsi="Times New Roman" w:cs="Times New Roman"/>
+          <w:sz w:val="28"/>
+          <w:szCs w:val="28"/>
+        </w:rPr>
+        <w:t xml:space="preserve"> </w:t>
+      </w:r>
+      <w:proofErr w:type="spellStart"/>
+      <w:r>
+        <w:rPr>
+          <w:rFonts w:ascii="Times New Roman" w:hAnsi="Times New Roman" w:cs="Times New Roman"/>
+          <w:sz w:val="28"/>
+          <w:szCs w:val="28"/>
+        </w:rPr>
+        <w:t>dengan</w:t>
+      </w:r>
+      <w:proofErr w:type="spellEnd"/>
+      <w:r>
+        <w:rPr>
+          <w:rFonts w:ascii="Times New Roman" w:hAnsi="Times New Roman" w:cs="Times New Roman"/>
+          <w:sz w:val="28"/>
+          <w:szCs w:val="28"/>
+        </w:rPr>
+        <w:t xml:space="preserve"> </w:t>
+      </w:r>
+      <w:proofErr w:type="spellStart"/>
+      <w:r>
+        <w:rPr>
+          <w:rFonts w:ascii="Times New Roman" w:hAnsi="Times New Roman" w:cs="Times New Roman"/>
+          <w:sz w:val="28"/>
+          <w:szCs w:val="28"/>
+        </w:rPr>
+        <w:t>kenaikan</w:t>
+      </w:r>
+      <w:proofErr w:type="spellEnd"/>
+      <w:r>
+        <w:rPr>
+          <w:rFonts w:ascii="Times New Roman" w:hAnsi="Times New Roman" w:cs="Times New Roman"/>
+          <w:sz w:val="28"/>
+          <w:szCs w:val="28"/>
+        </w:rPr>
+        <w:t xml:space="preserve"> </w:t>
+      </w:r>
+      <w:proofErr w:type="spellStart"/>
+      <w:r>
+        <w:rPr>
+          <w:rFonts w:ascii="Times New Roman" w:hAnsi="Times New Roman" w:cs="Times New Roman"/>
+          <w:sz w:val="28"/>
+          <w:szCs w:val="28"/>
+        </w:rPr>
+        <w:t>tertinggi</w:t>
+      </w:r>
+      <w:proofErr w:type="spellEnd"/>
+      <w:r>
+        <w:rPr>
+          <w:rFonts w:ascii="Times New Roman" w:hAnsi="Times New Roman" w:cs="Times New Roman"/>
+          <w:sz w:val="28"/>
+          <w:szCs w:val="28"/>
+        </w:rPr>
+        <w:t xml:space="preserve"> (Top Gainers) dan </w:t>
+      </w:r>
+      <w:proofErr w:type="spellStart"/>
+      <w:r>
+        <w:rPr>
+          <w:rFonts w:ascii="Times New Roman" w:hAnsi="Times New Roman" w:cs="Times New Roman"/>
+          <w:sz w:val="28"/>
+          <w:szCs w:val="28"/>
+        </w:rPr>
+        <w:t>penurunan</w:t>
+      </w:r>
+      <w:proofErr w:type="spellEnd"/>
+      <w:r>
+        <w:rPr>
+          <w:rFonts w:ascii="Times New Roman" w:hAnsi="Times New Roman" w:cs="Times New Roman"/>
+          <w:sz w:val="28"/>
+          <w:szCs w:val="28"/>
+        </w:rPr>
+        <w:t xml:space="preserve"> </w:t>
+      </w:r>
+      <w:proofErr w:type="spellStart"/>
+      <w:r>
+        <w:rPr>
+          <w:rFonts w:ascii="Times New Roman" w:hAnsi="Times New Roman" w:cs="Times New Roman"/>
+          <w:sz w:val="28"/>
+          <w:szCs w:val="28"/>
+        </w:rPr>
+        <w:t>terdalam</w:t>
+      </w:r>
+      <w:proofErr w:type="spellEnd"/>
+      <w:r>
+        <w:rPr>
+          <w:rFonts w:ascii="Times New Roman" w:hAnsi="Times New Roman" w:cs="Times New Roman"/>
+          <w:sz w:val="28"/>
+          <w:szCs w:val="28"/>
+        </w:rPr>
+        <w:t xml:space="preserve"> (Top Losers) </w:t>
+      </w:r>
+      <w:proofErr w:type="spellStart"/>
+      <w:r>
+        <w:rPr>
+          <w:rFonts w:ascii="Times New Roman" w:hAnsi="Times New Roman" w:cs="Times New Roman"/>
+          <w:sz w:val="28"/>
+          <w:szCs w:val="28"/>
+        </w:rPr>
+        <w:t>sebagai</w:t>
+      </w:r>
+      <w:proofErr w:type="spellEnd"/>
+      <w:r>
+        <w:rPr>
+          <w:rFonts w:ascii="Times New Roman" w:hAnsi="Times New Roman" w:cs="Times New Roman"/>
+          <w:sz w:val="28"/>
+          <w:szCs w:val="28"/>
+        </w:rPr>
+        <w:t xml:space="preserve"> </w:t>
+      </w:r>
+      <w:proofErr w:type="spellStart"/>
+      <w:r>
+        <w:rPr>
+          <w:rFonts w:ascii="Times New Roman" w:hAnsi="Times New Roman" w:cs="Times New Roman"/>
+          <w:sz w:val="28"/>
+          <w:szCs w:val="28"/>
+        </w:rPr>
+        <w:t>indikator</w:t>
+      </w:r>
+      <w:proofErr w:type="spellEnd"/>
+      <w:r>
+        <w:rPr>
+          <w:rFonts w:ascii="Times New Roman" w:hAnsi="Times New Roman" w:cs="Times New Roman"/>
+          <w:sz w:val="28"/>
+          <w:szCs w:val="28"/>
+        </w:rPr>
+        <w:t xml:space="preserve"> </w:t>
+      </w:r>
+      <w:proofErr w:type="spellStart"/>
+      <w:r>
+        <w:rPr>
+          <w:rFonts w:ascii="Times New Roman" w:hAnsi="Times New Roman" w:cs="Times New Roman"/>
+          <w:sz w:val="28"/>
+          <w:szCs w:val="28"/>
+        </w:rPr>
+        <w:t>penting</w:t>
+      </w:r>
+      <w:proofErr w:type="spellEnd"/>
+      <w:r>
+        <w:rPr>
+          <w:rFonts w:ascii="Times New Roman" w:hAnsi="Times New Roman" w:cs="Times New Roman"/>
+          <w:sz w:val="28"/>
+          <w:szCs w:val="28"/>
+        </w:rPr>
+        <w:t xml:space="preserve"> </w:t>
+      </w:r>
+      <w:proofErr w:type="spellStart"/>
+      <w:r>
+        <w:rPr>
+          <w:rFonts w:ascii="Times New Roman" w:hAnsi="Times New Roman" w:cs="Times New Roman"/>
+          <w:sz w:val="28"/>
+          <w:szCs w:val="28"/>
+        </w:rPr>
+        <w:t>dalam</w:t>
+      </w:r>
+      <w:proofErr w:type="spellEnd"/>
+      <w:r>
+        <w:rPr>
+          <w:rFonts w:ascii="Times New Roman" w:hAnsi="Times New Roman" w:cs="Times New Roman"/>
+          <w:sz w:val="28"/>
+          <w:szCs w:val="28"/>
+        </w:rPr>
+        <w:t xml:space="preserve"> </w:t>
+      </w:r>
+      <w:proofErr w:type="spellStart"/>
+      <w:r>
+        <w:rPr>
+          <w:rFonts w:ascii="Times New Roman" w:hAnsi="Times New Roman" w:cs="Times New Roman"/>
+          <w:sz w:val="28"/>
+          <w:szCs w:val="28"/>
+        </w:rPr>
+        <w:t>memahami</w:t>
+      </w:r>
+      <w:proofErr w:type="spellEnd"/>
+      <w:r>
+        <w:rPr>
+          <w:rFonts w:ascii="Times New Roman" w:hAnsi="Times New Roman" w:cs="Times New Roman"/>
+          <w:sz w:val="28"/>
+          <w:szCs w:val="28"/>
+        </w:rPr>
+        <w:t xml:space="preserve"> </w:t>
+      </w:r>
+      <w:proofErr w:type="spellStart"/>
+      <w:r>
+        <w:rPr>
+          <w:rFonts w:ascii="Times New Roman" w:hAnsi="Times New Roman" w:cs="Times New Roman"/>
+          <w:sz w:val="28"/>
+          <w:szCs w:val="28"/>
+        </w:rPr>
+        <w:t>pergerakan</w:t>
+      </w:r>
+      <w:proofErr w:type="spellEnd"/>
+      <w:r>
+        <w:rPr>
+          <w:rFonts w:ascii="Times New Roman" w:hAnsi="Times New Roman" w:cs="Times New Roman"/>
+          <w:sz w:val="28"/>
+          <w:szCs w:val="28"/>
+        </w:rPr>
+        <w:t xml:space="preserve"> dan </w:t>
+      </w:r>
+      <w:proofErr w:type="spellStart"/>
+      <w:r>
+        <w:rPr>
+          <w:rFonts w:ascii="Times New Roman" w:hAnsi="Times New Roman" w:cs="Times New Roman"/>
+          <w:sz w:val="28"/>
+          <w:szCs w:val="28"/>
+        </w:rPr>
+        <w:t>sentimen</w:t>
+      </w:r>
+      <w:proofErr w:type="spellEnd"/>
+      <w:r>
+        <w:rPr>
+          <w:rFonts w:ascii="Times New Roman" w:hAnsi="Times New Roman" w:cs="Times New Roman"/>
+          <w:sz w:val="28"/>
+          <w:szCs w:val="28"/>
+        </w:rPr>
+        <w:t xml:space="preserve"> pasar.</w:t>
       </w:r>
     </w:p>
     <w:p>
@@ -374,13 +1158,689 @@
           <w:szCs w:val="28"/>
         </w:rPr>
       </w:pPr>
-      <w:r>
-        <w:rPr>
-          <w:rFonts w:ascii="Times New Roman" w:hAnsi="Times New Roman" w:cs="Times New Roman"/>
-          <w:sz w:val="28"/>
-          <w:szCs w:val="28"/>
-        </w:rPr>
-        <w:t>Dalam praktiknya, pengumpulan data terkait pergerakan harga kripto sering dilakukan secara manual melalui situs web penyedia informasi pasar. Metode ini kurang efisien karena memerlukan waktu yang cukup lama dan berpotensi menimbulkan kesalahan pencatatan. Selain itu, pembaruan data secara berkala menjadi sulit dilakukan apabila tidak menggunakan sistem otomatis.</w:t>
+      <w:proofErr w:type="spellStart"/>
+      <w:r>
+        <w:rPr>
+          <w:rFonts w:ascii="Times New Roman" w:hAnsi="Times New Roman" w:cs="Times New Roman"/>
+          <w:sz w:val="28"/>
+          <w:szCs w:val="28"/>
+        </w:rPr>
+        <w:t>Dalam</w:t>
+      </w:r>
+      <w:proofErr w:type="spellEnd"/>
+      <w:r>
+        <w:rPr>
+          <w:rFonts w:ascii="Times New Roman" w:hAnsi="Times New Roman" w:cs="Times New Roman"/>
+          <w:sz w:val="28"/>
+          <w:szCs w:val="28"/>
+        </w:rPr>
+        <w:t xml:space="preserve"> </w:t>
+      </w:r>
+      <w:proofErr w:type="spellStart"/>
+      <w:r>
+        <w:rPr>
+          <w:rFonts w:ascii="Times New Roman" w:hAnsi="Times New Roman" w:cs="Times New Roman"/>
+          <w:sz w:val="28"/>
+          <w:szCs w:val="28"/>
+        </w:rPr>
+        <w:t>praktiknya</w:t>
+      </w:r>
+      <w:proofErr w:type="spellEnd"/>
+      <w:r>
+        <w:rPr>
+          <w:rFonts w:ascii="Times New Roman" w:hAnsi="Times New Roman" w:cs="Times New Roman"/>
+          <w:sz w:val="28"/>
+          <w:szCs w:val="28"/>
+        </w:rPr>
+        <w:t xml:space="preserve">, </w:t>
+      </w:r>
+      <w:proofErr w:type="spellStart"/>
+      <w:r>
+        <w:rPr>
+          <w:rFonts w:ascii="Times New Roman" w:hAnsi="Times New Roman" w:cs="Times New Roman"/>
+          <w:sz w:val="28"/>
+          <w:szCs w:val="28"/>
+        </w:rPr>
+        <w:t>pengumpulan</w:t>
+      </w:r>
+      <w:proofErr w:type="spellEnd"/>
+      <w:r>
+        <w:rPr>
+          <w:rFonts w:ascii="Times New Roman" w:hAnsi="Times New Roman" w:cs="Times New Roman"/>
+          <w:sz w:val="28"/>
+          <w:szCs w:val="28"/>
+        </w:rPr>
+        <w:t xml:space="preserve"> data </w:t>
+      </w:r>
+      <w:proofErr w:type="spellStart"/>
+      <w:r>
+        <w:rPr>
+          <w:rFonts w:ascii="Times New Roman" w:hAnsi="Times New Roman" w:cs="Times New Roman"/>
+          <w:sz w:val="28"/>
+          <w:szCs w:val="28"/>
+        </w:rPr>
+        <w:t>terkait</w:t>
+      </w:r>
+      <w:proofErr w:type="spellEnd"/>
+      <w:r>
+        <w:rPr>
+          <w:rFonts w:ascii="Times New Roman" w:hAnsi="Times New Roman" w:cs="Times New Roman"/>
+          <w:sz w:val="28"/>
+          <w:szCs w:val="28"/>
+        </w:rPr>
+        <w:t xml:space="preserve"> </w:t>
+      </w:r>
+      <w:proofErr w:type="spellStart"/>
+      <w:r>
+        <w:rPr>
+          <w:rFonts w:ascii="Times New Roman" w:hAnsi="Times New Roman" w:cs="Times New Roman"/>
+          <w:sz w:val="28"/>
+          <w:szCs w:val="28"/>
+        </w:rPr>
+        <w:t>pergerakan</w:t>
+      </w:r>
+      <w:proofErr w:type="spellEnd"/>
+      <w:r>
+        <w:rPr>
+          <w:rFonts w:ascii="Times New Roman" w:hAnsi="Times New Roman" w:cs="Times New Roman"/>
+          <w:sz w:val="28"/>
+          <w:szCs w:val="28"/>
+        </w:rPr>
+        <w:t xml:space="preserve"> </w:t>
+      </w:r>
+      <w:proofErr w:type="spellStart"/>
+      <w:r>
+        <w:rPr>
+          <w:rFonts w:ascii="Times New Roman" w:hAnsi="Times New Roman" w:cs="Times New Roman"/>
+          <w:sz w:val="28"/>
+          <w:szCs w:val="28"/>
+        </w:rPr>
+        <w:t>harga</w:t>
+      </w:r>
+      <w:proofErr w:type="spellEnd"/>
+      <w:r>
+        <w:rPr>
+          <w:rFonts w:ascii="Times New Roman" w:hAnsi="Times New Roman" w:cs="Times New Roman"/>
+          <w:sz w:val="28"/>
+          <w:szCs w:val="28"/>
+        </w:rPr>
+        <w:t xml:space="preserve"> </w:t>
+      </w:r>
+      <w:proofErr w:type="spellStart"/>
+      <w:r>
+        <w:rPr>
+          <w:rFonts w:ascii="Times New Roman" w:hAnsi="Times New Roman" w:cs="Times New Roman"/>
+          <w:sz w:val="28"/>
+          <w:szCs w:val="28"/>
+        </w:rPr>
+        <w:t>kripto</w:t>
+      </w:r>
+      <w:proofErr w:type="spellEnd"/>
+      <w:r>
+        <w:rPr>
+          <w:rFonts w:ascii="Times New Roman" w:hAnsi="Times New Roman" w:cs="Times New Roman"/>
+          <w:sz w:val="28"/>
+          <w:szCs w:val="28"/>
+        </w:rPr>
+        <w:t xml:space="preserve"> </w:t>
+      </w:r>
+      <w:proofErr w:type="spellStart"/>
+      <w:r>
+        <w:rPr>
+          <w:rFonts w:ascii="Times New Roman" w:hAnsi="Times New Roman" w:cs="Times New Roman"/>
+          <w:sz w:val="28"/>
+          <w:szCs w:val="28"/>
+        </w:rPr>
+        <w:t>sering</w:t>
+      </w:r>
+      <w:proofErr w:type="spellEnd"/>
+      <w:r>
+        <w:rPr>
+          <w:rFonts w:ascii="Times New Roman" w:hAnsi="Times New Roman" w:cs="Times New Roman"/>
+          <w:sz w:val="28"/>
+          <w:szCs w:val="28"/>
+        </w:rPr>
+        <w:t xml:space="preserve"> </w:t>
+      </w:r>
+      <w:proofErr w:type="spellStart"/>
+      <w:r>
+        <w:rPr>
+          <w:rFonts w:ascii="Times New Roman" w:hAnsi="Times New Roman" w:cs="Times New Roman"/>
+          <w:sz w:val="28"/>
+          <w:szCs w:val="28"/>
+        </w:rPr>
+        <w:t>dilakukan</w:t>
+      </w:r>
+      <w:proofErr w:type="spellEnd"/>
+      <w:r>
+        <w:rPr>
+          <w:rFonts w:ascii="Times New Roman" w:hAnsi="Times New Roman" w:cs="Times New Roman"/>
+          <w:sz w:val="28"/>
+          <w:szCs w:val="28"/>
+        </w:rPr>
+        <w:t xml:space="preserve"> </w:t>
+      </w:r>
+      <w:proofErr w:type="spellStart"/>
+      <w:r>
+        <w:rPr>
+          <w:rFonts w:ascii="Times New Roman" w:hAnsi="Times New Roman" w:cs="Times New Roman"/>
+          <w:sz w:val="28"/>
+          <w:szCs w:val="28"/>
+        </w:rPr>
+        <w:t>secara</w:t>
+      </w:r>
+      <w:proofErr w:type="spellEnd"/>
+      <w:r>
+        <w:rPr>
+          <w:rFonts w:ascii="Times New Roman" w:hAnsi="Times New Roman" w:cs="Times New Roman"/>
+          <w:sz w:val="28"/>
+          <w:szCs w:val="28"/>
+        </w:rPr>
+        <w:t xml:space="preserve"> manual </w:t>
+      </w:r>
+      <w:proofErr w:type="spellStart"/>
+      <w:r>
+        <w:rPr>
+          <w:rFonts w:ascii="Times New Roman" w:hAnsi="Times New Roman" w:cs="Times New Roman"/>
+          <w:sz w:val="28"/>
+          <w:szCs w:val="28"/>
+        </w:rPr>
+        <w:t>melalui</w:t>
+      </w:r>
+      <w:proofErr w:type="spellEnd"/>
+      <w:r>
+        <w:rPr>
+          <w:rFonts w:ascii="Times New Roman" w:hAnsi="Times New Roman" w:cs="Times New Roman"/>
+          <w:sz w:val="28"/>
+          <w:szCs w:val="28"/>
+        </w:rPr>
+        <w:t xml:space="preserve"> situs web </w:t>
+      </w:r>
+      <w:proofErr w:type="spellStart"/>
+      <w:r>
+        <w:rPr>
+          <w:rFonts w:ascii="Times New Roman" w:hAnsi="Times New Roman" w:cs="Times New Roman"/>
+          <w:sz w:val="28"/>
+          <w:szCs w:val="28"/>
+        </w:rPr>
+        <w:t>penyedia</w:t>
+      </w:r>
+      <w:proofErr w:type="spellEnd"/>
+      <w:r>
+        <w:rPr>
+          <w:rFonts w:ascii="Times New Roman" w:hAnsi="Times New Roman" w:cs="Times New Roman"/>
+          <w:sz w:val="28"/>
+          <w:szCs w:val="28"/>
+        </w:rPr>
+        <w:t xml:space="preserve"> </w:t>
+      </w:r>
+      <w:proofErr w:type="spellStart"/>
+      <w:r>
+        <w:rPr>
+          <w:rFonts w:ascii="Times New Roman" w:hAnsi="Times New Roman" w:cs="Times New Roman"/>
+          <w:sz w:val="28"/>
+          <w:szCs w:val="28"/>
+        </w:rPr>
+        <w:t>informasi</w:t>
+      </w:r>
+      <w:proofErr w:type="spellEnd"/>
+      <w:r>
+        <w:rPr>
+          <w:rFonts w:ascii="Times New Roman" w:hAnsi="Times New Roman" w:cs="Times New Roman"/>
+          <w:sz w:val="28"/>
+          <w:szCs w:val="28"/>
+        </w:rPr>
+        <w:t xml:space="preserve"> pasar. </w:t>
+      </w:r>
+      <w:proofErr w:type="spellStart"/>
+      <w:r>
+        <w:rPr>
+          <w:rFonts w:ascii="Times New Roman" w:hAnsi="Times New Roman" w:cs="Times New Roman"/>
+          <w:sz w:val="28"/>
+          <w:szCs w:val="28"/>
+        </w:rPr>
+        <w:t>Metode</w:t>
+      </w:r>
+      <w:proofErr w:type="spellEnd"/>
+      <w:r>
+        <w:rPr>
+          <w:rFonts w:ascii="Times New Roman" w:hAnsi="Times New Roman" w:cs="Times New Roman"/>
+          <w:sz w:val="28"/>
+          <w:szCs w:val="28"/>
+        </w:rPr>
+        <w:t xml:space="preserve"> </w:t>
+      </w:r>
+      <w:proofErr w:type="spellStart"/>
+      <w:r>
+        <w:rPr>
+          <w:rFonts w:ascii="Times New Roman" w:hAnsi="Times New Roman" w:cs="Times New Roman"/>
+          <w:sz w:val="28"/>
+          <w:szCs w:val="28"/>
+        </w:rPr>
+        <w:t>ini</w:t>
+      </w:r>
+      <w:proofErr w:type="spellEnd"/>
+      <w:r>
+        <w:rPr>
+          <w:rFonts w:ascii="Times New Roman" w:hAnsi="Times New Roman" w:cs="Times New Roman"/>
+          <w:sz w:val="28"/>
+          <w:szCs w:val="28"/>
+        </w:rPr>
+        <w:t xml:space="preserve"> </w:t>
+      </w:r>
+      <w:proofErr w:type="spellStart"/>
+      <w:r>
+        <w:rPr>
+          <w:rFonts w:ascii="Times New Roman" w:hAnsi="Times New Roman" w:cs="Times New Roman"/>
+          <w:sz w:val="28"/>
+          <w:szCs w:val="28"/>
+        </w:rPr>
+        <w:t>kurang</w:t>
+      </w:r>
+      <w:proofErr w:type="spellEnd"/>
+      <w:r>
+        <w:rPr>
+          <w:rFonts w:ascii="Times New Roman" w:hAnsi="Times New Roman" w:cs="Times New Roman"/>
+          <w:sz w:val="28"/>
+          <w:szCs w:val="28"/>
+        </w:rPr>
+        <w:t xml:space="preserve"> </w:t>
+      </w:r>
+      <w:proofErr w:type="spellStart"/>
+      <w:r>
+        <w:rPr>
+          <w:rFonts w:ascii="Times New Roman" w:hAnsi="Times New Roman" w:cs="Times New Roman"/>
+          <w:sz w:val="28"/>
+          <w:szCs w:val="28"/>
+        </w:rPr>
+        <w:t>efisien</w:t>
+      </w:r>
+      <w:proofErr w:type="spellEnd"/>
+      <w:r>
+        <w:rPr>
+          <w:rFonts w:ascii="Times New Roman" w:hAnsi="Times New Roman" w:cs="Times New Roman"/>
+          <w:sz w:val="28"/>
+          <w:szCs w:val="28"/>
+        </w:rPr>
+        <w:t xml:space="preserve"> </w:t>
+      </w:r>
+      <w:proofErr w:type="spellStart"/>
+      <w:r>
+        <w:rPr>
+          <w:rFonts w:ascii="Times New Roman" w:hAnsi="Times New Roman" w:cs="Times New Roman"/>
+          <w:sz w:val="28"/>
+          <w:szCs w:val="28"/>
+        </w:rPr>
+        <w:t>karena</w:t>
+      </w:r>
+      <w:proofErr w:type="spellEnd"/>
+      <w:r>
+        <w:rPr>
+          <w:rFonts w:ascii="Times New Roman" w:hAnsi="Times New Roman" w:cs="Times New Roman"/>
+          <w:sz w:val="28"/>
+          <w:szCs w:val="28"/>
+        </w:rPr>
+        <w:t xml:space="preserve"> </w:t>
+      </w:r>
+      <w:proofErr w:type="spellStart"/>
+      <w:r>
+        <w:rPr>
+          <w:rFonts w:ascii="Times New Roman" w:hAnsi="Times New Roman" w:cs="Times New Roman"/>
+          <w:sz w:val="28"/>
+          <w:szCs w:val="28"/>
+        </w:rPr>
+        <w:t>memerlukan</w:t>
+      </w:r>
+      <w:proofErr w:type="spellEnd"/>
+      <w:r>
+        <w:rPr>
+          <w:rFonts w:ascii="Times New Roman" w:hAnsi="Times New Roman" w:cs="Times New Roman"/>
+          <w:sz w:val="28"/>
+          <w:szCs w:val="28"/>
+        </w:rPr>
+        <w:t xml:space="preserve"> </w:t>
+      </w:r>
+      <w:proofErr w:type="spellStart"/>
+      <w:r>
+        <w:rPr>
+          <w:rFonts w:ascii="Times New Roman" w:hAnsi="Times New Roman" w:cs="Times New Roman"/>
+          <w:sz w:val="28"/>
+          <w:szCs w:val="28"/>
+        </w:rPr>
+        <w:t>waktu</w:t>
+      </w:r>
+      <w:proofErr w:type="spellEnd"/>
+      <w:r>
+        <w:rPr>
+          <w:rFonts w:ascii="Times New Roman" w:hAnsi="Times New Roman" w:cs="Times New Roman"/>
+          <w:sz w:val="28"/>
+          <w:szCs w:val="28"/>
+        </w:rPr>
+        <w:t xml:space="preserve"> yang </w:t>
+      </w:r>
+      <w:proofErr w:type="spellStart"/>
+      <w:r>
+        <w:rPr>
+          <w:rFonts w:ascii="Times New Roman" w:hAnsi="Times New Roman" w:cs="Times New Roman"/>
+          <w:sz w:val="28"/>
+          <w:szCs w:val="28"/>
+        </w:rPr>
+        <w:t>cukup</w:t>
+      </w:r>
+      <w:proofErr w:type="spellEnd"/>
+      <w:r>
+        <w:rPr>
+          <w:rFonts w:ascii="Times New Roman" w:hAnsi="Times New Roman" w:cs="Times New Roman"/>
+          <w:sz w:val="28"/>
+          <w:szCs w:val="28"/>
+        </w:rPr>
+        <w:t xml:space="preserve"> lama dan </w:t>
+      </w:r>
+      <w:proofErr w:type="spellStart"/>
+      <w:r>
+        <w:rPr>
+          <w:rFonts w:ascii="Times New Roman" w:hAnsi="Times New Roman" w:cs="Times New Roman"/>
+          <w:sz w:val="28"/>
+          <w:szCs w:val="28"/>
+        </w:rPr>
+        <w:t>berpotensi</w:t>
+      </w:r>
+      <w:proofErr w:type="spellEnd"/>
+      <w:r>
+        <w:rPr>
+          <w:rFonts w:ascii="Times New Roman" w:hAnsi="Times New Roman" w:cs="Times New Roman"/>
+          <w:sz w:val="28"/>
+          <w:szCs w:val="28"/>
+        </w:rPr>
+        <w:t xml:space="preserve"> </w:t>
+      </w:r>
+      <w:proofErr w:type="spellStart"/>
+      <w:r>
+        <w:rPr>
+          <w:rFonts w:ascii="Times New Roman" w:hAnsi="Times New Roman" w:cs="Times New Roman"/>
+          <w:sz w:val="28"/>
+          <w:szCs w:val="28"/>
+        </w:rPr>
+        <w:t>menimbulkan</w:t>
+      </w:r>
+      <w:proofErr w:type="spellEnd"/>
+      <w:r>
+        <w:rPr>
+          <w:rFonts w:ascii="Times New Roman" w:hAnsi="Times New Roman" w:cs="Times New Roman"/>
+          <w:sz w:val="28"/>
+          <w:szCs w:val="28"/>
+        </w:rPr>
+        <w:t xml:space="preserve"> </w:t>
+      </w:r>
+      <w:proofErr w:type="spellStart"/>
+      <w:r>
+        <w:rPr>
+          <w:rFonts w:ascii="Times New Roman" w:hAnsi="Times New Roman" w:cs="Times New Roman"/>
+          <w:sz w:val="28"/>
+          <w:szCs w:val="28"/>
+        </w:rPr>
+        <w:t>kesalahan</w:t>
+      </w:r>
+      <w:proofErr w:type="spellEnd"/>
+      <w:r>
+        <w:rPr>
+          <w:rFonts w:ascii="Times New Roman" w:hAnsi="Times New Roman" w:cs="Times New Roman"/>
+          <w:sz w:val="28"/>
+          <w:szCs w:val="28"/>
+        </w:rPr>
+        <w:t xml:space="preserve"> </w:t>
+      </w:r>
+      <w:proofErr w:type="spellStart"/>
+      <w:r>
+        <w:rPr>
+          <w:rFonts w:ascii="Times New Roman" w:hAnsi="Times New Roman" w:cs="Times New Roman"/>
+          <w:sz w:val="28"/>
+          <w:szCs w:val="28"/>
+        </w:rPr>
+        <w:t>pencatatan</w:t>
+      </w:r>
+      <w:proofErr w:type="spellEnd"/>
+      <w:r>
+        <w:rPr>
+          <w:rFonts w:ascii="Times New Roman" w:hAnsi="Times New Roman" w:cs="Times New Roman"/>
+          <w:sz w:val="28"/>
+          <w:szCs w:val="28"/>
+        </w:rPr>
+        <w:t xml:space="preserve">. </w:t>
+      </w:r>
+      <w:proofErr w:type="spellStart"/>
+      <w:r>
+        <w:rPr>
+          <w:rFonts w:ascii="Times New Roman" w:hAnsi="Times New Roman" w:cs="Times New Roman"/>
+          <w:sz w:val="28"/>
+          <w:szCs w:val="28"/>
+        </w:rPr>
+        <w:t>Selain</w:t>
+      </w:r>
+      <w:proofErr w:type="spellEnd"/>
+      <w:r>
+        <w:rPr>
+          <w:rFonts w:ascii="Times New Roman" w:hAnsi="Times New Roman" w:cs="Times New Roman"/>
+          <w:sz w:val="28"/>
+          <w:szCs w:val="28"/>
+        </w:rPr>
+        <w:t xml:space="preserve"> </w:t>
+      </w:r>
+      <w:proofErr w:type="spellStart"/>
+      <w:r>
+        <w:rPr>
+          <w:rFonts w:ascii="Times New Roman" w:hAnsi="Times New Roman" w:cs="Times New Roman"/>
+          <w:sz w:val="28"/>
+          <w:szCs w:val="28"/>
+        </w:rPr>
+        <w:t>itu</w:t>
+      </w:r>
+      <w:proofErr w:type="spellEnd"/>
+      <w:r>
+        <w:rPr>
+          <w:rFonts w:ascii="Times New Roman" w:hAnsi="Times New Roman" w:cs="Times New Roman"/>
+          <w:sz w:val="28"/>
+          <w:szCs w:val="28"/>
+        </w:rPr>
+        <w:t xml:space="preserve">, </w:t>
+      </w:r>
+      <w:proofErr w:type="spellStart"/>
+      <w:r>
+        <w:rPr>
+          <w:rFonts w:ascii="Times New Roman" w:hAnsi="Times New Roman" w:cs="Times New Roman"/>
+          <w:sz w:val="28"/>
+          <w:szCs w:val="28"/>
+        </w:rPr>
+        <w:t>pembaruan</w:t>
+      </w:r>
+      <w:proofErr w:type="spellEnd"/>
+      <w:r>
+        <w:rPr>
+          <w:rFonts w:ascii="Times New Roman" w:hAnsi="Times New Roman" w:cs="Times New Roman"/>
+          <w:sz w:val="28"/>
+          <w:szCs w:val="28"/>
+        </w:rPr>
+        <w:t xml:space="preserve"> data </w:t>
+      </w:r>
+      <w:proofErr w:type="spellStart"/>
+      <w:r>
+        <w:rPr>
+          <w:rFonts w:ascii="Times New Roman" w:hAnsi="Times New Roman" w:cs="Times New Roman"/>
+          <w:sz w:val="28"/>
+          <w:szCs w:val="28"/>
+        </w:rPr>
+        <w:t>secara</w:t>
+      </w:r>
+      <w:proofErr w:type="spellEnd"/>
+      <w:r>
+        <w:rPr>
+          <w:rFonts w:ascii="Times New Roman" w:hAnsi="Times New Roman" w:cs="Times New Roman"/>
+          <w:sz w:val="28"/>
+          <w:szCs w:val="28"/>
+        </w:rPr>
+        <w:t xml:space="preserve"> </w:t>
+      </w:r>
+      <w:proofErr w:type="spellStart"/>
+      <w:r>
+        <w:rPr>
+          <w:rFonts w:ascii="Times New Roman" w:hAnsi="Times New Roman" w:cs="Times New Roman"/>
+          <w:sz w:val="28"/>
+          <w:szCs w:val="28"/>
+        </w:rPr>
+        <w:t>berkala</w:t>
+      </w:r>
+      <w:proofErr w:type="spellEnd"/>
+      <w:r>
+        <w:rPr>
+          <w:rFonts w:ascii="Times New Roman" w:hAnsi="Times New Roman" w:cs="Times New Roman"/>
+          <w:sz w:val="28"/>
+          <w:szCs w:val="28"/>
+        </w:rPr>
+        <w:t xml:space="preserve"> </w:t>
+      </w:r>
+      <w:proofErr w:type="spellStart"/>
+      <w:r>
+        <w:rPr>
+          <w:rFonts w:ascii="Times New Roman" w:hAnsi="Times New Roman" w:cs="Times New Roman"/>
+          <w:sz w:val="28"/>
+          <w:szCs w:val="28"/>
+        </w:rPr>
+        <w:t>menjadi</w:t>
+      </w:r>
+      <w:proofErr w:type="spellEnd"/>
+      <w:r>
+        <w:rPr>
+          <w:rFonts w:ascii="Times New Roman" w:hAnsi="Times New Roman" w:cs="Times New Roman"/>
+          <w:sz w:val="28"/>
+          <w:szCs w:val="28"/>
+        </w:rPr>
+        <w:t xml:space="preserve"> </w:t>
+      </w:r>
+      <w:proofErr w:type="spellStart"/>
+      <w:r>
+        <w:rPr>
+          <w:rFonts w:ascii="Times New Roman" w:hAnsi="Times New Roman" w:cs="Times New Roman"/>
+          <w:sz w:val="28"/>
+          <w:szCs w:val="28"/>
+        </w:rPr>
+        <w:t>sulit</w:t>
+      </w:r>
+      <w:proofErr w:type="spellEnd"/>
+      <w:r>
+        <w:rPr>
+          <w:rFonts w:ascii="Times New Roman" w:hAnsi="Times New Roman" w:cs="Times New Roman"/>
+          <w:sz w:val="28"/>
+          <w:szCs w:val="28"/>
+        </w:rPr>
+        <w:t xml:space="preserve"> </w:t>
+      </w:r>
+      <w:proofErr w:type="spellStart"/>
+      <w:r>
+        <w:rPr>
+          <w:rFonts w:ascii="Times New Roman" w:hAnsi="Times New Roman" w:cs="Times New Roman"/>
+          <w:sz w:val="28"/>
+          <w:szCs w:val="28"/>
+        </w:rPr>
+        <w:t>dilakukan</w:t>
+      </w:r>
+      <w:proofErr w:type="spellEnd"/>
+      <w:r>
+        <w:rPr>
+          <w:rFonts w:ascii="Times New Roman" w:hAnsi="Times New Roman" w:cs="Times New Roman"/>
+          <w:sz w:val="28"/>
+          <w:szCs w:val="28"/>
+        </w:rPr>
+        <w:t xml:space="preserve"> </w:t>
+      </w:r>
+      <w:proofErr w:type="spellStart"/>
+      <w:r>
+        <w:rPr>
+          <w:rFonts w:ascii="Times New Roman" w:hAnsi="Times New Roman" w:cs="Times New Roman"/>
+          <w:sz w:val="28"/>
+          <w:szCs w:val="28"/>
+        </w:rPr>
+        <w:t>apabila</w:t>
+      </w:r>
+      <w:proofErr w:type="spellEnd"/>
+      <w:r>
+        <w:rPr>
+          <w:rFonts w:ascii="Times New Roman" w:hAnsi="Times New Roman" w:cs="Times New Roman"/>
+          <w:sz w:val="28"/>
+          <w:szCs w:val="28"/>
+        </w:rPr>
+        <w:t xml:space="preserve"> </w:t>
+      </w:r>
+      <w:proofErr w:type="spellStart"/>
+      <w:r>
+        <w:rPr>
+          <w:rFonts w:ascii="Times New Roman" w:hAnsi="Times New Roman" w:cs="Times New Roman"/>
+          <w:sz w:val="28"/>
+          <w:szCs w:val="28"/>
+        </w:rPr>
+        <w:t>tidak</w:t>
+      </w:r>
+      <w:proofErr w:type="spellEnd"/>
+      <w:r>
+        <w:rPr>
+          <w:rFonts w:ascii="Times New Roman" w:hAnsi="Times New Roman" w:cs="Times New Roman"/>
+          <w:sz w:val="28"/>
+          <w:szCs w:val="28"/>
+        </w:rPr>
+        <w:t xml:space="preserve"> </w:t>
+      </w:r>
+      <w:proofErr w:type="spellStart"/>
+      <w:r>
+        <w:rPr>
+          <w:rFonts w:ascii="Times New Roman" w:hAnsi="Times New Roman" w:cs="Times New Roman"/>
+          <w:sz w:val="28"/>
+          <w:szCs w:val="28"/>
+        </w:rPr>
+        <w:t>menggunakan</w:t>
+      </w:r>
+      <w:proofErr w:type="spellEnd"/>
+      <w:r>
+        <w:rPr>
+          <w:rFonts w:ascii="Times New Roman" w:hAnsi="Times New Roman" w:cs="Times New Roman"/>
+          <w:sz w:val="28"/>
+          <w:szCs w:val="28"/>
+        </w:rPr>
+        <w:t xml:space="preserve"> </w:t>
+      </w:r>
+      <w:proofErr w:type="spellStart"/>
+      <w:r>
+        <w:rPr>
+          <w:rFonts w:ascii="Times New Roman" w:hAnsi="Times New Roman" w:cs="Times New Roman"/>
+          <w:sz w:val="28"/>
+          <w:szCs w:val="28"/>
+        </w:rPr>
+        <w:t>sistem</w:t>
+      </w:r>
+      <w:proofErr w:type="spellEnd"/>
+      <w:r>
+        <w:rPr>
+          <w:rFonts w:ascii="Times New Roman" w:hAnsi="Times New Roman" w:cs="Times New Roman"/>
+          <w:sz w:val="28"/>
+          <w:szCs w:val="28"/>
+        </w:rPr>
+        <w:t xml:space="preserve"> </w:t>
+      </w:r>
+      <w:proofErr w:type="spellStart"/>
+      <w:r>
+        <w:rPr>
+          <w:rFonts w:ascii="Times New Roman" w:hAnsi="Times New Roman" w:cs="Times New Roman"/>
+          <w:sz w:val="28"/>
+          <w:szCs w:val="28"/>
+        </w:rPr>
+        <w:t>otomatis</w:t>
+      </w:r>
+      <w:proofErr w:type="spellEnd"/>
+      <w:r>
+        <w:rPr>
+          <w:rFonts w:ascii="Times New Roman" w:hAnsi="Times New Roman" w:cs="Times New Roman"/>
+          <w:sz w:val="28"/>
+          <w:szCs w:val="28"/>
+        </w:rPr>
+        <w:t>.</w:t>
       </w:r>
     </w:p>
     <w:p>
@@ -397,13 +1857,545 @@
           <w:szCs w:val="28"/>
         </w:rPr>
       </w:pPr>
-      <w:r>
-        <w:rPr>
-          <w:rFonts w:ascii="Times New Roman" w:hAnsi="Times New Roman" w:cs="Times New Roman"/>
-          <w:sz w:val="28"/>
-          <w:szCs w:val="28"/>
-        </w:rPr>
-        <w:t>Untuk mengatasi permasalahan tersebut, diperlukan teknik otomatisasi pengambilan data menggunakan metode web scraping. Teknik ini memungkinkan proses ekstraksi data dari web dilakukan secara sistematis dan terstruktur. Data yang diperoleh kemudian dapat diproses lebih lanjut melalui tahap pembersihan (data cleaning) agar siap untuk dianalisis.</w:t>
+      <w:proofErr w:type="spellStart"/>
+      <w:r>
+        <w:rPr>
+          <w:rFonts w:ascii="Times New Roman" w:hAnsi="Times New Roman" w:cs="Times New Roman"/>
+          <w:sz w:val="28"/>
+          <w:szCs w:val="28"/>
+        </w:rPr>
+        <w:t>Untuk</w:t>
+      </w:r>
+      <w:proofErr w:type="spellEnd"/>
+      <w:r>
+        <w:rPr>
+          <w:rFonts w:ascii="Times New Roman" w:hAnsi="Times New Roman" w:cs="Times New Roman"/>
+          <w:sz w:val="28"/>
+          <w:szCs w:val="28"/>
+        </w:rPr>
+        <w:t xml:space="preserve"> </w:t>
+      </w:r>
+      <w:proofErr w:type="spellStart"/>
+      <w:r>
+        <w:rPr>
+          <w:rFonts w:ascii="Times New Roman" w:hAnsi="Times New Roman" w:cs="Times New Roman"/>
+          <w:sz w:val="28"/>
+          <w:szCs w:val="28"/>
+        </w:rPr>
+        <w:t>mengatasi</w:t>
+      </w:r>
+      <w:proofErr w:type="spellEnd"/>
+      <w:r>
+        <w:rPr>
+          <w:rFonts w:ascii="Times New Roman" w:hAnsi="Times New Roman" w:cs="Times New Roman"/>
+          <w:sz w:val="28"/>
+          <w:szCs w:val="28"/>
+        </w:rPr>
+        <w:t xml:space="preserve"> </w:t>
+      </w:r>
+      <w:proofErr w:type="spellStart"/>
+      <w:r>
+        <w:rPr>
+          <w:rFonts w:ascii="Times New Roman" w:hAnsi="Times New Roman" w:cs="Times New Roman"/>
+          <w:sz w:val="28"/>
+          <w:szCs w:val="28"/>
+        </w:rPr>
+        <w:t>permasalahan</w:t>
+      </w:r>
+      <w:proofErr w:type="spellEnd"/>
+      <w:r>
+        <w:rPr>
+          <w:rFonts w:ascii="Times New Roman" w:hAnsi="Times New Roman" w:cs="Times New Roman"/>
+          <w:sz w:val="28"/>
+          <w:szCs w:val="28"/>
+        </w:rPr>
+        <w:t xml:space="preserve"> </w:t>
+      </w:r>
+      <w:proofErr w:type="spellStart"/>
+      <w:r>
+        <w:rPr>
+          <w:rFonts w:ascii="Times New Roman" w:hAnsi="Times New Roman" w:cs="Times New Roman"/>
+          <w:sz w:val="28"/>
+          <w:szCs w:val="28"/>
+        </w:rPr>
+        <w:t>tersebut</w:t>
+      </w:r>
+      <w:proofErr w:type="spellEnd"/>
+      <w:r>
+        <w:rPr>
+          <w:rFonts w:ascii="Times New Roman" w:hAnsi="Times New Roman" w:cs="Times New Roman"/>
+          <w:sz w:val="28"/>
+          <w:szCs w:val="28"/>
+        </w:rPr>
+        <w:t xml:space="preserve">, </w:t>
+      </w:r>
+      <w:proofErr w:type="spellStart"/>
+      <w:r>
+        <w:rPr>
+          <w:rFonts w:ascii="Times New Roman" w:hAnsi="Times New Roman" w:cs="Times New Roman"/>
+          <w:sz w:val="28"/>
+          <w:szCs w:val="28"/>
+        </w:rPr>
+        <w:t>diperlukan</w:t>
+      </w:r>
+      <w:proofErr w:type="spellEnd"/>
+      <w:r>
+        <w:rPr>
+          <w:rFonts w:ascii="Times New Roman" w:hAnsi="Times New Roman" w:cs="Times New Roman"/>
+          <w:sz w:val="28"/>
+          <w:szCs w:val="28"/>
+        </w:rPr>
+        <w:t xml:space="preserve"> </w:t>
+      </w:r>
+      <w:proofErr w:type="spellStart"/>
+      <w:r>
+        <w:rPr>
+          <w:rFonts w:ascii="Times New Roman" w:hAnsi="Times New Roman" w:cs="Times New Roman"/>
+          <w:sz w:val="28"/>
+          <w:szCs w:val="28"/>
+        </w:rPr>
+        <w:t>teknik</w:t>
+      </w:r>
+      <w:proofErr w:type="spellEnd"/>
+      <w:r>
+        <w:rPr>
+          <w:rFonts w:ascii="Times New Roman" w:hAnsi="Times New Roman" w:cs="Times New Roman"/>
+          <w:sz w:val="28"/>
+          <w:szCs w:val="28"/>
+        </w:rPr>
+        <w:t xml:space="preserve"> </w:t>
+      </w:r>
+      <w:proofErr w:type="spellStart"/>
+      <w:r>
+        <w:rPr>
+          <w:rFonts w:ascii="Times New Roman" w:hAnsi="Times New Roman" w:cs="Times New Roman"/>
+          <w:sz w:val="28"/>
+          <w:szCs w:val="28"/>
+        </w:rPr>
+        <w:t>otomatisasi</w:t>
+      </w:r>
+      <w:proofErr w:type="spellEnd"/>
+      <w:r>
+        <w:rPr>
+          <w:rFonts w:ascii="Times New Roman" w:hAnsi="Times New Roman" w:cs="Times New Roman"/>
+          <w:sz w:val="28"/>
+          <w:szCs w:val="28"/>
+        </w:rPr>
+        <w:t xml:space="preserve"> </w:t>
+      </w:r>
+      <w:proofErr w:type="spellStart"/>
+      <w:r>
+        <w:rPr>
+          <w:rFonts w:ascii="Times New Roman" w:hAnsi="Times New Roman" w:cs="Times New Roman"/>
+          <w:sz w:val="28"/>
+          <w:szCs w:val="28"/>
+        </w:rPr>
+        <w:t>pengambilan</w:t>
+      </w:r>
+      <w:proofErr w:type="spellEnd"/>
+      <w:r>
+        <w:rPr>
+          <w:rFonts w:ascii="Times New Roman" w:hAnsi="Times New Roman" w:cs="Times New Roman"/>
+          <w:sz w:val="28"/>
+          <w:szCs w:val="28"/>
+        </w:rPr>
+        <w:t xml:space="preserve"> data </w:t>
+      </w:r>
+      <w:proofErr w:type="spellStart"/>
+      <w:r>
+        <w:rPr>
+          <w:rFonts w:ascii="Times New Roman" w:hAnsi="Times New Roman" w:cs="Times New Roman"/>
+          <w:sz w:val="28"/>
+          <w:szCs w:val="28"/>
+        </w:rPr>
+        <w:t>menggunakan</w:t>
+      </w:r>
+      <w:proofErr w:type="spellEnd"/>
+      <w:r>
+        <w:rPr>
+          <w:rFonts w:ascii="Times New Roman" w:hAnsi="Times New Roman" w:cs="Times New Roman"/>
+          <w:sz w:val="28"/>
+          <w:szCs w:val="28"/>
+        </w:rPr>
+        <w:t xml:space="preserve"> </w:t>
+      </w:r>
+      <w:proofErr w:type="spellStart"/>
+      <w:r>
+        <w:rPr>
+          <w:rFonts w:ascii="Times New Roman" w:hAnsi="Times New Roman" w:cs="Times New Roman"/>
+          <w:sz w:val="28"/>
+          <w:szCs w:val="28"/>
+        </w:rPr>
+        <w:t>metode</w:t>
+      </w:r>
+      <w:proofErr w:type="spellEnd"/>
+      <w:r>
+        <w:rPr>
+          <w:rFonts w:ascii="Times New Roman" w:hAnsi="Times New Roman" w:cs="Times New Roman"/>
+          <w:sz w:val="28"/>
+          <w:szCs w:val="28"/>
+        </w:rPr>
+        <w:t xml:space="preserve"> web scraping. Teknik </w:t>
+      </w:r>
+      <w:proofErr w:type="spellStart"/>
+      <w:r>
+        <w:rPr>
+          <w:rFonts w:ascii="Times New Roman" w:hAnsi="Times New Roman" w:cs="Times New Roman"/>
+          <w:sz w:val="28"/>
+          <w:szCs w:val="28"/>
+        </w:rPr>
+        <w:t>ini</w:t>
+      </w:r>
+      <w:proofErr w:type="spellEnd"/>
+      <w:r>
+        <w:rPr>
+          <w:rFonts w:ascii="Times New Roman" w:hAnsi="Times New Roman" w:cs="Times New Roman"/>
+          <w:sz w:val="28"/>
+          <w:szCs w:val="28"/>
+        </w:rPr>
+        <w:t xml:space="preserve"> </w:t>
+      </w:r>
+      <w:proofErr w:type="spellStart"/>
+      <w:r>
+        <w:rPr>
+          <w:rFonts w:ascii="Times New Roman" w:hAnsi="Times New Roman" w:cs="Times New Roman"/>
+          <w:sz w:val="28"/>
+          <w:szCs w:val="28"/>
+        </w:rPr>
+        <w:t>memungkinkan</w:t>
+      </w:r>
+      <w:proofErr w:type="spellEnd"/>
+      <w:r>
+        <w:rPr>
+          <w:rFonts w:ascii="Times New Roman" w:hAnsi="Times New Roman" w:cs="Times New Roman"/>
+          <w:sz w:val="28"/>
+          <w:szCs w:val="28"/>
+        </w:rPr>
+        <w:t xml:space="preserve"> proses </w:t>
+      </w:r>
+      <w:proofErr w:type="spellStart"/>
+      <w:r>
+        <w:rPr>
+          <w:rFonts w:ascii="Times New Roman" w:hAnsi="Times New Roman" w:cs="Times New Roman"/>
+          <w:sz w:val="28"/>
+          <w:szCs w:val="28"/>
+        </w:rPr>
+        <w:t>ekstraksi</w:t>
+      </w:r>
+      <w:proofErr w:type="spellEnd"/>
+      <w:r>
+        <w:rPr>
+          <w:rFonts w:ascii="Times New Roman" w:hAnsi="Times New Roman" w:cs="Times New Roman"/>
+          <w:sz w:val="28"/>
+          <w:szCs w:val="28"/>
+        </w:rPr>
+        <w:t xml:space="preserve"> data </w:t>
+      </w:r>
+      <w:proofErr w:type="spellStart"/>
+      <w:r>
+        <w:rPr>
+          <w:rFonts w:ascii="Times New Roman" w:hAnsi="Times New Roman" w:cs="Times New Roman"/>
+          <w:sz w:val="28"/>
+          <w:szCs w:val="28"/>
+        </w:rPr>
+        <w:t>dari</w:t>
+      </w:r>
+      <w:proofErr w:type="spellEnd"/>
+      <w:r>
+        <w:rPr>
+          <w:rFonts w:ascii="Times New Roman" w:hAnsi="Times New Roman" w:cs="Times New Roman"/>
+          <w:sz w:val="28"/>
+          <w:szCs w:val="28"/>
+        </w:rPr>
+        <w:t xml:space="preserve"> web </w:t>
+      </w:r>
+      <w:proofErr w:type="spellStart"/>
+      <w:r>
+        <w:rPr>
+          <w:rFonts w:ascii="Times New Roman" w:hAnsi="Times New Roman" w:cs="Times New Roman"/>
+          <w:sz w:val="28"/>
+          <w:szCs w:val="28"/>
+        </w:rPr>
+        <w:t>dilakukan</w:t>
+      </w:r>
+      <w:proofErr w:type="spellEnd"/>
+      <w:r>
+        <w:rPr>
+          <w:rFonts w:ascii="Times New Roman" w:hAnsi="Times New Roman" w:cs="Times New Roman"/>
+          <w:sz w:val="28"/>
+          <w:szCs w:val="28"/>
+        </w:rPr>
+        <w:t xml:space="preserve"> </w:t>
+      </w:r>
+      <w:proofErr w:type="spellStart"/>
+      <w:r>
+        <w:rPr>
+          <w:rFonts w:ascii="Times New Roman" w:hAnsi="Times New Roman" w:cs="Times New Roman"/>
+          <w:sz w:val="28"/>
+          <w:szCs w:val="28"/>
+        </w:rPr>
+        <w:t>secara</w:t>
+      </w:r>
+      <w:proofErr w:type="spellEnd"/>
+      <w:r>
+        <w:rPr>
+          <w:rFonts w:ascii="Times New Roman" w:hAnsi="Times New Roman" w:cs="Times New Roman"/>
+          <w:sz w:val="28"/>
+          <w:szCs w:val="28"/>
+        </w:rPr>
+        <w:t xml:space="preserve"> </w:t>
+      </w:r>
+      <w:proofErr w:type="spellStart"/>
+      <w:r>
+        <w:rPr>
+          <w:rFonts w:ascii="Times New Roman" w:hAnsi="Times New Roman" w:cs="Times New Roman"/>
+          <w:sz w:val="28"/>
+          <w:szCs w:val="28"/>
+        </w:rPr>
+        <w:t>sistematis</w:t>
+      </w:r>
+      <w:proofErr w:type="spellEnd"/>
+      <w:r>
+        <w:rPr>
+          <w:rFonts w:ascii="Times New Roman" w:hAnsi="Times New Roman" w:cs="Times New Roman"/>
+          <w:sz w:val="28"/>
+          <w:szCs w:val="28"/>
+        </w:rPr>
+        <w:t xml:space="preserve"> dan </w:t>
+      </w:r>
+      <w:proofErr w:type="spellStart"/>
+      <w:r>
+        <w:rPr>
+          <w:rFonts w:ascii="Times New Roman" w:hAnsi="Times New Roman" w:cs="Times New Roman"/>
+          <w:sz w:val="28"/>
+          <w:szCs w:val="28"/>
+        </w:rPr>
+        <w:t>terstruktur</w:t>
+      </w:r>
+      <w:proofErr w:type="spellEnd"/>
+      <w:r>
+        <w:rPr>
+          <w:rFonts w:ascii="Times New Roman" w:hAnsi="Times New Roman" w:cs="Times New Roman"/>
+          <w:sz w:val="28"/>
+          <w:szCs w:val="28"/>
+        </w:rPr>
+        <w:t xml:space="preserve">. Data yang </w:t>
+      </w:r>
+      <w:proofErr w:type="spellStart"/>
+      <w:r>
+        <w:rPr>
+          <w:rFonts w:ascii="Times New Roman" w:hAnsi="Times New Roman" w:cs="Times New Roman"/>
+          <w:sz w:val="28"/>
+          <w:szCs w:val="28"/>
+        </w:rPr>
+        <w:t>diperoleh</w:t>
+      </w:r>
+      <w:proofErr w:type="spellEnd"/>
+      <w:r>
+        <w:rPr>
+          <w:rFonts w:ascii="Times New Roman" w:hAnsi="Times New Roman" w:cs="Times New Roman"/>
+          <w:sz w:val="28"/>
+          <w:szCs w:val="28"/>
+        </w:rPr>
+        <w:t xml:space="preserve"> </w:t>
+      </w:r>
+      <w:proofErr w:type="spellStart"/>
+      <w:r>
+        <w:rPr>
+          <w:rFonts w:ascii="Times New Roman" w:hAnsi="Times New Roman" w:cs="Times New Roman"/>
+          <w:sz w:val="28"/>
+          <w:szCs w:val="28"/>
+        </w:rPr>
+        <w:t>kemudian</w:t>
+      </w:r>
+      <w:proofErr w:type="spellEnd"/>
+      <w:r>
+        <w:rPr>
+          <w:rFonts w:ascii="Times New Roman" w:hAnsi="Times New Roman" w:cs="Times New Roman"/>
+          <w:sz w:val="28"/>
+          <w:szCs w:val="28"/>
+        </w:rPr>
+        <w:t xml:space="preserve"> </w:t>
+      </w:r>
+      <w:proofErr w:type="spellStart"/>
+      <w:r>
+        <w:rPr>
+          <w:rFonts w:ascii="Times New Roman" w:hAnsi="Times New Roman" w:cs="Times New Roman"/>
+          <w:sz w:val="28"/>
+          <w:szCs w:val="28"/>
+        </w:rPr>
+        <w:t>dapat</w:t>
+      </w:r>
+      <w:proofErr w:type="spellEnd"/>
+      <w:r>
+        <w:rPr>
+          <w:rFonts w:ascii="Times New Roman" w:hAnsi="Times New Roman" w:cs="Times New Roman"/>
+          <w:sz w:val="28"/>
+          <w:szCs w:val="28"/>
+        </w:rPr>
+        <w:t xml:space="preserve"> </w:t>
+      </w:r>
+      <w:proofErr w:type="spellStart"/>
+      <w:r>
+        <w:rPr>
+          <w:rFonts w:ascii="Times New Roman" w:hAnsi="Times New Roman" w:cs="Times New Roman"/>
+          <w:sz w:val="28"/>
+          <w:szCs w:val="28"/>
+        </w:rPr>
+        <w:t>diproses</w:t>
+      </w:r>
+      <w:proofErr w:type="spellEnd"/>
+      <w:r>
+        <w:rPr>
+          <w:rFonts w:ascii="Times New Roman" w:hAnsi="Times New Roman" w:cs="Times New Roman"/>
+          <w:sz w:val="28"/>
+          <w:szCs w:val="28"/>
+        </w:rPr>
+        <w:t xml:space="preserve"> </w:t>
+      </w:r>
+      <w:proofErr w:type="spellStart"/>
+      <w:r>
+        <w:rPr>
+          <w:rFonts w:ascii="Times New Roman" w:hAnsi="Times New Roman" w:cs="Times New Roman"/>
+          <w:sz w:val="28"/>
+          <w:szCs w:val="28"/>
+        </w:rPr>
+        <w:t>lebih</w:t>
+      </w:r>
+      <w:proofErr w:type="spellEnd"/>
+      <w:r>
+        <w:rPr>
+          <w:rFonts w:ascii="Times New Roman" w:hAnsi="Times New Roman" w:cs="Times New Roman"/>
+          <w:sz w:val="28"/>
+          <w:szCs w:val="28"/>
+        </w:rPr>
+        <w:t xml:space="preserve"> </w:t>
+      </w:r>
+      <w:proofErr w:type="spellStart"/>
+      <w:r>
+        <w:rPr>
+          <w:rFonts w:ascii="Times New Roman" w:hAnsi="Times New Roman" w:cs="Times New Roman"/>
+          <w:sz w:val="28"/>
+          <w:szCs w:val="28"/>
+        </w:rPr>
+        <w:t>lanjut</w:t>
+      </w:r>
+      <w:proofErr w:type="spellEnd"/>
+      <w:r>
+        <w:rPr>
+          <w:rFonts w:ascii="Times New Roman" w:hAnsi="Times New Roman" w:cs="Times New Roman"/>
+          <w:sz w:val="28"/>
+          <w:szCs w:val="28"/>
+        </w:rPr>
+        <w:t xml:space="preserve"> </w:t>
+      </w:r>
+      <w:proofErr w:type="spellStart"/>
+      <w:r>
+        <w:rPr>
+          <w:rFonts w:ascii="Times New Roman" w:hAnsi="Times New Roman" w:cs="Times New Roman"/>
+          <w:sz w:val="28"/>
+          <w:szCs w:val="28"/>
+        </w:rPr>
+        <w:t>melalui</w:t>
+      </w:r>
+      <w:proofErr w:type="spellEnd"/>
+      <w:r>
+        <w:rPr>
+          <w:rFonts w:ascii="Times New Roman" w:hAnsi="Times New Roman" w:cs="Times New Roman"/>
+          <w:sz w:val="28"/>
+          <w:szCs w:val="28"/>
+        </w:rPr>
+        <w:t xml:space="preserve"> </w:t>
+      </w:r>
+      <w:proofErr w:type="spellStart"/>
+      <w:r>
+        <w:rPr>
+          <w:rFonts w:ascii="Times New Roman" w:hAnsi="Times New Roman" w:cs="Times New Roman"/>
+          <w:sz w:val="28"/>
+          <w:szCs w:val="28"/>
+        </w:rPr>
+        <w:t>tahap</w:t>
+      </w:r>
+      <w:proofErr w:type="spellEnd"/>
+      <w:r>
+        <w:rPr>
+          <w:rFonts w:ascii="Times New Roman" w:hAnsi="Times New Roman" w:cs="Times New Roman"/>
+          <w:sz w:val="28"/>
+          <w:szCs w:val="28"/>
+        </w:rPr>
+        <w:t xml:space="preserve"> </w:t>
+      </w:r>
+      <w:proofErr w:type="spellStart"/>
+      <w:r>
+        <w:rPr>
+          <w:rFonts w:ascii="Times New Roman" w:hAnsi="Times New Roman" w:cs="Times New Roman"/>
+          <w:sz w:val="28"/>
+          <w:szCs w:val="28"/>
+        </w:rPr>
+        <w:t>pembersihan</w:t>
+      </w:r>
+      <w:proofErr w:type="spellEnd"/>
+      <w:r>
+        <w:rPr>
+          <w:rFonts w:ascii="Times New Roman" w:hAnsi="Times New Roman" w:cs="Times New Roman"/>
+          <w:sz w:val="28"/>
+          <w:szCs w:val="28"/>
+        </w:rPr>
+        <w:t xml:space="preserve"> (data cleaning) agar </w:t>
+      </w:r>
+      <w:proofErr w:type="spellStart"/>
+      <w:r>
+        <w:rPr>
+          <w:rFonts w:ascii="Times New Roman" w:hAnsi="Times New Roman" w:cs="Times New Roman"/>
+          <w:sz w:val="28"/>
+          <w:szCs w:val="28"/>
+        </w:rPr>
+        <w:t>siap</w:t>
+      </w:r>
+      <w:proofErr w:type="spellEnd"/>
+      <w:r>
+        <w:rPr>
+          <w:rFonts w:ascii="Times New Roman" w:hAnsi="Times New Roman" w:cs="Times New Roman"/>
+          <w:sz w:val="28"/>
+          <w:szCs w:val="28"/>
+        </w:rPr>
+        <w:t xml:space="preserve"> </w:t>
+      </w:r>
+      <w:proofErr w:type="spellStart"/>
+      <w:r>
+        <w:rPr>
+          <w:rFonts w:ascii="Times New Roman" w:hAnsi="Times New Roman" w:cs="Times New Roman"/>
+          <w:sz w:val="28"/>
+          <w:szCs w:val="28"/>
+        </w:rPr>
+        <w:t>untuk</w:t>
+      </w:r>
+      <w:proofErr w:type="spellEnd"/>
+      <w:r>
+        <w:rPr>
+          <w:rFonts w:ascii="Times New Roman" w:hAnsi="Times New Roman" w:cs="Times New Roman"/>
+          <w:sz w:val="28"/>
+          <w:szCs w:val="28"/>
+        </w:rPr>
+        <w:t xml:space="preserve"> </w:t>
+      </w:r>
+      <w:proofErr w:type="spellStart"/>
+      <w:r>
+        <w:rPr>
+          <w:rFonts w:ascii="Times New Roman" w:hAnsi="Times New Roman" w:cs="Times New Roman"/>
+          <w:sz w:val="28"/>
+          <w:szCs w:val="28"/>
+        </w:rPr>
+        <w:t>dianalisis</w:t>
+      </w:r>
+      <w:proofErr w:type="spellEnd"/>
+      <w:r>
+        <w:rPr>
+          <w:rFonts w:ascii="Times New Roman" w:hAnsi="Times New Roman" w:cs="Times New Roman"/>
+          <w:sz w:val="28"/>
+          <w:szCs w:val="28"/>
+        </w:rPr>
+        <w:t>.</w:t>
       </w:r>
     </w:p>
     <w:p>
@@ -420,13 +2412,545 @@
           <w:szCs w:val="28"/>
         </w:rPr>
       </w:pPr>
-      <w:r>
-        <w:rPr>
-          <w:rFonts w:ascii="Times New Roman" w:hAnsi="Times New Roman" w:cs="Times New Roman"/>
-          <w:sz w:val="28"/>
-          <w:szCs w:val="28"/>
-        </w:rPr>
-        <w:t>Berdasarkan hal tersebut, praktikum ini bertujuan untuk mengimplementasikan tahapan pemrosesan data mulai dari ekstraksi data, pembersihan, hingga visualisasi informasi. Dengan demikian, diharapkan dapat diperoleh gambaran yang lebih cepat, akurat, dan informatif mengenai kondisi pasar cryptocurrency terkini.</w:t>
+      <w:proofErr w:type="spellStart"/>
+      <w:r>
+        <w:rPr>
+          <w:rFonts w:ascii="Times New Roman" w:hAnsi="Times New Roman" w:cs="Times New Roman"/>
+          <w:sz w:val="28"/>
+          <w:szCs w:val="28"/>
+        </w:rPr>
+        <w:t>Berdasarkan</w:t>
+      </w:r>
+      <w:proofErr w:type="spellEnd"/>
+      <w:r>
+        <w:rPr>
+          <w:rFonts w:ascii="Times New Roman" w:hAnsi="Times New Roman" w:cs="Times New Roman"/>
+          <w:sz w:val="28"/>
+          <w:szCs w:val="28"/>
+        </w:rPr>
+        <w:t xml:space="preserve"> </w:t>
+      </w:r>
+      <w:proofErr w:type="spellStart"/>
+      <w:r>
+        <w:rPr>
+          <w:rFonts w:ascii="Times New Roman" w:hAnsi="Times New Roman" w:cs="Times New Roman"/>
+          <w:sz w:val="28"/>
+          <w:szCs w:val="28"/>
+        </w:rPr>
+        <w:t>hal</w:t>
+      </w:r>
+      <w:proofErr w:type="spellEnd"/>
+      <w:r>
+        <w:rPr>
+          <w:rFonts w:ascii="Times New Roman" w:hAnsi="Times New Roman" w:cs="Times New Roman"/>
+          <w:sz w:val="28"/>
+          <w:szCs w:val="28"/>
+        </w:rPr>
+        <w:t xml:space="preserve"> </w:t>
+      </w:r>
+      <w:proofErr w:type="spellStart"/>
+      <w:r>
+        <w:rPr>
+          <w:rFonts w:ascii="Times New Roman" w:hAnsi="Times New Roman" w:cs="Times New Roman"/>
+          <w:sz w:val="28"/>
+          <w:szCs w:val="28"/>
+        </w:rPr>
+        <w:t>tersebut</w:t>
+      </w:r>
+      <w:proofErr w:type="spellEnd"/>
+      <w:r>
+        <w:rPr>
+          <w:rFonts w:ascii="Times New Roman" w:hAnsi="Times New Roman" w:cs="Times New Roman"/>
+          <w:sz w:val="28"/>
+          <w:szCs w:val="28"/>
+        </w:rPr>
+        <w:t xml:space="preserve">, </w:t>
+      </w:r>
+      <w:proofErr w:type="spellStart"/>
+      <w:r>
+        <w:rPr>
+          <w:rFonts w:ascii="Times New Roman" w:hAnsi="Times New Roman" w:cs="Times New Roman"/>
+          <w:sz w:val="28"/>
+          <w:szCs w:val="28"/>
+        </w:rPr>
+        <w:t>praktikum</w:t>
+      </w:r>
+      <w:proofErr w:type="spellEnd"/>
+      <w:r>
+        <w:rPr>
+          <w:rFonts w:ascii="Times New Roman" w:hAnsi="Times New Roman" w:cs="Times New Roman"/>
+          <w:sz w:val="28"/>
+          <w:szCs w:val="28"/>
+        </w:rPr>
+        <w:t xml:space="preserve"> </w:t>
+      </w:r>
+      <w:proofErr w:type="spellStart"/>
+      <w:r>
+        <w:rPr>
+          <w:rFonts w:ascii="Times New Roman" w:hAnsi="Times New Roman" w:cs="Times New Roman"/>
+          <w:sz w:val="28"/>
+          <w:szCs w:val="28"/>
+        </w:rPr>
+        <w:t>ini</w:t>
+      </w:r>
+      <w:proofErr w:type="spellEnd"/>
+      <w:r>
+        <w:rPr>
+          <w:rFonts w:ascii="Times New Roman" w:hAnsi="Times New Roman" w:cs="Times New Roman"/>
+          <w:sz w:val="28"/>
+          <w:szCs w:val="28"/>
+        </w:rPr>
+        <w:t xml:space="preserve"> </w:t>
+      </w:r>
+      <w:proofErr w:type="spellStart"/>
+      <w:r>
+        <w:rPr>
+          <w:rFonts w:ascii="Times New Roman" w:hAnsi="Times New Roman" w:cs="Times New Roman"/>
+          <w:sz w:val="28"/>
+          <w:szCs w:val="28"/>
+        </w:rPr>
+        <w:t>bertujuan</w:t>
+      </w:r>
+      <w:proofErr w:type="spellEnd"/>
+      <w:r>
+        <w:rPr>
+          <w:rFonts w:ascii="Times New Roman" w:hAnsi="Times New Roman" w:cs="Times New Roman"/>
+          <w:sz w:val="28"/>
+          <w:szCs w:val="28"/>
+        </w:rPr>
+        <w:t xml:space="preserve"> </w:t>
+      </w:r>
+      <w:proofErr w:type="spellStart"/>
+      <w:r>
+        <w:rPr>
+          <w:rFonts w:ascii="Times New Roman" w:hAnsi="Times New Roman" w:cs="Times New Roman"/>
+          <w:sz w:val="28"/>
+          <w:szCs w:val="28"/>
+        </w:rPr>
+        <w:t>untuk</w:t>
+      </w:r>
+      <w:proofErr w:type="spellEnd"/>
+      <w:r>
+        <w:rPr>
+          <w:rFonts w:ascii="Times New Roman" w:hAnsi="Times New Roman" w:cs="Times New Roman"/>
+          <w:sz w:val="28"/>
+          <w:szCs w:val="28"/>
+        </w:rPr>
+        <w:t xml:space="preserve"> </w:t>
+      </w:r>
+      <w:proofErr w:type="spellStart"/>
+      <w:r>
+        <w:rPr>
+          <w:rFonts w:ascii="Times New Roman" w:hAnsi="Times New Roman" w:cs="Times New Roman"/>
+          <w:sz w:val="28"/>
+          <w:szCs w:val="28"/>
+        </w:rPr>
+        <w:t>mengimplementasikan</w:t>
+      </w:r>
+      <w:proofErr w:type="spellEnd"/>
+      <w:r>
+        <w:rPr>
+          <w:rFonts w:ascii="Times New Roman" w:hAnsi="Times New Roman" w:cs="Times New Roman"/>
+          <w:sz w:val="28"/>
+          <w:szCs w:val="28"/>
+        </w:rPr>
+        <w:t xml:space="preserve"> </w:t>
+      </w:r>
+      <w:proofErr w:type="spellStart"/>
+      <w:r>
+        <w:rPr>
+          <w:rFonts w:ascii="Times New Roman" w:hAnsi="Times New Roman" w:cs="Times New Roman"/>
+          <w:sz w:val="28"/>
+          <w:szCs w:val="28"/>
+        </w:rPr>
+        <w:t>tahapan</w:t>
+      </w:r>
+      <w:proofErr w:type="spellEnd"/>
+      <w:r>
+        <w:rPr>
+          <w:rFonts w:ascii="Times New Roman" w:hAnsi="Times New Roman" w:cs="Times New Roman"/>
+          <w:sz w:val="28"/>
+          <w:szCs w:val="28"/>
+        </w:rPr>
+        <w:t xml:space="preserve"> </w:t>
+      </w:r>
+      <w:proofErr w:type="spellStart"/>
+      <w:r>
+        <w:rPr>
+          <w:rFonts w:ascii="Times New Roman" w:hAnsi="Times New Roman" w:cs="Times New Roman"/>
+          <w:sz w:val="28"/>
+          <w:szCs w:val="28"/>
+        </w:rPr>
+        <w:t>pemrosesan</w:t>
+      </w:r>
+      <w:proofErr w:type="spellEnd"/>
+      <w:r>
+        <w:rPr>
+          <w:rFonts w:ascii="Times New Roman" w:hAnsi="Times New Roman" w:cs="Times New Roman"/>
+          <w:sz w:val="28"/>
+          <w:szCs w:val="28"/>
+        </w:rPr>
+        <w:t xml:space="preserve"> data </w:t>
+      </w:r>
+      <w:proofErr w:type="spellStart"/>
+      <w:r>
+        <w:rPr>
+          <w:rFonts w:ascii="Times New Roman" w:hAnsi="Times New Roman" w:cs="Times New Roman"/>
+          <w:sz w:val="28"/>
+          <w:szCs w:val="28"/>
+        </w:rPr>
+        <w:t>mulai</w:t>
+      </w:r>
+      <w:proofErr w:type="spellEnd"/>
+      <w:r>
+        <w:rPr>
+          <w:rFonts w:ascii="Times New Roman" w:hAnsi="Times New Roman" w:cs="Times New Roman"/>
+          <w:sz w:val="28"/>
+          <w:szCs w:val="28"/>
+        </w:rPr>
+        <w:t xml:space="preserve"> </w:t>
+      </w:r>
+      <w:proofErr w:type="spellStart"/>
+      <w:r>
+        <w:rPr>
+          <w:rFonts w:ascii="Times New Roman" w:hAnsi="Times New Roman" w:cs="Times New Roman"/>
+          <w:sz w:val="28"/>
+          <w:szCs w:val="28"/>
+        </w:rPr>
+        <w:t>dari</w:t>
+      </w:r>
+      <w:proofErr w:type="spellEnd"/>
+      <w:r>
+        <w:rPr>
+          <w:rFonts w:ascii="Times New Roman" w:hAnsi="Times New Roman" w:cs="Times New Roman"/>
+          <w:sz w:val="28"/>
+          <w:szCs w:val="28"/>
+        </w:rPr>
+        <w:t xml:space="preserve"> </w:t>
+      </w:r>
+      <w:proofErr w:type="spellStart"/>
+      <w:r>
+        <w:rPr>
+          <w:rFonts w:ascii="Times New Roman" w:hAnsi="Times New Roman" w:cs="Times New Roman"/>
+          <w:sz w:val="28"/>
+          <w:szCs w:val="28"/>
+        </w:rPr>
+        <w:t>ekstraksi</w:t>
+      </w:r>
+      <w:proofErr w:type="spellEnd"/>
+      <w:r>
+        <w:rPr>
+          <w:rFonts w:ascii="Times New Roman" w:hAnsi="Times New Roman" w:cs="Times New Roman"/>
+          <w:sz w:val="28"/>
+          <w:szCs w:val="28"/>
+        </w:rPr>
+        <w:t xml:space="preserve"> data, </w:t>
+      </w:r>
+      <w:proofErr w:type="spellStart"/>
+      <w:r>
+        <w:rPr>
+          <w:rFonts w:ascii="Times New Roman" w:hAnsi="Times New Roman" w:cs="Times New Roman"/>
+          <w:sz w:val="28"/>
+          <w:szCs w:val="28"/>
+        </w:rPr>
+        <w:t>pembersihan</w:t>
+      </w:r>
+      <w:proofErr w:type="spellEnd"/>
+      <w:r>
+        <w:rPr>
+          <w:rFonts w:ascii="Times New Roman" w:hAnsi="Times New Roman" w:cs="Times New Roman"/>
+          <w:sz w:val="28"/>
+          <w:szCs w:val="28"/>
+        </w:rPr>
+        <w:t xml:space="preserve">, </w:t>
+      </w:r>
+      <w:proofErr w:type="spellStart"/>
+      <w:r>
+        <w:rPr>
+          <w:rFonts w:ascii="Times New Roman" w:hAnsi="Times New Roman" w:cs="Times New Roman"/>
+          <w:sz w:val="28"/>
+          <w:szCs w:val="28"/>
+        </w:rPr>
+        <w:t>hingga</w:t>
+      </w:r>
+      <w:proofErr w:type="spellEnd"/>
+      <w:r>
+        <w:rPr>
+          <w:rFonts w:ascii="Times New Roman" w:hAnsi="Times New Roman" w:cs="Times New Roman"/>
+          <w:sz w:val="28"/>
+          <w:szCs w:val="28"/>
+        </w:rPr>
+        <w:t xml:space="preserve"> </w:t>
+      </w:r>
+      <w:proofErr w:type="spellStart"/>
+      <w:r>
+        <w:rPr>
+          <w:rFonts w:ascii="Times New Roman" w:hAnsi="Times New Roman" w:cs="Times New Roman"/>
+          <w:sz w:val="28"/>
+          <w:szCs w:val="28"/>
+        </w:rPr>
+        <w:t>visualisasi</w:t>
+      </w:r>
+      <w:proofErr w:type="spellEnd"/>
+      <w:r>
+        <w:rPr>
+          <w:rFonts w:ascii="Times New Roman" w:hAnsi="Times New Roman" w:cs="Times New Roman"/>
+          <w:sz w:val="28"/>
+          <w:szCs w:val="28"/>
+        </w:rPr>
+        <w:t xml:space="preserve"> </w:t>
+      </w:r>
+      <w:proofErr w:type="spellStart"/>
+      <w:r>
+        <w:rPr>
+          <w:rFonts w:ascii="Times New Roman" w:hAnsi="Times New Roman" w:cs="Times New Roman"/>
+          <w:sz w:val="28"/>
+          <w:szCs w:val="28"/>
+        </w:rPr>
+        <w:t>informasi</w:t>
+      </w:r>
+      <w:proofErr w:type="spellEnd"/>
+      <w:r>
+        <w:rPr>
+          <w:rFonts w:ascii="Times New Roman" w:hAnsi="Times New Roman" w:cs="Times New Roman"/>
+          <w:sz w:val="28"/>
+          <w:szCs w:val="28"/>
+        </w:rPr>
+        <w:t xml:space="preserve">. </w:t>
+      </w:r>
+      <w:proofErr w:type="spellStart"/>
+      <w:r>
+        <w:rPr>
+          <w:rFonts w:ascii="Times New Roman" w:hAnsi="Times New Roman" w:cs="Times New Roman"/>
+          <w:sz w:val="28"/>
+          <w:szCs w:val="28"/>
+        </w:rPr>
+        <w:t>Dengan</w:t>
+      </w:r>
+      <w:proofErr w:type="spellEnd"/>
+      <w:r>
+        <w:rPr>
+          <w:rFonts w:ascii="Times New Roman" w:hAnsi="Times New Roman" w:cs="Times New Roman"/>
+          <w:sz w:val="28"/>
+          <w:szCs w:val="28"/>
+        </w:rPr>
+        <w:t xml:space="preserve"> </w:t>
+      </w:r>
+      <w:proofErr w:type="spellStart"/>
+      <w:r>
+        <w:rPr>
+          <w:rFonts w:ascii="Times New Roman" w:hAnsi="Times New Roman" w:cs="Times New Roman"/>
+          <w:sz w:val="28"/>
+          <w:szCs w:val="28"/>
+        </w:rPr>
+        <w:t>demikian</w:t>
+      </w:r>
+      <w:proofErr w:type="spellEnd"/>
+      <w:r>
+        <w:rPr>
+          <w:rFonts w:ascii="Times New Roman" w:hAnsi="Times New Roman" w:cs="Times New Roman"/>
+          <w:sz w:val="28"/>
+          <w:szCs w:val="28"/>
+        </w:rPr>
+        <w:t xml:space="preserve">, </w:t>
+      </w:r>
+      <w:proofErr w:type="spellStart"/>
+      <w:r>
+        <w:rPr>
+          <w:rFonts w:ascii="Times New Roman" w:hAnsi="Times New Roman" w:cs="Times New Roman"/>
+          <w:sz w:val="28"/>
+          <w:szCs w:val="28"/>
+        </w:rPr>
+        <w:t>diharapkan</w:t>
+      </w:r>
+      <w:proofErr w:type="spellEnd"/>
+      <w:r>
+        <w:rPr>
+          <w:rFonts w:ascii="Times New Roman" w:hAnsi="Times New Roman" w:cs="Times New Roman"/>
+          <w:sz w:val="28"/>
+          <w:szCs w:val="28"/>
+        </w:rPr>
+        <w:t xml:space="preserve"> </w:t>
+      </w:r>
+      <w:proofErr w:type="spellStart"/>
+      <w:r>
+        <w:rPr>
+          <w:rFonts w:ascii="Times New Roman" w:hAnsi="Times New Roman" w:cs="Times New Roman"/>
+          <w:sz w:val="28"/>
+          <w:szCs w:val="28"/>
+        </w:rPr>
+        <w:t>dapat</w:t>
+      </w:r>
+      <w:proofErr w:type="spellEnd"/>
+      <w:r>
+        <w:rPr>
+          <w:rFonts w:ascii="Times New Roman" w:hAnsi="Times New Roman" w:cs="Times New Roman"/>
+          <w:sz w:val="28"/>
+          <w:szCs w:val="28"/>
+        </w:rPr>
+        <w:t xml:space="preserve"> </w:t>
+      </w:r>
+      <w:proofErr w:type="spellStart"/>
+      <w:r>
+        <w:rPr>
+          <w:rFonts w:ascii="Times New Roman" w:hAnsi="Times New Roman" w:cs="Times New Roman"/>
+          <w:sz w:val="28"/>
+          <w:szCs w:val="28"/>
+        </w:rPr>
+        <w:t>diperoleh</w:t>
+      </w:r>
+      <w:proofErr w:type="spellEnd"/>
+      <w:r>
+        <w:rPr>
+          <w:rFonts w:ascii="Times New Roman" w:hAnsi="Times New Roman" w:cs="Times New Roman"/>
+          <w:sz w:val="28"/>
+          <w:szCs w:val="28"/>
+        </w:rPr>
+        <w:t xml:space="preserve"> </w:t>
+      </w:r>
+      <w:proofErr w:type="spellStart"/>
+      <w:r>
+        <w:rPr>
+          <w:rFonts w:ascii="Times New Roman" w:hAnsi="Times New Roman" w:cs="Times New Roman"/>
+          <w:sz w:val="28"/>
+          <w:szCs w:val="28"/>
+        </w:rPr>
+        <w:t>gambaran</w:t>
+      </w:r>
+      <w:proofErr w:type="spellEnd"/>
+      <w:r>
+        <w:rPr>
+          <w:rFonts w:ascii="Times New Roman" w:hAnsi="Times New Roman" w:cs="Times New Roman"/>
+          <w:sz w:val="28"/>
+          <w:szCs w:val="28"/>
+        </w:rPr>
+        <w:t xml:space="preserve"> yang </w:t>
+      </w:r>
+      <w:proofErr w:type="spellStart"/>
+      <w:r>
+        <w:rPr>
+          <w:rFonts w:ascii="Times New Roman" w:hAnsi="Times New Roman" w:cs="Times New Roman"/>
+          <w:sz w:val="28"/>
+          <w:szCs w:val="28"/>
+        </w:rPr>
+        <w:t>lebih</w:t>
+      </w:r>
+      <w:proofErr w:type="spellEnd"/>
+      <w:r>
+        <w:rPr>
+          <w:rFonts w:ascii="Times New Roman" w:hAnsi="Times New Roman" w:cs="Times New Roman"/>
+          <w:sz w:val="28"/>
+          <w:szCs w:val="28"/>
+        </w:rPr>
+        <w:t xml:space="preserve"> </w:t>
+      </w:r>
+      <w:proofErr w:type="spellStart"/>
+      <w:r>
+        <w:rPr>
+          <w:rFonts w:ascii="Times New Roman" w:hAnsi="Times New Roman" w:cs="Times New Roman"/>
+          <w:sz w:val="28"/>
+          <w:szCs w:val="28"/>
+        </w:rPr>
+        <w:t>cepat</w:t>
+      </w:r>
+      <w:proofErr w:type="spellEnd"/>
+      <w:r>
+        <w:rPr>
+          <w:rFonts w:ascii="Times New Roman" w:hAnsi="Times New Roman" w:cs="Times New Roman"/>
+          <w:sz w:val="28"/>
+          <w:szCs w:val="28"/>
+        </w:rPr>
+        <w:t xml:space="preserve">, </w:t>
+      </w:r>
+      <w:proofErr w:type="spellStart"/>
+      <w:r>
+        <w:rPr>
+          <w:rFonts w:ascii="Times New Roman" w:hAnsi="Times New Roman" w:cs="Times New Roman"/>
+          <w:sz w:val="28"/>
+          <w:szCs w:val="28"/>
+        </w:rPr>
+        <w:t>akurat</w:t>
+      </w:r>
+      <w:proofErr w:type="spellEnd"/>
+      <w:r>
+        <w:rPr>
+          <w:rFonts w:ascii="Times New Roman" w:hAnsi="Times New Roman" w:cs="Times New Roman"/>
+          <w:sz w:val="28"/>
+          <w:szCs w:val="28"/>
+        </w:rPr>
+        <w:t xml:space="preserve">, dan </w:t>
+      </w:r>
+      <w:proofErr w:type="spellStart"/>
+      <w:r>
+        <w:rPr>
+          <w:rFonts w:ascii="Times New Roman" w:hAnsi="Times New Roman" w:cs="Times New Roman"/>
+          <w:sz w:val="28"/>
+          <w:szCs w:val="28"/>
+        </w:rPr>
+        <w:t>informatif</w:t>
+      </w:r>
+      <w:proofErr w:type="spellEnd"/>
+      <w:r>
+        <w:rPr>
+          <w:rFonts w:ascii="Times New Roman" w:hAnsi="Times New Roman" w:cs="Times New Roman"/>
+          <w:sz w:val="28"/>
+          <w:szCs w:val="28"/>
+        </w:rPr>
+        <w:t xml:space="preserve"> </w:t>
+      </w:r>
+      <w:proofErr w:type="spellStart"/>
+      <w:r>
+        <w:rPr>
+          <w:rFonts w:ascii="Times New Roman" w:hAnsi="Times New Roman" w:cs="Times New Roman"/>
+          <w:sz w:val="28"/>
+          <w:szCs w:val="28"/>
+        </w:rPr>
+        <w:t>mengenai</w:t>
+      </w:r>
+      <w:proofErr w:type="spellEnd"/>
+      <w:r>
+        <w:rPr>
+          <w:rFonts w:ascii="Times New Roman" w:hAnsi="Times New Roman" w:cs="Times New Roman"/>
+          <w:sz w:val="28"/>
+          <w:szCs w:val="28"/>
+        </w:rPr>
+        <w:t xml:space="preserve"> </w:t>
+      </w:r>
+      <w:proofErr w:type="spellStart"/>
+      <w:r>
+        <w:rPr>
+          <w:rFonts w:ascii="Times New Roman" w:hAnsi="Times New Roman" w:cs="Times New Roman"/>
+          <w:sz w:val="28"/>
+          <w:szCs w:val="28"/>
+        </w:rPr>
+        <w:t>kondisi</w:t>
+      </w:r>
+      <w:proofErr w:type="spellEnd"/>
+      <w:r>
+        <w:rPr>
+          <w:rFonts w:ascii="Times New Roman" w:hAnsi="Times New Roman" w:cs="Times New Roman"/>
+          <w:sz w:val="28"/>
+          <w:szCs w:val="28"/>
+        </w:rPr>
+        <w:t xml:space="preserve"> pasar cryptocurrency </w:t>
+      </w:r>
+      <w:proofErr w:type="spellStart"/>
+      <w:r>
+        <w:rPr>
+          <w:rFonts w:ascii="Times New Roman" w:hAnsi="Times New Roman" w:cs="Times New Roman"/>
+          <w:sz w:val="28"/>
+          <w:szCs w:val="28"/>
+        </w:rPr>
+        <w:t>terkini</w:t>
+      </w:r>
+      <w:proofErr w:type="spellEnd"/>
+      <w:r>
+        <w:rPr>
+          <w:rFonts w:ascii="Times New Roman" w:hAnsi="Times New Roman" w:cs="Times New Roman"/>
+          <w:sz w:val="28"/>
+          <w:szCs w:val="28"/>
+        </w:rPr>
+        <w:t>.</w:t>
       </w:r>
     </w:p>
     <w:p>
@@ -511,9 +3035,932 @@
           <w:sz w:val="28"/>
           <w:szCs w:val="28"/>
         </w:rPr>
-        <w:lastRenderedPageBreak/>
-        <w:t xml:space="preserve"> Rumusan Masalah</w:t>
-      </w:r>
+        <w:t xml:space="preserve"> </w:t>
+      </w:r>
+      <w:proofErr w:type="spellStart"/>
+      <w:r>
+        <w:rPr>
+          <w:rFonts w:ascii="Times New Roman" w:hAnsi="Times New Roman" w:cs="Times New Roman"/>
+          <w:sz w:val="28"/>
+          <w:szCs w:val="28"/>
+        </w:rPr>
+        <w:t>Rumusan</w:t>
+      </w:r>
+      <w:proofErr w:type="spellEnd"/>
+      <w:r>
+        <w:rPr>
+          <w:rFonts w:ascii="Times New Roman" w:hAnsi="Times New Roman" w:cs="Times New Roman"/>
+          <w:sz w:val="28"/>
+          <w:szCs w:val="28"/>
+        </w:rPr>
+        <w:t xml:space="preserve"> </w:t>
+      </w:r>
+      <w:proofErr w:type="spellStart"/>
+      <w:r>
+        <w:rPr>
+          <w:rFonts w:ascii="Times New Roman" w:hAnsi="Times New Roman" w:cs="Times New Roman"/>
+          <w:sz w:val="28"/>
+          <w:szCs w:val="28"/>
+        </w:rPr>
+        <w:t>Masalah</w:t>
+      </w:r>
+      <w:proofErr w:type="spellEnd"/>
+    </w:p>
+    <w:p>
+      <w:pPr>
+        <w:pStyle w:val="ListParagraph"/>
+        <w:tabs>
+          <w:tab w:val="right" w:pos="8505"/>
+        </w:tabs>
+        <w:jc w:val="both"/>
+        <w:rPr>
+          <w:rFonts w:ascii="Times New Roman" w:hAnsi="Times New Roman" w:cs="Times New Roman"/>
+          <w:sz w:val="28"/>
+          <w:szCs w:val="28"/>
+        </w:rPr>
+      </w:pPr>
+      <w:proofErr w:type="spellStart"/>
+      <w:r>
+        <w:rPr>
+          <w:rFonts w:ascii="Times New Roman" w:hAnsi="Times New Roman" w:cs="Times New Roman"/>
+          <w:sz w:val="28"/>
+          <w:szCs w:val="28"/>
+        </w:rPr>
+        <w:t>Berdasarkan</w:t>
+      </w:r>
+      <w:proofErr w:type="spellEnd"/>
+      <w:r>
+        <w:rPr>
+          <w:rFonts w:ascii="Times New Roman" w:hAnsi="Times New Roman" w:cs="Times New Roman"/>
+          <w:sz w:val="28"/>
+          <w:szCs w:val="28"/>
+        </w:rPr>
+        <w:t xml:space="preserve"> </w:t>
+      </w:r>
+      <w:proofErr w:type="spellStart"/>
+      <w:r>
+        <w:rPr>
+          <w:rFonts w:ascii="Times New Roman" w:hAnsi="Times New Roman" w:cs="Times New Roman"/>
+          <w:sz w:val="28"/>
+          <w:szCs w:val="28"/>
+        </w:rPr>
+        <w:t>Latar</w:t>
+      </w:r>
+      <w:proofErr w:type="spellEnd"/>
+      <w:r>
+        <w:rPr>
+          <w:rFonts w:ascii="Times New Roman" w:hAnsi="Times New Roman" w:cs="Times New Roman"/>
+          <w:sz w:val="28"/>
+          <w:szCs w:val="28"/>
+        </w:rPr>
+        <w:t xml:space="preserve"> </w:t>
+      </w:r>
+      <w:proofErr w:type="spellStart"/>
+      <w:r>
+        <w:rPr>
+          <w:rFonts w:ascii="Times New Roman" w:hAnsi="Times New Roman" w:cs="Times New Roman"/>
+          <w:sz w:val="28"/>
+          <w:szCs w:val="28"/>
+        </w:rPr>
+        <w:t>Belakang</w:t>
+      </w:r>
+      <w:proofErr w:type="spellEnd"/>
+      <w:r>
+        <w:rPr>
+          <w:rFonts w:ascii="Times New Roman" w:hAnsi="Times New Roman" w:cs="Times New Roman"/>
+          <w:sz w:val="28"/>
+          <w:szCs w:val="28"/>
+        </w:rPr>
+        <w:t xml:space="preserve"> yang  </w:t>
+      </w:r>
+      <w:proofErr w:type="spellStart"/>
+      <w:r>
+        <w:rPr>
+          <w:rFonts w:ascii="Times New Roman" w:hAnsi="Times New Roman" w:cs="Times New Roman"/>
+          <w:sz w:val="28"/>
+          <w:szCs w:val="28"/>
+        </w:rPr>
+        <w:t>telah</w:t>
+      </w:r>
+      <w:proofErr w:type="spellEnd"/>
+      <w:r>
+        <w:rPr>
+          <w:rFonts w:ascii="Times New Roman" w:hAnsi="Times New Roman" w:cs="Times New Roman"/>
+          <w:sz w:val="28"/>
+          <w:szCs w:val="28"/>
+        </w:rPr>
+        <w:t xml:space="preserve"> di </w:t>
+      </w:r>
+      <w:proofErr w:type="spellStart"/>
+      <w:r>
+        <w:rPr>
+          <w:rFonts w:ascii="Times New Roman" w:hAnsi="Times New Roman" w:cs="Times New Roman"/>
+          <w:sz w:val="28"/>
+          <w:szCs w:val="28"/>
+        </w:rPr>
+        <w:t>uraikan</w:t>
+      </w:r>
+      <w:proofErr w:type="spellEnd"/>
+      <w:r>
+        <w:rPr>
+          <w:rFonts w:ascii="Times New Roman" w:hAnsi="Times New Roman" w:cs="Times New Roman"/>
+          <w:sz w:val="28"/>
+          <w:szCs w:val="28"/>
+        </w:rPr>
+        <w:t xml:space="preserve">  </w:t>
+      </w:r>
+      <w:proofErr w:type="spellStart"/>
+      <w:r>
+        <w:rPr>
+          <w:rFonts w:ascii="Times New Roman" w:hAnsi="Times New Roman" w:cs="Times New Roman"/>
+          <w:sz w:val="28"/>
+          <w:szCs w:val="28"/>
+        </w:rPr>
+        <w:t>ini</w:t>
+      </w:r>
+      <w:proofErr w:type="spellEnd"/>
+      <w:r>
+        <w:rPr>
+          <w:rFonts w:ascii="Times New Roman" w:hAnsi="Times New Roman" w:cs="Times New Roman"/>
+          <w:sz w:val="28"/>
+          <w:szCs w:val="28"/>
+        </w:rPr>
+        <w:t xml:space="preserve"> </w:t>
+      </w:r>
+      <w:proofErr w:type="spellStart"/>
+      <w:r>
+        <w:rPr>
+          <w:rFonts w:ascii="Times New Roman" w:hAnsi="Times New Roman" w:cs="Times New Roman"/>
+          <w:sz w:val="28"/>
+          <w:szCs w:val="28"/>
+        </w:rPr>
+        <w:t>adalah</w:t>
+      </w:r>
+      <w:proofErr w:type="spellEnd"/>
+      <w:r>
+        <w:rPr>
+          <w:rFonts w:ascii="Times New Roman" w:hAnsi="Times New Roman" w:cs="Times New Roman"/>
+          <w:sz w:val="28"/>
+          <w:szCs w:val="28"/>
+        </w:rPr>
+        <w:t xml:space="preserve"> </w:t>
+      </w:r>
+      <w:proofErr w:type="spellStart"/>
+      <w:r>
+        <w:rPr>
+          <w:rFonts w:ascii="Times New Roman" w:hAnsi="Times New Roman" w:cs="Times New Roman"/>
+          <w:sz w:val="28"/>
+          <w:szCs w:val="28"/>
+        </w:rPr>
+        <w:t>beberapa</w:t>
+      </w:r>
+      <w:proofErr w:type="spellEnd"/>
+      <w:r>
+        <w:rPr>
+          <w:rFonts w:ascii="Times New Roman" w:hAnsi="Times New Roman" w:cs="Times New Roman"/>
+          <w:sz w:val="28"/>
+          <w:szCs w:val="28"/>
+        </w:rPr>
+        <w:t xml:space="preserve"> </w:t>
+      </w:r>
+      <w:proofErr w:type="spellStart"/>
+      <w:r>
+        <w:rPr>
+          <w:rFonts w:ascii="Times New Roman" w:hAnsi="Times New Roman" w:cs="Times New Roman"/>
+          <w:sz w:val="28"/>
+          <w:szCs w:val="28"/>
+        </w:rPr>
+        <w:t>rumusahn</w:t>
+      </w:r>
+      <w:proofErr w:type="spellEnd"/>
+      <w:r>
+        <w:rPr>
+          <w:rFonts w:ascii="Times New Roman" w:hAnsi="Times New Roman" w:cs="Times New Roman"/>
+          <w:sz w:val="28"/>
+          <w:szCs w:val="28"/>
+        </w:rPr>
+        <w:t xml:space="preserve"> </w:t>
+      </w:r>
+      <w:proofErr w:type="spellStart"/>
+      <w:r>
+        <w:rPr>
+          <w:rFonts w:ascii="Times New Roman" w:hAnsi="Times New Roman" w:cs="Times New Roman"/>
+          <w:sz w:val="28"/>
+          <w:szCs w:val="28"/>
+        </w:rPr>
+        <w:t>masalah</w:t>
+      </w:r>
+      <w:proofErr w:type="spellEnd"/>
+      <w:r>
+        <w:rPr>
+          <w:rFonts w:ascii="Times New Roman" w:hAnsi="Times New Roman" w:cs="Times New Roman"/>
+          <w:sz w:val="28"/>
+          <w:szCs w:val="28"/>
+        </w:rPr>
+        <w:t>:</w:t>
+      </w:r>
+    </w:p>
+    <w:p>
+      <w:pPr>
+        <w:pStyle w:val="ListParagraph"/>
+        <w:tabs>
+          <w:tab w:val="right" w:pos="8505"/>
+        </w:tabs>
+        <w:jc w:val="both"/>
+        <w:rPr>
+          <w:rFonts w:ascii="Times New Roman" w:hAnsi="Times New Roman" w:cs="Times New Roman"/>
+          <w:sz w:val="28"/>
+          <w:szCs w:val="28"/>
+        </w:rPr>
+      </w:pPr>
+    </w:p>
+    <w:p>
+      <w:pPr>
+        <w:pStyle w:val="ListParagraph"/>
+        <w:numPr>
+          <w:ilvl w:val="0"/>
+          <w:numId w:val="16"/>
+        </w:numPr>
+        <w:tabs>
+          <w:tab w:val="right" w:pos="8505"/>
+        </w:tabs>
+        <w:jc w:val="both"/>
+        <w:rPr>
+          <w:rFonts w:ascii="Times New Roman" w:hAnsi="Times New Roman" w:cs="Times New Roman"/>
+          <w:sz w:val="28"/>
+          <w:szCs w:val="28"/>
+        </w:rPr>
+      </w:pPr>
+      <w:proofErr w:type="spellStart"/>
+      <w:r>
+        <w:rPr>
+          <w:rFonts w:ascii="Times New Roman" w:hAnsi="Times New Roman" w:cs="Times New Roman"/>
+          <w:sz w:val="28"/>
+          <w:szCs w:val="28"/>
+        </w:rPr>
+        <w:t>Bagaimana</w:t>
+      </w:r>
+      <w:proofErr w:type="spellEnd"/>
+      <w:r>
+        <w:rPr>
+          <w:rFonts w:ascii="Times New Roman" w:hAnsi="Times New Roman" w:cs="Times New Roman"/>
+          <w:sz w:val="28"/>
+          <w:szCs w:val="28"/>
+        </w:rPr>
+        <w:t xml:space="preserve"> </w:t>
+      </w:r>
+      <w:proofErr w:type="spellStart"/>
+      <w:r>
+        <w:rPr>
+          <w:rFonts w:ascii="Times New Roman" w:hAnsi="Times New Roman" w:cs="Times New Roman"/>
+          <w:sz w:val="28"/>
+          <w:szCs w:val="28"/>
+        </w:rPr>
+        <w:t>cara</w:t>
+      </w:r>
+      <w:proofErr w:type="spellEnd"/>
+      <w:r>
+        <w:rPr>
+          <w:rFonts w:ascii="Times New Roman" w:hAnsi="Times New Roman" w:cs="Times New Roman"/>
+          <w:sz w:val="28"/>
+          <w:szCs w:val="28"/>
+        </w:rPr>
+        <w:t xml:space="preserve"> </w:t>
+      </w:r>
+      <w:proofErr w:type="spellStart"/>
+      <w:r>
+        <w:rPr>
+          <w:rFonts w:ascii="Times New Roman" w:hAnsi="Times New Roman" w:cs="Times New Roman"/>
+          <w:sz w:val="28"/>
+          <w:szCs w:val="28"/>
+        </w:rPr>
+        <w:t>melakukan</w:t>
+      </w:r>
+      <w:proofErr w:type="spellEnd"/>
+      <w:r>
+        <w:rPr>
+          <w:rFonts w:ascii="Times New Roman" w:hAnsi="Times New Roman" w:cs="Times New Roman"/>
+          <w:sz w:val="28"/>
+          <w:szCs w:val="28"/>
+        </w:rPr>
+        <w:t xml:space="preserve"> </w:t>
+      </w:r>
+      <w:proofErr w:type="spellStart"/>
+      <w:r>
+        <w:rPr>
+          <w:rFonts w:ascii="Times New Roman" w:hAnsi="Times New Roman" w:cs="Times New Roman"/>
+          <w:sz w:val="28"/>
+          <w:szCs w:val="28"/>
+        </w:rPr>
+        <w:t>pengambilan</w:t>
+      </w:r>
+      <w:proofErr w:type="spellEnd"/>
+      <w:r>
+        <w:rPr>
+          <w:rFonts w:ascii="Times New Roman" w:hAnsi="Times New Roman" w:cs="Times New Roman"/>
+          <w:sz w:val="28"/>
+          <w:szCs w:val="28"/>
+        </w:rPr>
+        <w:t xml:space="preserve"> </w:t>
+      </w:r>
+      <w:r>
+        <w:rPr>
+          <w:rFonts w:ascii="Times New Roman" w:hAnsi="Times New Roman" w:cs="Times New Roman"/>
+          <w:sz w:val="28"/>
+          <w:szCs w:val="28"/>
+        </w:rPr>
+        <w:t xml:space="preserve"> data cryptocurrency (Top and </w:t>
+      </w:r>
+      <w:proofErr w:type="spellStart"/>
+      <w:r>
+        <w:rPr>
+          <w:rFonts w:ascii="Times New Roman" w:hAnsi="Times New Roman" w:cs="Times New Roman"/>
+          <w:sz w:val="28"/>
+          <w:szCs w:val="28"/>
+        </w:rPr>
+        <w:t>Gainners</w:t>
+      </w:r>
+      <w:proofErr w:type="spellEnd"/>
+      <w:r>
+        <w:rPr>
+          <w:rFonts w:ascii="Times New Roman" w:hAnsi="Times New Roman" w:cs="Times New Roman"/>
+          <w:sz w:val="28"/>
+          <w:szCs w:val="28"/>
+        </w:rPr>
+        <w:t xml:space="preserve">) </w:t>
+      </w:r>
+      <w:proofErr w:type="spellStart"/>
+      <w:r>
+        <w:rPr>
+          <w:rFonts w:ascii="Times New Roman" w:hAnsi="Times New Roman" w:cs="Times New Roman"/>
+          <w:sz w:val="28"/>
+          <w:szCs w:val="28"/>
+        </w:rPr>
+        <w:t>secara</w:t>
+      </w:r>
+      <w:proofErr w:type="spellEnd"/>
+      <w:r>
+        <w:rPr>
+          <w:rFonts w:ascii="Times New Roman" w:hAnsi="Times New Roman" w:cs="Times New Roman"/>
+          <w:sz w:val="28"/>
+          <w:szCs w:val="28"/>
+        </w:rPr>
+        <w:t xml:space="preserve"> </w:t>
+      </w:r>
+      <w:proofErr w:type="spellStart"/>
+      <w:r>
+        <w:rPr>
+          <w:rFonts w:ascii="Times New Roman" w:hAnsi="Times New Roman" w:cs="Times New Roman"/>
+          <w:sz w:val="28"/>
+          <w:szCs w:val="28"/>
+        </w:rPr>
+        <w:t>otomatis</w:t>
+      </w:r>
+      <w:proofErr w:type="spellEnd"/>
+      <w:r>
+        <w:rPr>
+          <w:rFonts w:ascii="Times New Roman" w:hAnsi="Times New Roman" w:cs="Times New Roman"/>
+          <w:sz w:val="28"/>
+          <w:szCs w:val="28"/>
+        </w:rPr>
+        <w:t xml:space="preserve"> </w:t>
+      </w:r>
+      <w:proofErr w:type="spellStart"/>
+      <w:r>
+        <w:rPr>
+          <w:rFonts w:ascii="Times New Roman" w:hAnsi="Times New Roman" w:cs="Times New Roman"/>
+          <w:sz w:val="28"/>
+          <w:szCs w:val="28"/>
+        </w:rPr>
+        <w:t>menggunakan</w:t>
+      </w:r>
+      <w:proofErr w:type="spellEnd"/>
+      <w:r>
+        <w:rPr>
+          <w:rFonts w:ascii="Times New Roman" w:hAnsi="Times New Roman" w:cs="Times New Roman"/>
+          <w:sz w:val="28"/>
+          <w:szCs w:val="28"/>
+        </w:rPr>
+        <w:t xml:space="preserve"> Teknik web Scrapping?</w:t>
+      </w:r>
+    </w:p>
+    <w:p>
+      <w:pPr>
+        <w:pStyle w:val="ListParagraph"/>
+        <w:numPr>
+          <w:ilvl w:val="0"/>
+          <w:numId w:val="16"/>
+        </w:numPr>
+        <w:tabs>
+          <w:tab w:val="right" w:pos="8505"/>
+        </w:tabs>
+        <w:jc w:val="both"/>
+        <w:rPr>
+          <w:rFonts w:ascii="Times New Roman" w:hAnsi="Times New Roman" w:cs="Times New Roman"/>
+          <w:sz w:val="28"/>
+          <w:szCs w:val="28"/>
+        </w:rPr>
+      </w:pPr>
+      <w:proofErr w:type="spellStart"/>
+      <w:r>
+        <w:rPr>
+          <w:rFonts w:ascii="Times New Roman" w:hAnsi="Times New Roman" w:cs="Times New Roman"/>
+          <w:sz w:val="28"/>
+          <w:szCs w:val="28"/>
+        </w:rPr>
+        <w:t>Bagaimana</w:t>
+      </w:r>
+      <w:proofErr w:type="spellEnd"/>
+      <w:r>
+        <w:rPr>
+          <w:rFonts w:ascii="Times New Roman" w:hAnsi="Times New Roman" w:cs="Times New Roman"/>
+          <w:sz w:val="28"/>
+          <w:szCs w:val="28"/>
+        </w:rPr>
+        <w:t xml:space="preserve"> proses </w:t>
+      </w:r>
+      <w:proofErr w:type="spellStart"/>
+      <w:r>
+        <w:rPr>
+          <w:rFonts w:ascii="Times New Roman" w:hAnsi="Times New Roman" w:cs="Times New Roman"/>
+          <w:sz w:val="28"/>
+          <w:szCs w:val="28"/>
+        </w:rPr>
+        <w:t>pengambilan</w:t>
+      </w:r>
+      <w:proofErr w:type="spellEnd"/>
+      <w:r>
+        <w:rPr>
+          <w:rFonts w:ascii="Times New Roman" w:hAnsi="Times New Roman" w:cs="Times New Roman"/>
+          <w:sz w:val="28"/>
+          <w:szCs w:val="28"/>
+        </w:rPr>
+        <w:t xml:space="preserve"> dan </w:t>
+      </w:r>
+      <w:proofErr w:type="spellStart"/>
+      <w:r>
+        <w:rPr>
+          <w:rFonts w:ascii="Times New Roman" w:hAnsi="Times New Roman" w:cs="Times New Roman"/>
+          <w:sz w:val="28"/>
+          <w:szCs w:val="28"/>
+        </w:rPr>
+        <w:t>pengolahan</w:t>
+      </w:r>
+      <w:proofErr w:type="spellEnd"/>
+      <w:r>
+        <w:rPr>
+          <w:rFonts w:ascii="Times New Roman" w:hAnsi="Times New Roman" w:cs="Times New Roman"/>
+          <w:sz w:val="28"/>
+          <w:szCs w:val="28"/>
+        </w:rPr>
+        <w:t xml:space="preserve"> data </w:t>
+      </w:r>
+      <w:proofErr w:type="spellStart"/>
+      <w:r>
+        <w:rPr>
+          <w:rFonts w:ascii="Times New Roman" w:hAnsi="Times New Roman" w:cs="Times New Roman"/>
+          <w:sz w:val="28"/>
+          <w:szCs w:val="28"/>
+        </w:rPr>
+        <w:t>hasil</w:t>
+      </w:r>
+      <w:proofErr w:type="spellEnd"/>
+      <w:r>
+        <w:rPr>
+          <w:rFonts w:ascii="Times New Roman" w:hAnsi="Times New Roman" w:cs="Times New Roman"/>
+          <w:sz w:val="28"/>
+          <w:szCs w:val="28"/>
+        </w:rPr>
+        <w:t xml:space="preserve"> scrapping </w:t>
+      </w:r>
+      <w:proofErr w:type="spellStart"/>
+      <w:r>
+        <w:rPr>
+          <w:rFonts w:ascii="Times New Roman" w:hAnsi="Times New Roman" w:cs="Times New Roman"/>
+          <w:sz w:val="28"/>
+          <w:szCs w:val="28"/>
+        </w:rPr>
+        <w:t>siap</w:t>
+      </w:r>
+      <w:proofErr w:type="spellEnd"/>
+      <w:r>
+        <w:rPr>
+          <w:rFonts w:ascii="Times New Roman" w:hAnsi="Times New Roman" w:cs="Times New Roman"/>
+          <w:sz w:val="28"/>
+          <w:szCs w:val="28"/>
+        </w:rPr>
+        <w:t xml:space="preserve"> di </w:t>
+      </w:r>
+      <w:proofErr w:type="spellStart"/>
+      <w:r>
+        <w:rPr>
+          <w:rFonts w:ascii="Times New Roman" w:hAnsi="Times New Roman" w:cs="Times New Roman"/>
+          <w:sz w:val="28"/>
+          <w:szCs w:val="28"/>
+        </w:rPr>
+        <w:t>analisis</w:t>
+      </w:r>
+      <w:proofErr w:type="spellEnd"/>
+      <w:r>
+        <w:rPr>
+          <w:rFonts w:ascii="Times New Roman" w:hAnsi="Times New Roman" w:cs="Times New Roman"/>
+          <w:sz w:val="28"/>
+          <w:szCs w:val="28"/>
+        </w:rPr>
+        <w:t>?</w:t>
+      </w:r>
+    </w:p>
+    <w:p>
+      <w:pPr>
+        <w:pStyle w:val="ListParagraph"/>
+        <w:numPr>
+          <w:ilvl w:val="0"/>
+          <w:numId w:val="16"/>
+        </w:numPr>
+        <w:tabs>
+          <w:tab w:val="right" w:pos="8505"/>
+        </w:tabs>
+        <w:jc w:val="both"/>
+        <w:rPr>
+          <w:rFonts w:ascii="Times New Roman" w:hAnsi="Times New Roman" w:cs="Times New Roman"/>
+          <w:sz w:val="28"/>
+          <w:szCs w:val="28"/>
+        </w:rPr>
+      </w:pPr>
+      <w:proofErr w:type="spellStart"/>
+      <w:r>
+        <w:rPr>
+          <w:rFonts w:ascii="Times New Roman" w:hAnsi="Times New Roman" w:cs="Times New Roman"/>
+          <w:sz w:val="28"/>
+          <w:szCs w:val="28"/>
+        </w:rPr>
+        <w:t>Bagaimana</w:t>
+      </w:r>
+      <w:proofErr w:type="spellEnd"/>
+      <w:r>
+        <w:rPr>
+          <w:rFonts w:ascii="Times New Roman" w:hAnsi="Times New Roman" w:cs="Times New Roman"/>
+          <w:sz w:val="28"/>
+          <w:szCs w:val="28"/>
+        </w:rPr>
+        <w:t xml:space="preserve"> </w:t>
+      </w:r>
+      <w:proofErr w:type="spellStart"/>
+      <w:r>
+        <w:rPr>
+          <w:rFonts w:ascii="Times New Roman" w:hAnsi="Times New Roman" w:cs="Times New Roman"/>
+          <w:sz w:val="28"/>
+          <w:szCs w:val="28"/>
+        </w:rPr>
+        <w:t>cara</w:t>
+      </w:r>
+      <w:proofErr w:type="spellEnd"/>
+      <w:r>
+        <w:rPr>
+          <w:rFonts w:ascii="Times New Roman" w:hAnsi="Times New Roman" w:cs="Times New Roman"/>
+          <w:sz w:val="28"/>
+          <w:szCs w:val="28"/>
+        </w:rPr>
+        <w:t xml:space="preserve"> </w:t>
+      </w:r>
+      <w:proofErr w:type="spellStart"/>
+      <w:r>
+        <w:rPr>
+          <w:rFonts w:ascii="Times New Roman" w:hAnsi="Times New Roman" w:cs="Times New Roman"/>
+          <w:sz w:val="28"/>
+          <w:szCs w:val="28"/>
+        </w:rPr>
+        <w:t>menyajikan</w:t>
+      </w:r>
+      <w:proofErr w:type="spellEnd"/>
+      <w:r>
+        <w:rPr>
+          <w:rFonts w:ascii="Times New Roman" w:hAnsi="Times New Roman" w:cs="Times New Roman"/>
+          <w:sz w:val="28"/>
+          <w:szCs w:val="28"/>
+        </w:rPr>
+        <w:t xml:space="preserve"> </w:t>
+      </w:r>
+      <w:proofErr w:type="spellStart"/>
+      <w:r>
+        <w:rPr>
+          <w:rFonts w:ascii="Times New Roman" w:hAnsi="Times New Roman" w:cs="Times New Roman"/>
+          <w:sz w:val="28"/>
+          <w:szCs w:val="28"/>
+        </w:rPr>
+        <w:t>hasil</w:t>
+      </w:r>
+      <w:proofErr w:type="spellEnd"/>
+      <w:r>
+        <w:rPr>
+          <w:rFonts w:ascii="Times New Roman" w:hAnsi="Times New Roman" w:cs="Times New Roman"/>
+          <w:sz w:val="28"/>
+          <w:szCs w:val="28"/>
+        </w:rPr>
+        <w:t xml:space="preserve"> </w:t>
+      </w:r>
+      <w:proofErr w:type="spellStart"/>
+      <w:r>
+        <w:rPr>
+          <w:rFonts w:ascii="Times New Roman" w:hAnsi="Times New Roman" w:cs="Times New Roman"/>
+          <w:sz w:val="28"/>
+          <w:szCs w:val="28"/>
+        </w:rPr>
+        <w:t>analisis</w:t>
+      </w:r>
+      <w:proofErr w:type="spellEnd"/>
+      <w:r>
+        <w:rPr>
+          <w:rFonts w:ascii="Times New Roman" w:hAnsi="Times New Roman" w:cs="Times New Roman"/>
+          <w:sz w:val="28"/>
+          <w:szCs w:val="28"/>
+        </w:rPr>
+        <w:t xml:space="preserve">  data crypto currency </w:t>
+      </w:r>
+      <w:proofErr w:type="spellStart"/>
+      <w:r>
+        <w:rPr>
+          <w:rFonts w:ascii="Times New Roman" w:hAnsi="Times New Roman" w:cs="Times New Roman"/>
+          <w:sz w:val="28"/>
+          <w:szCs w:val="28"/>
+        </w:rPr>
+        <w:t>dalam</w:t>
+      </w:r>
+      <w:proofErr w:type="spellEnd"/>
+      <w:r>
+        <w:rPr>
+          <w:rFonts w:ascii="Times New Roman" w:hAnsi="Times New Roman" w:cs="Times New Roman"/>
+          <w:sz w:val="28"/>
+          <w:szCs w:val="28"/>
+        </w:rPr>
+        <w:t xml:space="preserve"> </w:t>
+      </w:r>
+      <w:proofErr w:type="spellStart"/>
+      <w:r>
+        <w:rPr>
+          <w:rFonts w:ascii="Times New Roman" w:hAnsi="Times New Roman" w:cs="Times New Roman"/>
+          <w:sz w:val="28"/>
+          <w:szCs w:val="28"/>
+        </w:rPr>
+        <w:t>bentuk</w:t>
+      </w:r>
+      <w:proofErr w:type="spellEnd"/>
+      <w:r>
+        <w:rPr>
+          <w:rFonts w:ascii="Times New Roman" w:hAnsi="Times New Roman" w:cs="Times New Roman"/>
+          <w:sz w:val="28"/>
+          <w:szCs w:val="28"/>
+        </w:rPr>
+        <w:t xml:space="preserve"> </w:t>
+      </w:r>
+      <w:proofErr w:type="spellStart"/>
+      <w:r>
+        <w:rPr>
+          <w:rFonts w:ascii="Times New Roman" w:hAnsi="Times New Roman" w:cs="Times New Roman"/>
+          <w:sz w:val="28"/>
+          <w:szCs w:val="28"/>
+        </w:rPr>
+        <w:t>visualisasi</w:t>
+      </w:r>
+      <w:proofErr w:type="spellEnd"/>
+      <w:r>
+        <w:rPr>
+          <w:rFonts w:ascii="Times New Roman" w:hAnsi="Times New Roman" w:cs="Times New Roman"/>
+          <w:sz w:val="28"/>
+          <w:szCs w:val="28"/>
+        </w:rPr>
+        <w:t xml:space="preserve"> yang </w:t>
+      </w:r>
+      <w:proofErr w:type="spellStart"/>
+      <w:r>
+        <w:rPr>
+          <w:rFonts w:ascii="Times New Roman" w:hAnsi="Times New Roman" w:cs="Times New Roman"/>
+          <w:sz w:val="28"/>
+          <w:szCs w:val="28"/>
+        </w:rPr>
+        <w:t>informatif</w:t>
+      </w:r>
+      <w:proofErr w:type="spellEnd"/>
+      <w:r>
+        <w:rPr>
+          <w:rFonts w:ascii="Times New Roman" w:hAnsi="Times New Roman" w:cs="Times New Roman"/>
+          <w:sz w:val="28"/>
+          <w:szCs w:val="28"/>
+        </w:rPr>
+        <w:t>?</w:t>
+      </w:r>
+    </w:p>
+    <w:p>
+      <w:pPr>
+        <w:pStyle w:val="ListParagraph"/>
+        <w:numPr>
+          <w:ilvl w:val="0"/>
+          <w:numId w:val="16"/>
+        </w:numPr>
+        <w:tabs>
+          <w:tab w:val="right" w:pos="8505"/>
+        </w:tabs>
+        <w:jc w:val="both"/>
+        <w:rPr>
+          <w:rFonts w:ascii="Times New Roman" w:hAnsi="Times New Roman" w:cs="Times New Roman"/>
+          <w:sz w:val="28"/>
+          <w:szCs w:val="28"/>
+        </w:rPr>
+      </w:pPr>
+      <w:proofErr w:type="spellStart"/>
+      <w:r>
+        <w:rPr>
+          <w:rFonts w:ascii="Times New Roman" w:hAnsi="Times New Roman" w:cs="Times New Roman"/>
+          <w:sz w:val="28"/>
+          <w:szCs w:val="28"/>
+        </w:rPr>
+        <w:t>Informasi</w:t>
+      </w:r>
+      <w:proofErr w:type="spellEnd"/>
+      <w:r>
+        <w:rPr>
+          <w:rFonts w:ascii="Times New Roman" w:hAnsi="Times New Roman" w:cs="Times New Roman"/>
+          <w:sz w:val="28"/>
+          <w:szCs w:val="28"/>
+        </w:rPr>
+        <w:t xml:space="preserve"> </w:t>
+      </w:r>
+      <w:proofErr w:type="spellStart"/>
+      <w:r>
+        <w:rPr>
+          <w:rFonts w:ascii="Times New Roman" w:hAnsi="Times New Roman" w:cs="Times New Roman"/>
+          <w:sz w:val="28"/>
+          <w:szCs w:val="28"/>
+        </w:rPr>
+        <w:t>atau</w:t>
+      </w:r>
+      <w:proofErr w:type="spellEnd"/>
+      <w:r>
+        <w:rPr>
+          <w:rFonts w:ascii="Times New Roman" w:hAnsi="Times New Roman" w:cs="Times New Roman"/>
+          <w:sz w:val="28"/>
+          <w:szCs w:val="28"/>
+        </w:rPr>
+        <w:t xml:space="preserve"> insight </w:t>
+      </w:r>
+      <w:proofErr w:type="spellStart"/>
+      <w:r>
+        <w:rPr>
+          <w:rFonts w:ascii="Times New Roman" w:hAnsi="Times New Roman" w:cs="Times New Roman"/>
+          <w:sz w:val="28"/>
+          <w:szCs w:val="28"/>
+        </w:rPr>
+        <w:t>apa</w:t>
+      </w:r>
+      <w:proofErr w:type="spellEnd"/>
+      <w:r>
+        <w:rPr>
+          <w:rFonts w:ascii="Times New Roman" w:hAnsi="Times New Roman" w:cs="Times New Roman"/>
+          <w:sz w:val="28"/>
+          <w:szCs w:val="28"/>
+        </w:rPr>
+        <w:t xml:space="preserve"> </w:t>
+      </w:r>
+      <w:proofErr w:type="spellStart"/>
+      <w:r>
+        <w:rPr>
+          <w:rFonts w:ascii="Times New Roman" w:hAnsi="Times New Roman" w:cs="Times New Roman"/>
+          <w:sz w:val="28"/>
+          <w:szCs w:val="28"/>
+        </w:rPr>
+        <w:t>sjaa</w:t>
+      </w:r>
+      <w:proofErr w:type="spellEnd"/>
+      <w:r>
+        <w:rPr>
+          <w:rFonts w:ascii="Times New Roman" w:hAnsi="Times New Roman" w:cs="Times New Roman"/>
+          <w:sz w:val="28"/>
+          <w:szCs w:val="28"/>
+        </w:rPr>
+        <w:t xml:space="preserve"> yang </w:t>
+      </w:r>
+      <w:proofErr w:type="spellStart"/>
+      <w:r>
+        <w:rPr>
+          <w:rFonts w:ascii="Times New Roman" w:hAnsi="Times New Roman" w:cs="Times New Roman"/>
+          <w:sz w:val="28"/>
+          <w:szCs w:val="28"/>
+        </w:rPr>
+        <w:t>bisa</w:t>
+      </w:r>
+      <w:proofErr w:type="spellEnd"/>
+      <w:r>
+        <w:rPr>
+          <w:rFonts w:ascii="Times New Roman" w:hAnsi="Times New Roman" w:cs="Times New Roman"/>
+          <w:sz w:val="28"/>
+          <w:szCs w:val="28"/>
+        </w:rPr>
+        <w:t xml:space="preserve"> </w:t>
+      </w:r>
+      <w:proofErr w:type="spellStart"/>
+      <w:r>
+        <w:rPr>
+          <w:rFonts w:ascii="Times New Roman" w:hAnsi="Times New Roman" w:cs="Times New Roman"/>
+          <w:sz w:val="28"/>
+          <w:szCs w:val="28"/>
+        </w:rPr>
+        <w:t>diperoleh</w:t>
+      </w:r>
+      <w:proofErr w:type="spellEnd"/>
+      <w:r>
+        <w:rPr>
+          <w:rFonts w:ascii="Times New Roman" w:hAnsi="Times New Roman" w:cs="Times New Roman"/>
+          <w:sz w:val="28"/>
+          <w:szCs w:val="28"/>
+        </w:rPr>
+        <w:t xml:space="preserve"> </w:t>
+      </w:r>
+      <w:proofErr w:type="spellStart"/>
+      <w:r>
+        <w:rPr>
+          <w:rFonts w:ascii="Times New Roman" w:hAnsi="Times New Roman" w:cs="Times New Roman"/>
+          <w:sz w:val="28"/>
+          <w:szCs w:val="28"/>
+        </w:rPr>
+        <w:t>dari</w:t>
+      </w:r>
+      <w:proofErr w:type="spellEnd"/>
+      <w:r>
+        <w:rPr>
+          <w:rFonts w:ascii="Times New Roman" w:hAnsi="Times New Roman" w:cs="Times New Roman"/>
+          <w:sz w:val="28"/>
+          <w:szCs w:val="28"/>
+        </w:rPr>
+        <w:t xml:space="preserve"> data top </w:t>
+      </w:r>
+      <w:proofErr w:type="spellStart"/>
+      <w:r>
+        <w:rPr>
+          <w:rFonts w:ascii="Times New Roman" w:hAnsi="Times New Roman" w:cs="Times New Roman"/>
+          <w:sz w:val="28"/>
+          <w:szCs w:val="28"/>
+        </w:rPr>
+        <w:t>gainners</w:t>
+      </w:r>
+      <w:proofErr w:type="spellEnd"/>
+      <w:r>
+        <w:rPr>
+          <w:rFonts w:ascii="Times New Roman" w:hAnsi="Times New Roman" w:cs="Times New Roman"/>
+          <w:sz w:val="28"/>
+          <w:szCs w:val="28"/>
+        </w:rPr>
+        <w:t xml:space="preserve"> dan </w:t>
+      </w:r>
+      <w:proofErr w:type="spellStart"/>
+      <w:r>
+        <w:rPr>
+          <w:rFonts w:ascii="Times New Roman" w:hAnsi="Times New Roman" w:cs="Times New Roman"/>
+          <w:sz w:val="28"/>
+          <w:szCs w:val="28"/>
+        </w:rPr>
+        <w:t>lossers</w:t>
+      </w:r>
+      <w:proofErr w:type="spellEnd"/>
+      <w:r>
+        <w:rPr>
+          <w:rFonts w:ascii="Times New Roman" w:hAnsi="Times New Roman" w:cs="Times New Roman"/>
+          <w:sz w:val="28"/>
+          <w:szCs w:val="28"/>
+        </w:rPr>
+        <w:t xml:space="preserve"> </w:t>
+      </w:r>
+      <w:proofErr w:type="spellStart"/>
+      <w:r>
+        <w:rPr>
+          <w:rFonts w:ascii="Times New Roman" w:hAnsi="Times New Roman" w:cs="Times New Roman"/>
+          <w:sz w:val="28"/>
+          <w:szCs w:val="28"/>
+        </w:rPr>
+        <w:t>terhadap</w:t>
+      </w:r>
+      <w:proofErr w:type="spellEnd"/>
+      <w:r>
+        <w:rPr>
+          <w:rFonts w:ascii="Times New Roman" w:hAnsi="Times New Roman" w:cs="Times New Roman"/>
+          <w:sz w:val="28"/>
+          <w:szCs w:val="28"/>
+        </w:rPr>
+        <w:t xml:space="preserve"> pasar crypto? </w:t>
+      </w:r>
+    </w:p>
+    <w:p>
+      <w:pPr>
+        <w:pStyle w:val="ListParagraph"/>
+        <w:tabs>
+          <w:tab w:val="right" w:pos="8505"/>
+        </w:tabs>
+        <w:jc w:val="both"/>
+        <w:rPr>
+          <w:rFonts w:ascii="Times New Roman" w:hAnsi="Times New Roman" w:cs="Times New Roman"/>
+          <w:sz w:val="28"/>
+          <w:szCs w:val="28"/>
+        </w:rPr>
+      </w:pPr>
     </w:p>
     <w:p>
       <w:pPr>
@@ -532,6 +3979,7 @@
           <w:szCs w:val="28"/>
         </w:rPr>
       </w:pPr>
+      <w:proofErr w:type="spellStart"/>
       <w:r>
         <w:rPr>
           <w:rFonts w:ascii="Times New Roman" w:hAnsi="Times New Roman" w:cs="Times New Roman"/>
@@ -540,6 +3988,113 @@
         </w:rPr>
         <w:t>Tujuan</w:t>
       </w:r>
+      <w:proofErr w:type="spellEnd"/>
+    </w:p>
+    <w:p>
+      <w:pPr>
+        <w:pStyle w:val="ListParagraph"/>
+        <w:tabs>
+          <w:tab w:val="right" w:pos="8505"/>
+        </w:tabs>
+        <w:jc w:val="both"/>
+        <w:rPr>
+          <w:rFonts w:ascii="Times New Roman" w:hAnsi="Times New Roman" w:cs="Times New Roman"/>
+          <w:sz w:val="28"/>
+          <w:szCs w:val="28"/>
+        </w:rPr>
+      </w:pPr>
+      <w:proofErr w:type="spellStart"/>
+      <w:r>
+        <w:rPr>
+          <w:rFonts w:ascii="Times New Roman" w:hAnsi="Times New Roman" w:cs="Times New Roman"/>
+          <w:sz w:val="28"/>
+          <w:szCs w:val="28"/>
+        </w:rPr>
+        <w:t>Tujuan</w:t>
+      </w:r>
+      <w:proofErr w:type="spellEnd"/>
+      <w:r>
+        <w:rPr>
+          <w:rFonts w:ascii="Times New Roman" w:hAnsi="Times New Roman" w:cs="Times New Roman"/>
+          <w:sz w:val="28"/>
+          <w:szCs w:val="28"/>
+        </w:rPr>
+        <w:t xml:space="preserve"> </w:t>
+      </w:r>
+      <w:proofErr w:type="spellStart"/>
+      <w:r>
+        <w:rPr>
+          <w:rFonts w:ascii="Times New Roman" w:hAnsi="Times New Roman" w:cs="Times New Roman"/>
+          <w:sz w:val="28"/>
+          <w:szCs w:val="28"/>
+        </w:rPr>
+        <w:t>dari</w:t>
+      </w:r>
+      <w:proofErr w:type="spellEnd"/>
+      <w:r>
+        <w:rPr>
+          <w:rFonts w:ascii="Times New Roman" w:hAnsi="Times New Roman" w:cs="Times New Roman"/>
+          <w:sz w:val="28"/>
+          <w:szCs w:val="28"/>
+        </w:rPr>
+        <w:t xml:space="preserve"> </w:t>
+      </w:r>
+      <w:proofErr w:type="spellStart"/>
+      <w:r>
+        <w:rPr>
+          <w:rFonts w:ascii="Times New Roman" w:hAnsi="Times New Roman" w:cs="Times New Roman"/>
+          <w:sz w:val="28"/>
+          <w:szCs w:val="28"/>
+        </w:rPr>
+        <w:t>praktikum</w:t>
+      </w:r>
+      <w:proofErr w:type="spellEnd"/>
+      <w:r>
+        <w:rPr>
+          <w:rFonts w:ascii="Times New Roman" w:hAnsi="Times New Roman" w:cs="Times New Roman"/>
+          <w:sz w:val="28"/>
+          <w:szCs w:val="28"/>
+        </w:rPr>
+        <w:t xml:space="preserve"> kali </w:t>
+      </w:r>
+      <w:proofErr w:type="spellStart"/>
+      <w:r>
+        <w:rPr>
+          <w:rFonts w:ascii="Times New Roman" w:hAnsi="Times New Roman" w:cs="Times New Roman"/>
+          <w:sz w:val="28"/>
+          <w:szCs w:val="28"/>
+        </w:rPr>
+        <w:t>ini</w:t>
+      </w:r>
+      <w:proofErr w:type="spellEnd"/>
+      <w:r>
+        <w:rPr>
+          <w:rFonts w:ascii="Times New Roman" w:hAnsi="Times New Roman" w:cs="Times New Roman"/>
+          <w:sz w:val="28"/>
+          <w:szCs w:val="28"/>
+        </w:rPr>
+        <w:t xml:space="preserve"> </w:t>
+      </w:r>
+      <w:proofErr w:type="spellStart"/>
+      <w:r>
+        <w:rPr>
+          <w:rFonts w:ascii="Times New Roman" w:hAnsi="Times New Roman" w:cs="Times New Roman"/>
+          <w:sz w:val="28"/>
+          <w:szCs w:val="28"/>
+        </w:rPr>
+        <w:t>adalah</w:t>
+      </w:r>
+      <w:proofErr w:type="spellEnd"/>
+      <w:r>
+        <w:rPr>
+          <w:rFonts w:ascii="Times New Roman" w:hAnsi="Times New Roman" w:cs="Times New Roman"/>
+          <w:sz w:val="28"/>
+          <w:szCs w:val="28"/>
+        </w:rPr>
+        <w:t xml:space="preserve"> </w:t>
+      </w:r>
+      <w:bookmarkStart w:id="0" w:name="_GoBack"/>
+      <w:bookmarkEnd w:id="0"/>
     </w:p>
     <w:p>
       <w:pPr>
@@ -558,6 +4113,7 @@
           <w:szCs w:val="28"/>
         </w:rPr>
       </w:pPr>
+      <w:proofErr w:type="spellStart"/>
       <w:r>
         <w:rPr>
           <w:rFonts w:ascii="Times New Roman" w:hAnsi="Times New Roman" w:cs="Times New Roman"/>
@@ -566,6 +4122,7 @@
         </w:rPr>
         <w:t>Manfaat</w:t>
       </w:r>
+      <w:proofErr w:type="spellEnd"/>
     </w:p>
     <w:p>
       <w:pPr>
@@ -666,8 +4223,18 @@
           <w:sz w:val="28"/>
           <w:szCs w:val="28"/>
         </w:rPr>
-        <w:t xml:space="preserve"> Cryptocurency</w:t>
-      </w:r>
+        <w:t xml:space="preserve"> </w:t>
+      </w:r>
+      <w:proofErr w:type="spellStart"/>
+      <w:r>
+        <w:rPr>
+          <w:rFonts w:ascii="Times New Roman" w:hAnsi="Times New Roman" w:cs="Times New Roman"/>
+          <w:sz w:val="28"/>
+          <w:szCs w:val="28"/>
+        </w:rPr>
+        <w:t>Cryptocurency</w:t>
+      </w:r>
+      <w:proofErr w:type="spellEnd"/>
     </w:p>
     <w:p>
       <w:pPr>
@@ -747,8 +4314,18 @@
           <w:sz w:val="28"/>
           <w:szCs w:val="28"/>
         </w:rPr>
-        <w:t>Data Visualitation</w:t>
-      </w:r>
+        <w:t xml:space="preserve">Data </w:t>
+      </w:r>
+      <w:proofErr w:type="spellStart"/>
+      <w:r>
+        <w:rPr>
+          <w:rFonts w:ascii="Times New Roman" w:hAnsi="Times New Roman" w:cs="Times New Roman"/>
+          <w:sz w:val="28"/>
+          <w:szCs w:val="28"/>
+        </w:rPr>
+        <w:t>Visualitation</w:t>
+      </w:r>
+      <w:proofErr w:type="spellEnd"/>
     </w:p>
     <w:p>
       <w:pPr>
@@ -894,7 +4471,29 @@
           <w:sz w:val="28"/>
           <w:szCs w:val="28"/>
         </w:rPr>
-        <w:t>AHAPAN LANGKAH LANGKAH ANALISA DATA</w:t>
+        <w:t xml:space="preserve">AHAPAN LANGKAH </w:t>
+      </w:r>
+      <w:proofErr w:type="spellStart"/>
+      <w:r>
+        <w:rPr>
+          <w:rFonts w:ascii="Times New Roman" w:hAnsi="Times New Roman" w:cs="Times New Roman"/>
+          <w:b/>
+          <w:bCs/>
+          <w:sz w:val="28"/>
+          <w:szCs w:val="28"/>
+        </w:rPr>
+        <w:t>LANGKAH</w:t>
+      </w:r>
+      <w:proofErr w:type="spellEnd"/>
+      <w:r>
+        <w:rPr>
+          <w:rFonts w:ascii="Times New Roman" w:hAnsi="Times New Roman" w:cs="Times New Roman"/>
+          <w:b/>
+          <w:bCs/>
+          <w:sz w:val="28"/>
+          <w:szCs w:val="28"/>
+        </w:rPr>
+        <w:t xml:space="preserve"> ANALISA DATA</w:t>
       </w:r>
     </w:p>
     <w:p>
@@ -937,8 +4536,54 @@
           <w:sz w:val="28"/>
           <w:szCs w:val="28"/>
         </w:rPr>
-        <w:t xml:space="preserve"> Jenis dan Pendekatan analisis</w:t>
-      </w:r>
+        <w:t xml:space="preserve"> </w:t>
+      </w:r>
+      <w:proofErr w:type="spellStart"/>
+      <w:r>
+        <w:rPr>
+          <w:rFonts w:ascii="Times New Roman" w:hAnsi="Times New Roman" w:cs="Times New Roman"/>
+          <w:sz w:val="28"/>
+          <w:szCs w:val="28"/>
+        </w:rPr>
+        <w:t>Jenis</w:t>
+      </w:r>
+      <w:proofErr w:type="spellEnd"/>
+      <w:r>
+        <w:rPr>
+          <w:rFonts w:ascii="Times New Roman" w:hAnsi="Times New Roman" w:cs="Times New Roman"/>
+          <w:sz w:val="28"/>
+          <w:szCs w:val="28"/>
+        </w:rPr>
+        <w:t xml:space="preserve"> dan </w:t>
+      </w:r>
+      <w:proofErr w:type="spellStart"/>
+      <w:r>
+        <w:rPr>
+          <w:rFonts w:ascii="Times New Roman" w:hAnsi="Times New Roman" w:cs="Times New Roman"/>
+          <w:sz w:val="28"/>
+          <w:szCs w:val="28"/>
+        </w:rPr>
+        <w:t>Pendekatan</w:t>
+      </w:r>
+      <w:proofErr w:type="spellEnd"/>
+      <w:r>
+        <w:rPr>
+          <w:rFonts w:ascii="Times New Roman" w:hAnsi="Times New Roman" w:cs="Times New Roman"/>
+          <w:sz w:val="28"/>
+          <w:szCs w:val="28"/>
+        </w:rPr>
+        <w:t xml:space="preserve"> </w:t>
+      </w:r>
+      <w:proofErr w:type="spellStart"/>
+      <w:r>
+        <w:rPr>
+          <w:rFonts w:ascii="Times New Roman" w:hAnsi="Times New Roman" w:cs="Times New Roman"/>
+          <w:sz w:val="28"/>
+          <w:szCs w:val="28"/>
+        </w:rPr>
+        <w:t>analisis</w:t>
+      </w:r>
+      <w:proofErr w:type="spellEnd"/>
     </w:p>
     <w:p>
       <w:pPr>
@@ -964,7 +4609,43 @@
           <w:sz w:val="28"/>
           <w:szCs w:val="28"/>
         </w:rPr>
-        <w:t xml:space="preserve"> Sumber dan jenis data</w:t>
+        <w:t xml:space="preserve"> </w:t>
+      </w:r>
+      <w:proofErr w:type="spellStart"/>
+      <w:r>
+        <w:rPr>
+          <w:rFonts w:ascii="Times New Roman" w:hAnsi="Times New Roman" w:cs="Times New Roman"/>
+          <w:sz w:val="28"/>
+          <w:szCs w:val="28"/>
+        </w:rPr>
+        <w:t>Sumber</w:t>
+      </w:r>
+      <w:proofErr w:type="spellEnd"/>
+      <w:r>
+        <w:rPr>
+          <w:rFonts w:ascii="Times New Roman" w:hAnsi="Times New Roman" w:cs="Times New Roman"/>
+          <w:sz w:val="28"/>
+          <w:szCs w:val="28"/>
+        </w:rPr>
+        <w:t xml:space="preserve"> dan </w:t>
+      </w:r>
+      <w:proofErr w:type="spellStart"/>
+      <w:r>
+        <w:rPr>
+          <w:rFonts w:ascii="Times New Roman" w:hAnsi="Times New Roman" w:cs="Times New Roman"/>
+          <w:sz w:val="28"/>
+          <w:szCs w:val="28"/>
+        </w:rPr>
+        <w:t>jenis</w:t>
+      </w:r>
+      <w:proofErr w:type="spellEnd"/>
+      <w:r>
+        <w:rPr>
+          <w:rFonts w:ascii="Times New Roman" w:hAnsi="Times New Roman" w:cs="Times New Roman"/>
+          <w:sz w:val="28"/>
+          <w:szCs w:val="28"/>
+        </w:rPr>
+        <w:t xml:space="preserve"> data</w:t>
       </w:r>
     </w:p>
     <w:p>
@@ -991,10 +4672,44 @@
           <w:sz w:val="28"/>
           <w:szCs w:val="28"/>
         </w:rPr>
-        <w:t xml:space="preserve"> Tahapan analisis Data</w:t>
-      </w:r>
-      <w:bookmarkStart w:id="0" w:name="_GoBack"/>
-      <w:bookmarkEnd w:id="0"/>
+        <w:t xml:space="preserve"> </w:t>
+      </w:r>
+      <w:proofErr w:type="spellStart"/>
+      <w:r>
+        <w:rPr>
+          <w:rFonts w:ascii="Times New Roman" w:hAnsi="Times New Roman" w:cs="Times New Roman"/>
+          <w:sz w:val="28"/>
+          <w:szCs w:val="28"/>
+        </w:rPr>
+        <w:t>Tahapan</w:t>
+      </w:r>
+      <w:proofErr w:type="spellEnd"/>
+      <w:r>
+        <w:rPr>
+          <w:rFonts w:ascii="Times New Roman" w:hAnsi="Times New Roman" w:cs="Times New Roman"/>
+          <w:sz w:val="28"/>
+          <w:szCs w:val="28"/>
+        </w:rPr>
+        <w:t xml:space="preserve"> </w:t>
+      </w:r>
+      <w:proofErr w:type="spellStart"/>
+      <w:r>
+        <w:rPr>
+          <w:rFonts w:ascii="Times New Roman" w:hAnsi="Times New Roman" w:cs="Times New Roman"/>
+          <w:sz w:val="28"/>
+          <w:szCs w:val="28"/>
+        </w:rPr>
+        <w:t>analisis</w:t>
+      </w:r>
+      <w:proofErr w:type="spellEnd"/>
+      <w:r>
+        <w:rPr>
+          <w:rFonts w:ascii="Times New Roman" w:hAnsi="Times New Roman" w:cs="Times New Roman"/>
+          <w:sz w:val="28"/>
+          <w:szCs w:val="28"/>
+        </w:rPr>
+        <w:t xml:space="preserve"> Data</w:t>
+      </w:r>
     </w:p>
     <w:p>
       <w:pPr>
@@ -1061,6 +4776,7 @@
           <w:sz w:val="28"/>
           <w:szCs w:val="28"/>
         </w:rPr>
+        <w:lastRenderedPageBreak/>
         <w:t xml:space="preserve">HASIL &amp; PEMBAHASAN </w:t>
       </w:r>
     </w:p>
@@ -1597,6 +5313,92 @@
     </w:lvl>
   </w:abstractNum>
   <w:abstractNum w:abstractNumId="3" w15:restartNumberingAfterBreak="0">
+    <w:nsid w:val="1596487E"/>
+    <w:multiLevelType w:val="hybridMultilevel"/>
+    <w:tmpl w:val="800E20EC"/>
+    <w:lvl w:ilvl="0" w:tplc="3809000F">
+      <w:start w:val="1"/>
+      <w:numFmt w:val="decimal"/>
+      <w:lvlText w:val="%1."/>
+      <w:lvlJc w:val="left"/>
+      <w:pPr>
+        <w:ind w:left="1440" w:hanging="360"/>
+      </w:pPr>
+    </w:lvl>
+    <w:lvl w:ilvl="1" w:tplc="38090019" w:tentative="1">
+      <w:start w:val="1"/>
+      <w:numFmt w:val="lowerLetter"/>
+      <w:lvlText w:val="%2."/>
+      <w:lvlJc w:val="left"/>
+      <w:pPr>
+        <w:ind w:left="2160" w:hanging="360"/>
+      </w:pPr>
+    </w:lvl>
+    <w:lvl w:ilvl="2" w:tplc="3809001B" w:tentative="1">
+      <w:start w:val="1"/>
+      <w:numFmt w:val="lowerRoman"/>
+      <w:lvlText w:val="%3."/>
+      <w:lvlJc w:val="right"/>
+      <w:pPr>
+        <w:ind w:left="2880" w:hanging="180"/>
+      </w:pPr>
+    </w:lvl>
+    <w:lvl w:ilvl="3" w:tplc="3809000F" w:tentative="1">
+      <w:start w:val="1"/>
+      <w:numFmt w:val="decimal"/>
+      <w:lvlText w:val="%4."/>
+      <w:lvlJc w:val="left"/>
+      <w:pPr>
+        <w:ind w:left="3600" w:hanging="360"/>
+      </w:pPr>
+    </w:lvl>
+    <w:lvl w:ilvl="4" w:tplc="38090019" w:tentative="1">
+      <w:start w:val="1"/>
+      <w:numFmt w:val="lowerLetter"/>
+      <w:lvlText w:val="%5."/>
+      <w:lvlJc w:val="left"/>
+      <w:pPr>
+        <w:ind w:left="4320" w:hanging="360"/>
+      </w:pPr>
+    </w:lvl>
+    <w:lvl w:ilvl="5" w:tplc="3809001B" w:tentative="1">
+      <w:start w:val="1"/>
+      <w:numFmt w:val="lowerRoman"/>
+      <w:lvlText w:val="%6."/>
+      <w:lvlJc w:val="right"/>
+      <w:pPr>
+        <w:ind w:left="5040" w:hanging="180"/>
+      </w:pPr>
+    </w:lvl>
+    <w:lvl w:ilvl="6" w:tplc="3809000F" w:tentative="1">
+      <w:start w:val="1"/>
+      <w:numFmt w:val="decimal"/>
+      <w:lvlText w:val="%7."/>
+      <w:lvlJc w:val="left"/>
+      <w:pPr>
+        <w:ind w:left="5760" w:hanging="360"/>
+      </w:pPr>
+    </w:lvl>
+    <w:lvl w:ilvl="7" w:tplc="38090019" w:tentative="1">
+      <w:start w:val="1"/>
+      <w:numFmt w:val="lowerLetter"/>
+      <w:lvlText w:val="%8."/>
+      <w:lvlJc w:val="left"/>
+      <w:pPr>
+        <w:ind w:left="6480" w:hanging="360"/>
+      </w:pPr>
+    </w:lvl>
+    <w:lvl w:ilvl="8" w:tplc="3809001B" w:tentative="1">
+      <w:start w:val="1"/>
+      <w:numFmt w:val="lowerRoman"/>
+      <w:lvlText w:val="%9."/>
+      <w:lvlJc w:val="right"/>
+      <w:pPr>
+        <w:ind w:left="7200" w:hanging="180"/>
+      </w:pPr>
+    </w:lvl>
+  </w:abstractNum>
+  <w:abstractNum w:abstractNumId="4" w15:restartNumberingAfterBreak="0">
     <w:nsid w:val="1F442E14"/>
     <w:multiLevelType w:val="hybridMultilevel"/>
     <w:tmpl w:val="DE6A125A"/>
@@ -1682,7 +5484,7 @@
       </w:pPr>
     </w:lvl>
   </w:abstractNum>
-  <w:abstractNum w:abstractNumId="4" w15:restartNumberingAfterBreak="0">
+  <w:abstractNum w:abstractNumId="5" w15:restartNumberingAfterBreak="0">
     <w:nsid w:val="22460519"/>
     <w:multiLevelType w:val="hybridMultilevel"/>
     <w:tmpl w:val="6B9492A0"/>
@@ -1768,7 +5570,7 @@
       </w:pPr>
     </w:lvl>
   </w:abstractNum>
-  <w:abstractNum w:abstractNumId="5" w15:restartNumberingAfterBreak="0">
+  <w:abstractNum w:abstractNumId="6" w15:restartNumberingAfterBreak="0">
     <w:nsid w:val="2F82503A"/>
     <w:multiLevelType w:val="hybridMultilevel"/>
     <w:tmpl w:val="C388E9D2"/>
@@ -1854,7 +5656,7 @@
       </w:pPr>
     </w:lvl>
   </w:abstractNum>
-  <w:abstractNum w:abstractNumId="6" w15:restartNumberingAfterBreak="0">
+  <w:abstractNum w:abstractNumId="7" w15:restartNumberingAfterBreak="0">
     <w:nsid w:val="384B5215"/>
     <w:multiLevelType w:val="hybridMultilevel"/>
     <w:tmpl w:val="48508BAA"/>
@@ -1940,7 +5742,7 @@
       </w:pPr>
     </w:lvl>
   </w:abstractNum>
-  <w:abstractNum w:abstractNumId="7" w15:restartNumberingAfterBreak="0">
+  <w:abstractNum w:abstractNumId="8" w15:restartNumberingAfterBreak="0">
     <w:nsid w:val="3B463813"/>
     <w:multiLevelType w:val="hybridMultilevel"/>
     <w:tmpl w:val="C75C8704"/>
@@ -2026,7 +5828,7 @@
       </w:pPr>
     </w:lvl>
   </w:abstractNum>
-  <w:abstractNum w:abstractNumId="8" w15:restartNumberingAfterBreak="0">
+  <w:abstractNum w:abstractNumId="9" w15:restartNumberingAfterBreak="0">
     <w:nsid w:val="3CB3660D"/>
     <w:multiLevelType w:val="hybridMultilevel"/>
     <w:tmpl w:val="B128CA32"/>
@@ -2117,7 +5919,7 @@
       </w:pPr>
     </w:lvl>
   </w:abstractNum>
-  <w:abstractNum w:abstractNumId="9" w15:restartNumberingAfterBreak="0">
+  <w:abstractNum w:abstractNumId="10" w15:restartNumberingAfterBreak="0">
     <w:nsid w:val="4AF276C4"/>
     <w:multiLevelType w:val="hybridMultilevel"/>
     <w:tmpl w:val="324871FC"/>
@@ -2206,7 +6008,7 @@
       </w:pPr>
     </w:lvl>
   </w:abstractNum>
-  <w:abstractNum w:abstractNumId="10" w15:restartNumberingAfterBreak="0">
+  <w:abstractNum w:abstractNumId="11" w15:restartNumberingAfterBreak="0">
     <w:nsid w:val="5314732B"/>
     <w:multiLevelType w:val="hybridMultilevel"/>
     <w:tmpl w:val="F48094D4"/>
@@ -2295,7 +6097,7 @@
       </w:pPr>
     </w:lvl>
   </w:abstractNum>
-  <w:abstractNum w:abstractNumId="11" w15:restartNumberingAfterBreak="0">
+  <w:abstractNum w:abstractNumId="12" w15:restartNumberingAfterBreak="0">
     <w:nsid w:val="6731208F"/>
     <w:multiLevelType w:val="multilevel"/>
     <w:tmpl w:val="3809001F"/>
@@ -2381,7 +6183,7 @@
       </w:pPr>
     </w:lvl>
   </w:abstractNum>
-  <w:abstractNum w:abstractNumId="12" w15:restartNumberingAfterBreak="0">
+  <w:abstractNum w:abstractNumId="13" w15:restartNumberingAfterBreak="0">
     <w:nsid w:val="6C374C59"/>
     <w:multiLevelType w:val="hybridMultilevel"/>
     <w:tmpl w:val="574ED282"/>
@@ -2467,7 +6269,7 @@
       </w:pPr>
     </w:lvl>
   </w:abstractNum>
-  <w:abstractNum w:abstractNumId="13" w15:restartNumberingAfterBreak="0">
+  <w:abstractNum w:abstractNumId="14" w15:restartNumberingAfterBreak="0">
     <w:nsid w:val="74B35933"/>
     <w:multiLevelType w:val="hybridMultilevel"/>
     <w:tmpl w:val="D4AEBE16"/>
@@ -2556,7 +6358,7 @@
       </w:pPr>
     </w:lvl>
   </w:abstractNum>
-  <w:abstractNum w:abstractNumId="14" w15:restartNumberingAfterBreak="0">
+  <w:abstractNum w:abstractNumId="15" w15:restartNumberingAfterBreak="0">
     <w:nsid w:val="79382432"/>
     <w:multiLevelType w:val="hybridMultilevel"/>
     <w:tmpl w:val="2C68FE82"/>
@@ -2650,31 +6452,31 @@
     </w:lvl>
   </w:abstractNum>
   <w:num w:numId="1">
+    <w:abstractNumId w:val="7"/>
+  </w:num>
+  <w:num w:numId="2">
+    <w:abstractNumId w:val="4"/>
+  </w:num>
+  <w:num w:numId="3">
+    <w:abstractNumId w:val="5"/>
+  </w:num>
+  <w:num w:numId="4">
+    <w:abstractNumId w:val="8"/>
+  </w:num>
+  <w:num w:numId="5">
     <w:abstractNumId w:val="6"/>
   </w:num>
-  <w:num w:numId="2">
-    <w:abstractNumId w:val="3"/>
+  <w:num w:numId="6">
+    <w:abstractNumId w:val="13"/>
   </w:num>
-  <w:num w:numId="3">
-    <w:abstractNumId w:val="4"/>
+  <w:num w:numId="7">
+    <w:abstractNumId w:val="11"/>
   </w:num>
-  <w:num w:numId="4">
-    <w:abstractNumId w:val="7"/>
-  </w:num>
-  <w:num w:numId="5">
-    <w:abstractNumId w:val="5"/>
-  </w:num>
-  <w:num w:numId="6">
+  <w:num w:numId="8">
     <w:abstractNumId w:val="12"/>
   </w:num>
-  <w:num w:numId="7">
-    <w:abstractNumId w:val="10"/>
-  </w:num>
-  <w:num w:numId="8">
-    <w:abstractNumId w:val="11"/>
-  </w:num>
   <w:num w:numId="9">
-    <w:abstractNumId w:val="8"/>
+    <w:abstractNumId w:val="9"/>
   </w:num>
   <w:num w:numId="10">
     <w:abstractNumId w:val="1"/>
@@ -2683,16 +6485,19 @@
     <w:abstractNumId w:val="0"/>
   </w:num>
   <w:num w:numId="12">
+    <w:abstractNumId w:val="15"/>
+  </w:num>
+  <w:num w:numId="13">
     <w:abstractNumId w:val="14"/>
   </w:num>
-  <w:num w:numId="13">
-    <w:abstractNumId w:val="13"/>
-  </w:num>
   <w:num w:numId="14">
-    <w:abstractNumId w:val="9"/>
+    <w:abstractNumId w:val="10"/>
   </w:num>
   <w:num w:numId="15">
     <w:abstractNumId w:val="2"/>
+  </w:num>
+  <w:num w:numId="16">
+    <w:abstractNumId w:val="3"/>
   </w:num>
   <w:numIdMacAtCleanup w:val="5"/>
 </w:numbering>
@@ -3602,7 +7407,7 @@
 </file>
 
 <file path=customXml/itemProps1.xml><?xml version="1.0" encoding="utf-8"?>
-<ds:datastoreItem xmlns:ds="http://schemas.openxmlformats.org/officeDocument/2006/customXml" ds:itemID="{112E4EF4-ACC6-411D-874A-703419566268}">
+<ds:datastoreItem xmlns:ds="http://schemas.openxmlformats.org/officeDocument/2006/customXml" ds:itemID="{3BBF6EA7-FC0F-439B-909D-B2E0703F4088}">
   <ds:schemaRefs>
     <ds:schemaRef ds:uri="http://schemas.openxmlformats.org/officeDocument/2006/bibliography"/>
   </ds:schemaRefs>

</xml_diff>